<commit_message>
Add forecasting acceptance criteria
</commit_message>
<xml_diff>
--- a/Acceptance Criteria and Unit Tests - updated.docx
+++ b/Acceptance Criteria and Unit Tests - updated.docx
@@ -1265,6 +1265,51 @@
         <w:pStyle w:val="Heading3"/>
       </w:pPr>
       <w:r>
+        <w:t>Goal</w:t>
+      </w:r>
+    </w:p>
+    <w:p>
+      <w:r>
+        <w:t>The Forecasting section should let SPL review, validate, override, and audit planning forecasts. For CoCre8 MVP the critical view is location-level forecasting at SPL Master level, with actual part numbers retained only as traceable alternates under the master.</w:t>
+      </w:r>
+    </w:p>
+    <w:p>
+      <w:pPr>
+        <w:pStyle w:val="Heading3"/>
+      </w:pPr>
+      <w:r>
+        <w:t>Sub-pages</w:t>
+      </w:r>
+    </w:p>
+    <w:p>
+      <w:pPr>
+        <w:pStyle w:val="ListBullet"/>
+      </w:pPr>
+      <w:r>
+        <w:t>Forecasting Home: main forecast review table.</w:t>
+      </w:r>
+    </w:p>
+    <w:p>
+      <w:pPr>
+        <w:pStyle w:val="ListBullet"/>
+      </w:pPr>
+      <w:r>
+        <w:t>Update Manual Min-Max: manual override page for min/max quantities.</w:t>
+      </w:r>
+    </w:p>
+    <w:p>
+      <w:pPr>
+        <w:pStyle w:val="ListBullet"/>
+      </w:pPr>
+      <w:r>
+        <w:t>Audit: user action log for forecast/min-max changes.</w:t>
+      </w:r>
+    </w:p>
+    <w:p>
+      <w:pPr>
+        <w:pStyle w:val="Heading3"/>
+      </w:pPr>
+      <w:r>
         <w:t>Forecasting Home</w:t>
       </w:r>
     </w:p>
@@ -1273,7 +1318,7 @@
         <w:pStyle w:val="Heading4"/>
       </w:pPr>
       <w:r>
-        <w:t>UI</w:t>
+        <w:t>Acceptance Criteria</w:t>
       </w:r>
     </w:p>
     <w:p>
@@ -1281,7 +1326,7 @@
         <w:pStyle w:val="ListBullet"/>
       </w:pPr>
       <w:r>
-        <w:t>Horizontal scrollbar at bottom of list floats and is sticky.</w:t>
+        <w:t>The primary forecast grain is SPL Master + location group + customer stock group + forecast month. The page may show a representative Primary Part Number, but calculations must use the whole alternate group mapped to that SPL Master.</w:t>
       </w:r>
     </w:p>
     <w:p>
@@ -1289,15 +1334,1371 @@
         <w:pStyle w:val="ListBullet"/>
       </w:pPr>
       <w:r>
-        <w:t>Rows can be grouped by SPL Master</w:t>
+        <w:t>Rows for alternate parts in the same SPL Master/location/customer group should be collapsed or grouped by default. If individual part rows are shown, their relationship to the SPL Master group must be visually clear and group totals must be available.</w:t>
       </w:r>
     </w:p>
     <w:p>
       <w:pPr>
+        <w:pStyle w:val="ListBullet"/>
+      </w:pPr>
+      <w:r>
+        <w:t>For CoCre8 main stock test cases, JHB Main stock includes FUJITSU and FSCGREEN; CPT Main stock includes FUJ CT. Dedicated customer stock should not be mixed into main-stock forecast calculations unless the selected customer group says so.</w:t>
+      </w:r>
+    </w:p>
+    <w:p>
+      <w:pPr>
+        <w:pStyle w:val="ListBullet"/>
+      </w:pPr>
+      <w:r>
+        <w:t>Expected Daily Usage is calculated from all actual PartsUsage rows for the SPL Master alternate group in the selected location/customer group. It must not be calculated from only the displayed primary part if alternates were used.</w:t>
+      </w:r>
+    </w:p>
+    <w:p>
+      <w:pPr>
+        <w:pStyle w:val="ListBullet"/>
+      </w:pPr>
+      <w:r>
+        <w:t>Expected Quantity should reconcile to Expected Daily Usage multiplied by Forecast Horizon, unless the forecast engine applies a documented adjustment. Any adjustment must be visible or explainable in export/test evidence.</w:t>
+      </w:r>
+    </w:p>
+    <w:p>
+      <w:pPr>
+        <w:pStyle w:val="ListBullet"/>
+      </w:pPr>
+      <w:r>
+        <w:t>SPL Min Qty is calculated by the system and shown for the same SPL Master/location/customer group as the forecast. Manual Min Qty and Manual Max Qty are displayed separately and must not overwrite the calculated SPL Min Qty value.</w:t>
+      </w:r>
+    </w:p>
+    <w:p>
+      <w:pPr>
+        <w:pStyle w:val="ListBullet"/>
+      </w:pPr>
+      <w:r>
+        <w:t>Manual Min Qty and Manual Max Qty values changed in Update Manual Min-Max appear on this page after refresh/regeneration for the matching SPL Master/warehouse/location row.</w:t>
+      </w:r>
+    </w:p>
+    <w:p>
+      <w:pPr>
+        <w:pStyle w:val="ListBullet"/>
+      </w:pPr>
+      <w:r>
+        <w:t>Expected Higher and Expected Lower are forecast confidence or range values. The exact formula is not defined in the original spec; acceptance requires the formula to be documented and the values to satisfy Expected Lower &lt;= Expected Quantity &lt;= Expected Higher, with no negative values.</w:t>
+      </w:r>
+    </w:p>
+    <w:p>
+      <w:pPr>
+        <w:pStyle w:val="ListBullet"/>
+      </w:pPr>
+      <w:r>
+        <w:t>Seasonality %, Trend change %, Trend %, Trend Signal, Restock Days, and Demand Pattern should be derived from documented forecast logic. The original spec mentions trend and seasonality, but not formulas. If there is insufficient history, the UI should show insufficient data or stable/no trend, not arbitrary zeroes.</w:t>
+      </w:r>
+    </w:p>
+    <w:p>
+      <w:pPr>
+        <w:pStyle w:val="ListBullet"/>
+      </w:pPr>
+      <w:r>
+        <w:t>The table supports horizontal scrolling without hiding row context, sortable/filterable columns, export, regenerate forecast status, and a date range filter that clearly controls the forecast period shown.</w:t>
+      </w:r>
+    </w:p>
+    <w:p>
+      <w:pPr>
         <w:pStyle w:val="Heading4"/>
       </w:pPr>
       <w:r>
-        <w:t>Functional</w:t>
+        <w:t>Reference Test Fixtures</w:t>
+      </w:r>
+    </w:p>
+    <w:p>
+      <w:r>
+        <w:t>The following fixtures are from refreshed live-SAP PartsUsage.csv as of 2026-06-18. Simple Daily Usage is a baseline sanity check using Qty last 365d / 365. A more advanced model may differ, but differences should be explainable and should still use the same SPL Master/location grouping.</w:t>
+      </w:r>
+    </w:p>
+    <w:tbl>
+      <w:tblPr>
+        <w:tblStyle w:val="TableGrid"/>
+        <w:tblW w:type="auto" w:w="0"/>
+        <w:tblLook w:firstColumn="1" w:firstRow="1" w:lastColumn="0" w:lastRow="0" w:noHBand="0" w:noVBand="1" w:val="04A0"/>
+      </w:tblPr>
+      <w:tblGrid>
+        <w:gridCol w:w="1080"/>
+        <w:gridCol w:w="1080"/>
+        <w:gridCol w:w="1080"/>
+        <w:gridCol w:w="1080"/>
+        <w:gridCol w:w="1080"/>
+        <w:gridCol w:w="1080"/>
+        <w:gridCol w:w="1080"/>
+        <w:gridCol w:w="1080"/>
+      </w:tblGrid>
+      <w:tr>
+        <w:tc>
+          <w:tcPr>
+            <w:tcW w:type="dxa" w:w="1080"/>
+          </w:tcPr>
+          <w:p>
+            <w:r>
+              <w:t>Location group</w:t>
+            </w:r>
+          </w:p>
+        </w:tc>
+        <w:tc>
+          <w:tcPr>
+            <w:tcW w:type="dxa" w:w="1080"/>
+          </w:tcPr>
+          <w:p>
+            <w:r>
+              <w:t>SPL Master</w:t>
+            </w:r>
+          </w:p>
+        </w:tc>
+        <w:tc>
+          <w:tcPr>
+            <w:tcW w:type="dxa" w:w="1080"/>
+          </w:tcPr>
+          <w:p>
+            <w:r>
+              <w:t>Primary part</w:t>
+            </w:r>
+          </w:p>
+        </w:tc>
+        <w:tc>
+          <w:tcPr>
+            <w:tcW w:type="dxa" w:w="1080"/>
+          </w:tcPr>
+          <w:p>
+            <w:r>
+              <w:t>Description</w:t>
+            </w:r>
+          </w:p>
+        </w:tc>
+        <w:tc>
+          <w:tcPr>
+            <w:tcW w:type="dxa" w:w="1080"/>
+          </w:tcPr>
+          <w:p>
+            <w:r>
+              <w:t>Warehouses</w:t>
+            </w:r>
+          </w:p>
+        </w:tc>
+        <w:tc>
+          <w:tcPr>
+            <w:tcW w:type="dxa" w:w="1080"/>
+          </w:tcPr>
+          <w:p>
+            <w:r>
+              <w:t>Qty last 365d</w:t>
+            </w:r>
+          </w:p>
+        </w:tc>
+        <w:tc>
+          <w:tcPr>
+            <w:tcW w:type="dxa" w:w="1080"/>
+          </w:tcPr>
+          <w:p>
+            <w:r>
+              <w:t>Simple daily usage</w:t>
+            </w:r>
+          </w:p>
+        </w:tc>
+        <w:tc>
+          <w:tcPr>
+            <w:tcW w:type="dxa" w:w="1080"/>
+          </w:tcPr>
+          <w:p>
+            <w:r>
+              <w:t>Simple 30d qty</w:t>
+            </w:r>
+          </w:p>
+        </w:tc>
+      </w:tr>
+      <w:tr>
+        <w:tc>
+          <w:tcPr>
+            <w:tcW w:type="dxa" w:w="1080"/>
+          </w:tcPr>
+          <w:p>
+            <w:r>
+              <w:t>JHB Main</w:t>
+            </w:r>
+          </w:p>
+        </w:tc>
+        <w:tc>
+          <w:tcPr>
+            <w:tcW w:type="dxa" w:w="1080"/>
+          </w:tcPr>
+          <w:p>
+            <w:r>
+              <w:t>SPL8008150</w:t>
+            </w:r>
+          </w:p>
+        </w:tc>
+        <w:tc>
+          <w:tcPr>
+            <w:tcW w:type="dxa" w:w="1080"/>
+          </w:tcPr>
+          <w:p>
+            <w:r>
+              <w:t>38064009</w:t>
+            </w:r>
+          </w:p>
+        </w:tc>
+        <w:tc>
+          <w:tcPr>
+            <w:tcW w:type="dxa" w:w="1080"/>
+          </w:tcPr>
+          <w:p>
+            <w:r>
+              <w:t>64GB (1X64GB) 2RX4 DDR4-3200 R ECC</w:t>
+            </w:r>
+          </w:p>
+        </w:tc>
+        <w:tc>
+          <w:tcPr>
+            <w:tcW w:type="dxa" w:w="1080"/>
+          </w:tcPr>
+          <w:p>
+            <w:r>
+              <w:t>FUJITSU</w:t>
+            </w:r>
+          </w:p>
+        </w:tc>
+        <w:tc>
+          <w:tcPr>
+            <w:tcW w:type="dxa" w:w="1080"/>
+          </w:tcPr>
+          <w:p>
+            <w:r>
+              <w:t>18</w:t>
+            </w:r>
+          </w:p>
+        </w:tc>
+        <w:tc>
+          <w:tcPr>
+            <w:tcW w:type="dxa" w:w="1080"/>
+          </w:tcPr>
+          <w:p>
+            <w:r>
+              <w:t>0.0493</w:t>
+            </w:r>
+          </w:p>
+        </w:tc>
+        <w:tc>
+          <w:tcPr>
+            <w:tcW w:type="dxa" w:w="1080"/>
+          </w:tcPr>
+          <w:p>
+            <w:r>
+              <w:t>1.48</w:t>
+            </w:r>
+          </w:p>
+        </w:tc>
+      </w:tr>
+      <w:tr>
+        <w:tc>
+          <w:tcPr>
+            <w:tcW w:type="dxa" w:w="1080"/>
+          </w:tcPr>
+          <w:p>
+            <w:r>
+              <w:t>CPT Main</w:t>
+            </w:r>
+          </w:p>
+        </w:tc>
+        <w:tc>
+          <w:tcPr>
+            <w:tcW w:type="dxa" w:w="1080"/>
+          </w:tcPr>
+          <w:p>
+            <w:r>
+              <w:t>SPL8005179</w:t>
+            </w:r>
+          </w:p>
+        </w:tc>
+        <w:tc>
+          <w:tcPr>
+            <w:tcW w:type="dxa" w:w="1080"/>
+          </w:tcPr>
+          <w:p>
+            <w:r>
+              <w:t>38066705</w:t>
+            </w:r>
+          </w:p>
+        </w:tc>
+        <w:tc>
+          <w:tcPr>
+            <w:tcW w:type="dxa" w:w="1080"/>
+          </w:tcPr>
+          <w:p>
+            <w:r>
+              <w:t>HD BC-SATA 6G 2TB 7K2 512N HOT</w:t>
+            </w:r>
+          </w:p>
+        </w:tc>
+        <w:tc>
+          <w:tcPr>
+            <w:tcW w:type="dxa" w:w="1080"/>
+          </w:tcPr>
+          <w:p>
+            <w:r>
+              <w:t>FUJ CT</w:t>
+            </w:r>
+          </w:p>
+        </w:tc>
+        <w:tc>
+          <w:tcPr>
+            <w:tcW w:type="dxa" w:w="1080"/>
+          </w:tcPr>
+          <w:p>
+            <w:r>
+              <w:t>10</w:t>
+            </w:r>
+          </w:p>
+        </w:tc>
+        <w:tc>
+          <w:tcPr>
+            <w:tcW w:type="dxa" w:w="1080"/>
+          </w:tcPr>
+          <w:p>
+            <w:r>
+              <w:t>0.0274</w:t>
+            </w:r>
+          </w:p>
+        </w:tc>
+        <w:tc>
+          <w:tcPr>
+            <w:tcW w:type="dxa" w:w="1080"/>
+          </w:tcPr>
+          <w:p>
+            <w:r>
+              <w:t>0.82</w:t>
+            </w:r>
+          </w:p>
+        </w:tc>
+      </w:tr>
+      <w:tr>
+        <w:tc>
+          <w:tcPr>
+            <w:tcW w:type="dxa" w:w="1080"/>
+          </w:tcPr>
+          <w:p>
+            <w:r>
+              <w:t>JHB Main</w:t>
+            </w:r>
+          </w:p>
+        </w:tc>
+        <w:tc>
+          <w:tcPr>
+            <w:tcW w:type="dxa" w:w="1080"/>
+          </w:tcPr>
+          <w:p>
+            <w:r>
+              <w:t>SPL8007873</w:t>
+            </w:r>
+          </w:p>
+        </w:tc>
+        <w:tc>
+          <w:tcPr>
+            <w:tcW w:type="dxa" w:w="1080"/>
+          </w:tcPr>
+          <w:p>
+            <w:r>
+              <w:t>38062538</w:t>
+            </w:r>
+          </w:p>
+        </w:tc>
+        <w:tc>
+          <w:tcPr>
+            <w:tcW w:type="dxa" w:w="1080"/>
+          </w:tcPr>
+          <w:p>
+            <w:r>
+              <w:t>DX/AF ENTRY S5 SPARE BBU</w:t>
+            </w:r>
+          </w:p>
+        </w:tc>
+        <w:tc>
+          <w:tcPr>
+            <w:tcW w:type="dxa" w:w="1080"/>
+          </w:tcPr>
+          <w:p>
+            <w:r>
+              <w:t>FUJITSU</w:t>
+            </w:r>
+          </w:p>
+        </w:tc>
+        <w:tc>
+          <w:tcPr>
+            <w:tcW w:type="dxa" w:w="1080"/>
+          </w:tcPr>
+          <w:p>
+            <w:r>
+              <w:t>10</w:t>
+            </w:r>
+          </w:p>
+        </w:tc>
+        <w:tc>
+          <w:tcPr>
+            <w:tcW w:type="dxa" w:w="1080"/>
+          </w:tcPr>
+          <w:p>
+            <w:r>
+              <w:t>0.0274</w:t>
+            </w:r>
+          </w:p>
+        </w:tc>
+        <w:tc>
+          <w:tcPr>
+            <w:tcW w:type="dxa" w:w="1080"/>
+          </w:tcPr>
+          <w:p>
+            <w:r>
+              <w:t>0.82</w:t>
+            </w:r>
+          </w:p>
+        </w:tc>
+      </w:tr>
+      <w:tr>
+        <w:tc>
+          <w:tcPr>
+            <w:tcW w:type="dxa" w:w="1080"/>
+          </w:tcPr>
+          <w:p>
+            <w:r>
+              <w:t>JHB Main</w:t>
+            </w:r>
+          </w:p>
+        </w:tc>
+        <w:tc>
+          <w:tcPr>
+            <w:tcW w:type="dxa" w:w="1080"/>
+          </w:tcPr>
+          <w:p>
+            <w:r>
+              <w:t>SPL8006743</w:t>
+            </w:r>
+          </w:p>
+        </w:tc>
+        <w:tc>
+          <w:tcPr>
+            <w:tcW w:type="dxa" w:w="1080"/>
+          </w:tcPr>
+          <w:p>
+            <w:r>
+              <w:t>38059445</w:t>
+            </w:r>
+          </w:p>
+        </w:tc>
+        <w:tc>
+          <w:tcPr>
+            <w:tcW w:type="dxa" w:w="1080"/>
+          </w:tcPr>
+          <w:p>
+            <w:r>
+              <w:t>32GB 2RX4 DDR4 R</w:t>
+            </w:r>
+          </w:p>
+        </w:tc>
+        <w:tc>
+          <w:tcPr>
+            <w:tcW w:type="dxa" w:w="1080"/>
+          </w:tcPr>
+          <w:p>
+            <w:r>
+              <w:t>FUJITSU</w:t>
+            </w:r>
+          </w:p>
+        </w:tc>
+        <w:tc>
+          <w:tcPr>
+            <w:tcW w:type="dxa" w:w="1080"/>
+          </w:tcPr>
+          <w:p>
+            <w:r>
+              <w:t>8</w:t>
+            </w:r>
+          </w:p>
+        </w:tc>
+        <w:tc>
+          <w:tcPr>
+            <w:tcW w:type="dxa" w:w="1080"/>
+          </w:tcPr>
+          <w:p>
+            <w:r>
+              <w:t>0.0219</w:t>
+            </w:r>
+          </w:p>
+        </w:tc>
+        <w:tc>
+          <w:tcPr>
+            <w:tcW w:type="dxa" w:w="1080"/>
+          </w:tcPr>
+          <w:p>
+            <w:r>
+              <w:t>0.66</w:t>
+            </w:r>
+          </w:p>
+        </w:tc>
+      </w:tr>
+      <w:tr>
+        <w:tc>
+          <w:tcPr>
+            <w:tcW w:type="dxa" w:w="1080"/>
+          </w:tcPr>
+          <w:p>
+            <w:r>
+              <w:t>JHB Main</w:t>
+            </w:r>
+          </w:p>
+        </w:tc>
+        <w:tc>
+          <w:tcPr>
+            <w:tcW w:type="dxa" w:w="1080"/>
+          </w:tcPr>
+          <w:p>
+            <w:r>
+              <w:t>SPL8000095</w:t>
+            </w:r>
+          </w:p>
+        </w:tc>
+        <w:tc>
+          <w:tcPr>
+            <w:tcW w:type="dxa" w:w="1080"/>
+          </w:tcPr>
+          <w:p>
+            <w:r>
+              <w:t>34035576</w:t>
+            </w:r>
+          </w:p>
+        </w:tc>
+        <w:tc>
+          <w:tcPr>
+            <w:tcW w:type="dxa" w:w="1080"/>
+          </w:tcPr>
+          <w:p>
+            <w:r>
+              <w:t>THERMALGREASE TC5026 W INJECTION</w:t>
+            </w:r>
+          </w:p>
+        </w:tc>
+        <w:tc>
+          <w:tcPr>
+            <w:tcW w:type="dxa" w:w="1080"/>
+          </w:tcPr>
+          <w:p>
+            <w:r>
+              <w:t>FUJITSU</w:t>
+            </w:r>
+          </w:p>
+        </w:tc>
+        <w:tc>
+          <w:tcPr>
+            <w:tcW w:type="dxa" w:w="1080"/>
+          </w:tcPr>
+          <w:p>
+            <w:r>
+              <w:t>6</w:t>
+            </w:r>
+          </w:p>
+        </w:tc>
+        <w:tc>
+          <w:tcPr>
+            <w:tcW w:type="dxa" w:w="1080"/>
+          </w:tcPr>
+          <w:p>
+            <w:r>
+              <w:t>0.0164</w:t>
+            </w:r>
+          </w:p>
+        </w:tc>
+        <w:tc>
+          <w:tcPr>
+            <w:tcW w:type="dxa" w:w="1080"/>
+          </w:tcPr>
+          <w:p>
+            <w:r>
+              <w:t>0.49</w:t>
+            </w:r>
+          </w:p>
+        </w:tc>
+      </w:tr>
+      <w:tr>
+        <w:tc>
+          <w:tcPr>
+            <w:tcW w:type="dxa" w:w="1080"/>
+          </w:tcPr>
+          <w:p>
+            <w:r>
+              <w:t>JHB Main</w:t>
+            </w:r>
+          </w:p>
+        </w:tc>
+        <w:tc>
+          <w:tcPr>
+            <w:tcW w:type="dxa" w:w="1080"/>
+          </w:tcPr>
+          <w:p>
+            <w:r>
+              <w:t>SPL8005748</w:t>
+            </w:r>
+          </w:p>
+        </w:tc>
+        <w:tc>
+          <w:tcPr>
+            <w:tcW w:type="dxa" w:w="1080"/>
+          </w:tcPr>
+          <w:p>
+            <w:r>
+              <w:t>38062982</w:t>
+            </w:r>
+          </w:p>
+        </w:tc>
+        <w:tc>
+          <w:tcPr>
+            <w:tcW w:type="dxa" w:w="1080"/>
+          </w:tcPr>
+          <w:p>
+            <w:r>
+              <w:t>HD SAS 12G 1.8TB 10K 512E HOT PL 25'' EP</w:t>
+            </w:r>
+          </w:p>
+        </w:tc>
+        <w:tc>
+          <w:tcPr>
+            <w:tcW w:type="dxa" w:w="1080"/>
+          </w:tcPr>
+          <w:p>
+            <w:r>
+              <w:t>FUJITSU</w:t>
+            </w:r>
+          </w:p>
+        </w:tc>
+        <w:tc>
+          <w:tcPr>
+            <w:tcW w:type="dxa" w:w="1080"/>
+          </w:tcPr>
+          <w:p>
+            <w:r>
+              <w:t>6</w:t>
+            </w:r>
+          </w:p>
+        </w:tc>
+        <w:tc>
+          <w:tcPr>
+            <w:tcW w:type="dxa" w:w="1080"/>
+          </w:tcPr>
+          <w:p>
+            <w:r>
+              <w:t>0.0164</w:t>
+            </w:r>
+          </w:p>
+        </w:tc>
+        <w:tc>
+          <w:tcPr>
+            <w:tcW w:type="dxa" w:w="1080"/>
+          </w:tcPr>
+          <w:p>
+            <w:r>
+              <w:t>0.49</w:t>
+            </w:r>
+          </w:p>
+        </w:tc>
+      </w:tr>
+      <w:tr>
+        <w:tc>
+          <w:tcPr>
+            <w:tcW w:type="dxa" w:w="1080"/>
+          </w:tcPr>
+          <w:p>
+            <w:r>
+              <w:t>JHB Main</w:t>
+            </w:r>
+          </w:p>
+        </w:tc>
+        <w:tc>
+          <w:tcPr>
+            <w:tcW w:type="dxa" w:w="1080"/>
+          </w:tcPr>
+          <w:p>
+            <w:r>
+              <w:t>SPL8001884</w:t>
+            </w:r>
+          </w:p>
+        </w:tc>
+        <w:tc>
+          <w:tcPr>
+            <w:tcW w:type="dxa" w:w="1080"/>
+          </w:tcPr>
+          <w:p>
+            <w:r>
+              <w:t>38049498</w:t>
+            </w:r>
+          </w:p>
+        </w:tc>
+        <w:tc>
+          <w:tcPr>
+            <w:tcW w:type="dxa" w:w="1080"/>
+          </w:tcPr>
+          <w:p>
+            <w:r>
+              <w:t>DX S4 HD DRIVE 2.5' 1.8TB 10K</w:t>
+            </w:r>
+          </w:p>
+        </w:tc>
+        <w:tc>
+          <w:tcPr>
+            <w:tcW w:type="dxa" w:w="1080"/>
+          </w:tcPr>
+          <w:p>
+            <w:r>
+              <w:t>FUJITSU</w:t>
+            </w:r>
+          </w:p>
+        </w:tc>
+        <w:tc>
+          <w:tcPr>
+            <w:tcW w:type="dxa" w:w="1080"/>
+          </w:tcPr>
+          <w:p>
+            <w:r>
+              <w:t>5</w:t>
+            </w:r>
+          </w:p>
+        </w:tc>
+        <w:tc>
+          <w:tcPr>
+            <w:tcW w:type="dxa" w:w="1080"/>
+          </w:tcPr>
+          <w:p>
+            <w:r>
+              <w:t>0.0137</w:t>
+            </w:r>
+          </w:p>
+        </w:tc>
+        <w:tc>
+          <w:tcPr>
+            <w:tcW w:type="dxa" w:w="1080"/>
+          </w:tcPr>
+          <w:p>
+            <w:r>
+              <w:t>0.41</w:t>
+            </w:r>
+          </w:p>
+        </w:tc>
+      </w:tr>
+      <w:tr>
+        <w:tc>
+          <w:tcPr>
+            <w:tcW w:type="dxa" w:w="1080"/>
+          </w:tcPr>
+          <w:p>
+            <w:r>
+              <w:t>JHB Main</w:t>
+            </w:r>
+          </w:p>
+        </w:tc>
+        <w:tc>
+          <w:tcPr>
+            <w:tcW w:type="dxa" w:w="1080"/>
+          </w:tcPr>
+          <w:p>
+            <w:r>
+              <w:t>SPL8008632</w:t>
+            </w:r>
+          </w:p>
+        </w:tc>
+        <w:tc>
+          <w:tcPr>
+            <w:tcW w:type="dxa" w:w="1080"/>
+          </w:tcPr>
+          <w:p>
+            <w:r>
+              <w:t>38064845</w:t>
+            </w:r>
+          </w:p>
+        </w:tc>
+        <w:tc>
+          <w:tcPr>
+            <w:tcW w:type="dxa" w:w="1080"/>
+          </w:tcPr>
+          <w:p>
+            <w:r>
+              <w:t>900W TITANIUM PSU</w:t>
+            </w:r>
+          </w:p>
+        </w:tc>
+        <w:tc>
+          <w:tcPr>
+            <w:tcW w:type="dxa" w:w="1080"/>
+          </w:tcPr>
+          <w:p>
+            <w:r>
+              <w:t>FUJITSU</w:t>
+            </w:r>
+          </w:p>
+        </w:tc>
+        <w:tc>
+          <w:tcPr>
+            <w:tcW w:type="dxa" w:w="1080"/>
+          </w:tcPr>
+          <w:p>
+            <w:r>
+              <w:t>5</w:t>
+            </w:r>
+          </w:p>
+        </w:tc>
+        <w:tc>
+          <w:tcPr>
+            <w:tcW w:type="dxa" w:w="1080"/>
+          </w:tcPr>
+          <w:p>
+            <w:r>
+              <w:t>0.0137</w:t>
+            </w:r>
+          </w:p>
+        </w:tc>
+        <w:tc>
+          <w:tcPr>
+            <w:tcW w:type="dxa" w:w="1080"/>
+          </w:tcPr>
+          <w:p>
+            <w:r>
+              <w:t>0.41</w:t>
+            </w:r>
+          </w:p>
+        </w:tc>
+      </w:tr>
+      <w:tr>
+        <w:tc>
+          <w:tcPr>
+            <w:tcW w:type="dxa" w:w="1080"/>
+          </w:tcPr>
+          <w:p>
+            <w:r>
+              <w:t>JHB Main</w:t>
+            </w:r>
+          </w:p>
+        </w:tc>
+        <w:tc>
+          <w:tcPr>
+            <w:tcW w:type="dxa" w:w="1080"/>
+          </w:tcPr>
+          <w:p>
+            <w:r>
+              <w:t>SPL8000639</w:t>
+            </w:r>
+          </w:p>
+        </w:tc>
+        <w:tc>
+          <w:tcPr>
+            <w:tcW w:type="dxa" w:w="1080"/>
+          </w:tcPr>
+          <w:p>
+            <w:r>
+              <w:t>38063390</w:t>
+            </w:r>
+          </w:p>
+        </w:tc>
+        <w:tc>
+          <w:tcPr>
+            <w:tcW w:type="dxa" w:w="1080"/>
+          </w:tcPr>
+          <w:p>
+            <w:r>
+              <w:t>BT-BBU DX60/100/200 S4</w:t>
+            </w:r>
+          </w:p>
+        </w:tc>
+        <w:tc>
+          <w:tcPr>
+            <w:tcW w:type="dxa" w:w="1080"/>
+          </w:tcPr>
+          <w:p>
+            <w:r>
+              <w:t>FUJITSU</w:t>
+            </w:r>
+          </w:p>
+        </w:tc>
+        <w:tc>
+          <w:tcPr>
+            <w:tcW w:type="dxa" w:w="1080"/>
+          </w:tcPr>
+          <w:p>
+            <w:r>
+              <w:t>4</w:t>
+            </w:r>
+          </w:p>
+        </w:tc>
+        <w:tc>
+          <w:tcPr>
+            <w:tcW w:type="dxa" w:w="1080"/>
+          </w:tcPr>
+          <w:p>
+            <w:r>
+              <w:t>0.0110</w:t>
+            </w:r>
+          </w:p>
+        </w:tc>
+        <w:tc>
+          <w:tcPr>
+            <w:tcW w:type="dxa" w:w="1080"/>
+          </w:tcPr>
+          <w:p>
+            <w:r>
+              <w:t>0.33</w:t>
+            </w:r>
+          </w:p>
+        </w:tc>
+      </w:tr>
+      <w:tr>
+        <w:tc>
+          <w:tcPr>
+            <w:tcW w:type="dxa" w:w="1080"/>
+          </w:tcPr>
+          <w:p>
+            <w:r>
+              <w:t>JHB Main</w:t>
+            </w:r>
+          </w:p>
+        </w:tc>
+        <w:tc>
+          <w:tcPr>
+            <w:tcW w:type="dxa" w:w="1080"/>
+          </w:tcPr>
+          <w:p>
+            <w:r>
+              <w:t>SPL8006454</w:t>
+            </w:r>
+          </w:p>
+        </w:tc>
+        <w:tc>
+          <w:tcPr>
+            <w:tcW w:type="dxa" w:w="1080"/>
+          </w:tcPr>
+          <w:p>
+            <w:r>
+              <w:t>38063962</w:t>
+            </w:r>
+          </w:p>
+        </w:tc>
+        <w:tc>
+          <w:tcPr>
+            <w:tcW w:type="dxa" w:w="1080"/>
+          </w:tcPr>
+          <w:p>
+            <w:r>
+              <w:t>D:XBR-000412</w:t>
+            </w:r>
+          </w:p>
+        </w:tc>
+        <w:tc>
+          <w:tcPr>
+            <w:tcW w:type="dxa" w:w="1080"/>
+          </w:tcPr>
+          <w:p>
+            <w:r>
+              <w:t>FUJITSU</w:t>
+            </w:r>
+          </w:p>
+        </w:tc>
+        <w:tc>
+          <w:tcPr>
+            <w:tcW w:type="dxa" w:w="1080"/>
+          </w:tcPr>
+          <w:p>
+            <w:r>
+              <w:t>4</w:t>
+            </w:r>
+          </w:p>
+        </w:tc>
+        <w:tc>
+          <w:tcPr>
+            <w:tcW w:type="dxa" w:w="1080"/>
+          </w:tcPr>
+          <w:p>
+            <w:r>
+              <w:t>0.0110</w:t>
+            </w:r>
+          </w:p>
+        </w:tc>
+        <w:tc>
+          <w:tcPr>
+            <w:tcW w:type="dxa" w:w="1080"/>
+          </w:tcPr>
+          <w:p>
+            <w:r>
+              <w:t>0.33</w:t>
+            </w:r>
+          </w:p>
+        </w:tc>
+      </w:tr>
+    </w:tbl>
+    <w:p>
+      <w:pPr>
+        <w:pStyle w:val="Heading4"/>
+      </w:pPr>
+      <w:r>
+        <w:t>Test Cases</w:t>
+      </w:r>
+    </w:p>
+    <w:p>
+      <w:pPr>
+        <w:pStyle w:val="ListNumber"/>
+      </w:pPr>
+      <w:r>
+        <w:t>SPL Master grouping: filter Forecasting Home to SPL8000639 / JHB Main. Assert the row represents the SPL Master group, not only primary part 38063390, and includes usage for all alternate parts mapped to SPL8000639 in FUJITSU/FSCGREEN.</w:t>
+      </w:r>
+    </w:p>
+    <w:p>
+      <w:pPr>
+        <w:pStyle w:val="ListNumber"/>
+      </w:pPr>
+      <w:r>
+        <w:t>Location grouping: compare SPL8005179 in CPT Main against PartsUsage rows for FUJ CT only. Assert JHB/FUJITSU usage does not contribute to the CPT forecast.</w:t>
+      </w:r>
+    </w:p>
+    <w:p>
+      <w:pPr>
+        <w:pStyle w:val="ListNumber"/>
+      </w:pPr>
+      <w:r>
+        <w:t>Main-stock separation: for a part with usage in customer/dedicated stock and main stock, assert the Main customer group forecast excludes dedicated customer warehouse usage unless that customer group is selected.</w:t>
+      </w:r>
+    </w:p>
+    <w:p>
+      <w:pPr>
+        <w:pStyle w:val="ListNumber"/>
+      </w:pPr>
+      <w:r>
+        <w:t>Expected Daily Usage baseline: for each fixture above, calculate Qty last 365d / 365 and compare to the system value. If the system value differs, the export or UI must explain the model adjustment causing the difference.</w:t>
+      </w:r>
+    </w:p>
+    <w:p>
+      <w:pPr>
+        <w:pStyle w:val="ListNumber"/>
+      </w:pPr>
+      <w:r>
+        <w:t>Expected Quantity consistency: for each fixture, assert Expected Quantity is approximately Expected Daily Usage x Forecast Horizon unless a documented forecast adjustment is applied.</w:t>
+      </w:r>
+    </w:p>
+    <w:p>
+      <w:pPr>
+        <w:pStyle w:val="ListNumber"/>
+      </w:pPr>
+      <w:r>
+        <w:t>SPL Min Qty sanity: for the ten fixture rows, assert SPL Min Qty is non-negative, calculated at SPL Master/location/customer-group level, and is not blank for active main-stock products with recent usage.</w:t>
+      </w:r>
+    </w:p>
+    <w:p>
+      <w:pPr>
+        <w:pStyle w:val="ListNumber"/>
+      </w:pPr>
+      <w:r>
+        <w:t>Manual override display: set Manual Min Qty for SPL8000095 / FUJITSU to 1 on the Manual Min-Max page, regenerate or refresh Forecasting Home, and assert Manual Min Qty = 1 on the matching forecast row while SPL Min Qty remains separately visible.</w:t>
+      </w:r>
+    </w:p>
+    <w:p>
+      <w:pPr>
+        <w:pStyle w:val="ListNumber"/>
+      </w:pPr>
+      <w:r>
+        <w:t>Forecast range sanity: for rows with Expected Quantity &gt; 0, assert Expected Higher &gt;= Expected Quantity and Expected Lower &lt;= Expected Quantity. Assert no negative Expected Lower values.</w:t>
+      </w:r>
+    </w:p>
+    <w:p>
+      <w:pPr>
+        <w:pStyle w:val="ListNumber"/>
+      </w:pPr>
+      <w:r>
+        <w:t>Trend/seasonality sanity: for SPL Masters with at least 24 months of usage history, assert trend and seasonality fields are either populated from documented logic or explicitly marked as insufficient/not applied. They should not all default to 0% without explanation.</w:t>
+      </w:r>
+    </w:p>
+    <w:p>
+      <w:pPr>
+        <w:pStyle w:val="ListNumber"/>
+      </w:pPr>
+      <w:r>
+        <w:t>Export parity: export the Forecasting Home table and assert visible filtered rows, SPL Master codes, forecast month, expected usage, manual min/max, and trend/range fields match the UI values.</w:t>
+      </w:r>
+    </w:p>
+    <w:p>
+      <w:pPr>
+        <w:pStyle w:val="Heading4"/>
+      </w:pPr>
+      <w:r>
+        <w:t>Open Formula Questions / Not Yet Proven</w:t>
+      </w:r>
+    </w:p>
+    <w:p>
+      <w:pPr>
+        <w:pStyle w:val="ListBullet"/>
+      </w:pPr>
+      <w:r>
+        <w:t>Exact formula for SPL Min Qty.</w:t>
+      </w:r>
+    </w:p>
+    <w:p>
+      <w:pPr>
+        <w:pStyle w:val="ListBullet"/>
+      </w:pPr>
+      <w:r>
+        <w:t>Exact formula for Expected Higher and Expected Lower.</w:t>
+      </w:r>
+    </w:p>
+    <w:p>
+      <w:pPr>
+        <w:pStyle w:val="ListBullet"/>
+      </w:pPr>
+      <w:r>
+        <w:t>Exact formula and minimum-history threshold for Seasonality %.</w:t>
+      </w:r>
+    </w:p>
+    <w:p>
+      <w:pPr>
+        <w:pStyle w:val="ListBullet"/>
+      </w:pPr>
+      <w:r>
+        <w:t>Exact formula and minimum-history threshold for Trend change %, Trend %, and Trend Signal.</w:t>
+      </w:r>
+    </w:p>
+    <w:p>
+      <w:pPr>
+        <w:pStyle w:val="ListBullet"/>
+      </w:pPr>
+      <w:r>
+        <w:t>Whether Forecast Horizon = 0 is valid. If it is valid, the UI should explain why Expected Quantity can still be 0 for a row with recent usage.</w:t>
+      </w:r>
+    </w:p>
+    <w:p>
+      <w:pPr>
+        <w:pStyle w:val="Heading3"/>
+      </w:pPr>
+      <w:r>
+        <w:t>Update Manual Min-Max</w:t>
+      </w:r>
+    </w:p>
+    <w:p>
+      <w:pPr>
+        <w:pStyle w:val="Heading4"/>
+      </w:pPr>
+      <w:r>
+        <w:t>Acceptance Criteria</w:t>
+      </w:r>
+    </w:p>
+    <w:p>
+      <w:pPr>
+        <w:pStyle w:val="ListBullet"/>
+      </w:pPr>
+      <w:r>
+        <w:t>The page lists forecastable SPL Master/location rows with SPL Master Code, Primary Part Number, Warehouse Code, Location, Type, Manual Min, Manual Max, and Changed By.</w:t>
+      </w:r>
+    </w:p>
+    <w:p>
+      <w:pPr>
+        <w:pStyle w:val="ListBullet"/>
+      </w:pPr>
+      <w:r>
+        <w:t>Manual Min and Manual Max are editable only through explicit user action and are saved only when the Update action is submitted.</w:t>
+      </w:r>
+    </w:p>
+    <w:p>
+      <w:pPr>
+        <w:pStyle w:val="ListBullet"/>
+      </w:pPr>
+      <w:r>
+        <w:t>Values must be validated as non-negative whole numbers. Manual Max should not be lower than Manual Min unless the business explicitly allows this and the row is flagged.</w:t>
+      </w:r>
+    </w:p>
+    <w:p>
+      <w:pPr>
+        <w:pStyle w:val="ListBullet"/>
+      </w:pPr>
+      <w:r>
+        <w:t>Saved manual min/max values persist after page refresh and appear in Forecasting Home for the same SPL Master/warehouse/location row.</w:t>
+      </w:r>
+    </w:p>
+    <w:p>
+      <w:pPr>
+        <w:pStyle w:val="ListBullet"/>
+      </w:pPr>
+      <w:r>
+        <w:t>The page supports search/filter by SPL Master and enough row context to avoid editing the wrong warehouse/location.</w:t>
+      </w:r>
+    </w:p>
+    <w:p>
+      <w:pPr>
+        <w:pStyle w:val="ListBullet"/>
+      </w:pPr>
+      <w:r>
+        <w:t>A bulk download/upload capability is required by the original workflow expectation but is not currently visible. The download should export current manual min/max rows; upload should validate and apply changes in bulk.</w:t>
+      </w:r>
+    </w:p>
+    <w:p>
+      <w:pPr>
+        <w:pStyle w:val="ListBullet"/>
+      </w:pPr>
+      <w:r>
+        <w:t>Bulk upload failures should report row-level validation errors and should not partially apply invalid rows without clear feedback.</w:t>
+      </w:r>
+    </w:p>
+    <w:p>
+      <w:pPr>
+        <w:pStyle w:val="Heading4"/>
+      </w:pPr>
+      <w:r>
+        <w:t>Test Cases</w:t>
+      </w:r>
+    </w:p>
+    <w:p>
+      <w:pPr>
+        <w:pStyle w:val="ListNumber"/>
+      </w:pPr>
+      <w:r>
+        <w:t>Single-row edit: change Manual Min for SPL8000095 / FUJITSU to 1, submit Update, refresh page, and assert the value remains 1 with Changed By populated.</w:t>
+      </w:r>
+    </w:p>
+    <w:p>
+      <w:pPr>
+        <w:pStyle w:val="ListNumber"/>
+      </w:pPr>
+      <w:r>
+        <w:t>Forecast propagation: after the SPL8000095 edit, open Forecasting Home and assert the same SPL Master/warehouse row shows Manual Min Qty = 1.</w:t>
+      </w:r>
+    </w:p>
+    <w:p>
+      <w:pPr>
+        <w:pStyle w:val="ListNumber"/>
+      </w:pPr>
+      <w:r>
+        <w:t>Validation: attempt to enter -1 or a decimal value in Manual Min and assert the system blocks save with a clear validation message.</w:t>
+      </w:r>
+    </w:p>
+    <w:p>
+      <w:pPr>
+        <w:pStyle w:val="ListNumber"/>
+      </w:pPr>
+      <w:r>
+        <w:t>Manual Max validation: attempt Manual Max lower than Manual Min and assert the system blocks or flags the row according to the agreed business rule.</w:t>
+      </w:r>
+    </w:p>
+    <w:p>
+      <w:pPr>
+        <w:pStyle w:val="ListNumber"/>
+      </w:pPr>
+      <w:r>
+        <w:t>Bulk download: assert a visible download action exists and exports SPL Master, primary part, warehouse, location, type, manual min, and manual max.</w:t>
+      </w:r>
+    </w:p>
+    <w:p>
+      <w:pPr>
+        <w:pStyle w:val="ListNumber"/>
+      </w:pPr>
+      <w:r>
+        <w:t>Bulk upload: upload a file changing two known SPL Master rows, assert both rows update, Forecasting Home reflects them, and Audit records the change.</w:t>
+      </w:r>
+    </w:p>
+    <w:p>
+      <w:pPr>
+        <w:pStyle w:val="Heading3"/>
+      </w:pPr>
+      <w:r>
+        <w:t>Audit</w:t>
+      </w:r>
+    </w:p>
+    <w:p>
+      <w:pPr>
+        <w:pStyle w:val="Heading4"/>
+      </w:pPr>
+      <w:r>
+        <w:t>Acceptance Criteria</w:t>
+      </w:r>
+    </w:p>
+    <w:p>
+      <w:pPr>
+        <w:pStyle w:val="ListBullet"/>
+      </w:pPr>
+      <w:r>
+        <w:t>The Audit page shows user actions for manual min/max changes and forecast-relevant configuration changes.</w:t>
+      </w:r>
+    </w:p>
+    <w:p>
+      <w:pPr>
+        <w:pStyle w:val="ListBullet"/>
+      </w:pPr>
+      <w:r>
+        <w:t>Each audit row includes SPL Master Code, Primary Part Number, Warehouse Code, old values, new values where available, change user, and change timestamp.</w:t>
+      </w:r>
+    </w:p>
+    <w:p>
+      <w:pPr>
+        <w:pStyle w:val="ListBullet"/>
+      </w:pPr>
+      <w:r>
+        <w:t>Audit records are append-only and survive page refresh/logout/login.</w:t>
+      </w:r>
+    </w:p>
+    <w:p>
+      <w:pPr>
+        <w:pStyle w:val="ListBullet"/>
+      </w:pPr>
+      <w:r>
+        <w:t>Filters for SPL code and warehouse code return the relevant audit rows only.</w:t>
+      </w:r>
+    </w:p>
+    <w:p>
+      <w:pPr>
+        <w:pStyle w:val="ListBullet"/>
+      </w:pPr>
+      <w:r>
+        <w:t>For CoCre8 MVP, the currently visible audit log appears broadly functional, but it should include new min/max values as well as old min/max values for proper review.</w:t>
+      </w:r>
+    </w:p>
+    <w:p>
+      <w:pPr>
+        <w:pStyle w:val="Heading4"/>
+      </w:pPr>
+      <w:r>
+        <w:t>Test Cases</w:t>
+      </w:r>
+    </w:p>
+    <w:p>
+      <w:pPr>
+        <w:pStyle w:val="ListNumber"/>
+      </w:pPr>
+      <w:r>
+        <w:t>After changing Manual Min for SPL8000095 / FUJITSU, assert an audit row is created with SPL8000095, FUJITSU, previous min, new min, user, and timestamp.</w:t>
+      </w:r>
+    </w:p>
+    <w:p>
+      <w:pPr>
+        <w:pStyle w:val="ListNumber"/>
+      </w:pPr>
+      <w:r>
+        <w:t>Filter Audit by SPL8000095 and assert only matching SPL Master changes are shown.</w:t>
+      </w:r>
+    </w:p>
+    <w:p>
+      <w:pPr>
+        <w:pStyle w:val="ListNumber"/>
+      </w:pPr>
+      <w:r>
+        <w:t>Filter Audit by FUJITSU and assert only FUJITSU warehouse changes are shown.</w:t>
+      </w:r>
+    </w:p>
+    <w:p>
+      <w:pPr>
+        <w:pStyle w:val="ListNumber"/>
+      </w:pPr>
+      <w:r>
+        <w:t>Make two edits to the same row and assert two separate audit records exist in chronological order.</w:t>
+      </w:r>
+    </w:p>
+    <w:p>
+      <w:pPr>
+        <w:pStyle w:val="ListNumber"/>
+      </w:pPr>
+      <w:r>
+        <w:t>Export or inspect audit data and assert timestamps are stored in a consistent date/time format.</w:t>
       </w:r>
     </w:p>
     <w:sectPr>

</xml_diff>

<commit_message>
Add SLA at risk acceptance criteria
</commit_message>
<xml_diff>
--- a/Acceptance Criteria and Unit Tests - updated.docx
+++ b/Acceptance Criteria and Unit Tests - updated.docx
@@ -2725,6 +2725,317 @@
       </w:pPr>
       <w:r>
         <w:t>Export or inspect audit data and assert timestamps are stored in a consistent date/time format.</w:t>
+      </w:r>
+    </w:p>
+    <w:p>
+      <w:r>
+        <w:br w:type="page"/>
+      </w:r>
+    </w:p>
+    <w:p>
+      <w:pPr>
+        <w:pStyle w:val="Heading2"/>
+      </w:pPr>
+      <w:r>
+        <w:t>SLA's at Risk</w:t>
+      </w:r>
+    </w:p>
+    <w:p>
+      <w:pPr>
+        <w:pStyle w:val="Heading3"/>
+      </w:pPr>
+      <w:r>
+        <w:t>Current Understanding</w:t>
+      </w:r>
+    </w:p>
+    <w:p>
+      <w:r>
+        <w:t>This page cannot be fully accepted as a true SLA risk page yet. The original spec mentions an SLA Risk Analyzer, but the current CoCre8 upload data does not include enough information for financial SLA penalties or live breach probability by customer/site. For MVP, this page can only be tested as a stock-at-risk view: parts/locations where forecast demand or minimum stock is at risk because available stock is too low.</w:t>
+      </w:r>
+    </w:p>
+    <w:p>
+      <w:pPr>
+        <w:pStyle w:val="Heading3"/>
+      </w:pPr>
+      <w:r>
+        <w:t>What the Page Should Show for MVP</w:t>
+      </w:r>
+    </w:p>
+    <w:p>
+      <w:pPr>
+        <w:pStyle w:val="ListBullet"/>
+      </w:pPr>
+      <w:r>
+        <w:t>Rows where a SKU/SPL Master and location may not have enough stock for expected demand or minimum stock.</w:t>
+      </w:r>
+    </w:p>
+    <w:p>
+      <w:pPr>
+        <w:pStyle w:val="ListBullet"/>
+      </w:pPr>
+      <w:r>
+        <w:t>SKU should be clear. For CoCre8 this should ideally be SPL Master, with the primary part shown if the UI only has one SKU column.</w:t>
+      </w:r>
+    </w:p>
+    <w:p>
+      <w:pPr>
+        <w:pStyle w:val="ListBullet"/>
+      </w:pPr>
+      <w:r>
+        <w:t>Location should be a location group, not only one warehouse, if the forecast is location based.</w:t>
+      </w:r>
+    </w:p>
+    <w:p>
+      <w:pPr>
+        <w:pStyle w:val="ListBullet"/>
+      </w:pPr>
+      <w:r>
+        <w:t>Stock on hand should come from WarehouseStockOnHand.quantityOnHand for that SKU/location.</w:t>
+      </w:r>
+    </w:p>
+    <w:p>
+      <w:pPr>
+        <w:pStyle w:val="ListBullet"/>
+      </w:pPr>
+      <w:r>
+        <w:t>Inbound should come from WarehouseStockOnHand.quantityInbound or open purchase orders for that SKU/location.</w:t>
+      </w:r>
+    </w:p>
+    <w:p>
+      <w:pPr>
+        <w:pStyle w:val="ListBullet"/>
+      </w:pPr>
+      <w:r>
+        <w:t>Allocated should come from WarehouseStockOnHand.quantityAllocated.</w:t>
+      </w:r>
+    </w:p>
+    <w:p>
+      <w:pPr>
+        <w:pStyle w:val="ListBullet"/>
+      </w:pPr>
+      <w:r>
+        <w:t>Manual Min and Manual Max should match the values from Update Manual Min-Max.</w:t>
+      </w:r>
+    </w:p>
+    <w:p>
+      <w:pPr>
+        <w:pStyle w:val="ListBullet"/>
+      </w:pPr>
+      <w:r>
+        <w:t>Min Qty should match the calculated SPL Min Qty used on Forecasting Home.</w:t>
+      </w:r>
+    </w:p>
+    <w:p>
+      <w:pPr>
+        <w:pStyle w:val="ListBullet"/>
+      </w:pPr>
+      <w:r>
+        <w:t>Baseline Demand and Pre-emptive Fill Rate need a documented formula before final acceptance.</w:t>
+      </w:r>
+    </w:p>
+    <w:p>
+      <w:pPr>
+        <w:pStyle w:val="Heading3"/>
+      </w:pPr>
+      <w:r>
+        <w:t>Acceptance Criteria</w:t>
+      </w:r>
+    </w:p>
+    <w:p>
+      <w:pPr>
+        <w:pStyle w:val="ListBullet"/>
+      </w:pPr>
+      <w:r>
+        <w:t>The page should not show No Data Found if there are forecast rows where stock is below Min Qty or below expected demand.</w:t>
+      </w:r>
+    </w:p>
+    <w:p>
+      <w:pPr>
+        <w:pStyle w:val="ListBullet"/>
+      </w:pPr>
+      <w:r>
+        <w:t>If there are genuinely no at-risk rows, No Data Found is acceptable, but this must be backed by the same risk calculation used by the page.</w:t>
+      </w:r>
+    </w:p>
+    <w:p>
+      <w:pPr>
+        <w:pStyle w:val="ListBullet"/>
+      </w:pPr>
+      <w:r>
+        <w:t>The page should use the same forecast grain as Forecasting Home: SPL Master + location group + customer stock group.</w:t>
+      </w:r>
+    </w:p>
+    <w:p>
+      <w:pPr>
+        <w:pStyle w:val="ListBullet"/>
+      </w:pPr>
+      <w:r>
+        <w:t>A row is at risk when available stock is below the required stock level. Required stock is the higher of calculated Min Qty, Manual Min, or forecast demand for the selected date, depending on the agreed formula.</w:t>
+      </w:r>
+    </w:p>
+    <w:p>
+      <w:pPr>
+        <w:pStyle w:val="ListBullet"/>
+      </w:pPr>
+      <w:r>
+        <w:t>Available stock should be calculated from stock on hand plus inbound minus allocated. Outbound is not available for CoCre8 MVP and should be blank, zero, or removed unless a confirmed source is added.</w:t>
+      </w:r>
+    </w:p>
+    <w:p>
+      <w:pPr>
+        <w:pStyle w:val="ListBullet"/>
+      </w:pPr>
+      <w:r>
+        <w:t>The date buttons, Today and Yesterday, should change the risk date used by the calculation.</w:t>
+      </w:r>
+    </w:p>
+    <w:p>
+      <w:pPr>
+        <w:pStyle w:val="ListBullet"/>
+      </w:pPr>
+      <w:r>
+        <w:t>Search and status filters should only filter the risk rows. They should not change the underlying risk calculation.</w:t>
+      </w:r>
+    </w:p>
+    <w:p>
+      <w:pPr>
+        <w:pStyle w:val="ListBullet"/>
+      </w:pPr>
+      <w:r>
+        <w:t>Export should contain the same rows and values shown on screen.</w:t>
+      </w:r>
+    </w:p>
+    <w:p>
+      <w:pPr>
+        <w:pStyle w:val="Heading3"/>
+      </w:pPr>
+      <w:r>
+        <w:t>Test Cases</w:t>
+      </w:r>
+    </w:p>
+    <w:p>
+      <w:pPr>
+        <w:pStyle w:val="ListNumber"/>
+      </w:pPr>
+      <w:r>
+        <w:t>Risk row appears: find or create a test row where Min Qty is greater than available stock. Confirm the SKU/location appears on SLA at Risk.</w:t>
+      </w:r>
+    </w:p>
+    <w:p>
+      <w:pPr>
+        <w:pStyle w:val="ListNumber"/>
+      </w:pPr>
+      <w:r>
+        <w:t>No risk row: find or create a test row where available stock is greater than Min Qty and expected demand. Confirm it does not appear.</w:t>
+      </w:r>
+    </w:p>
+    <w:p>
+      <w:pPr>
+        <w:pStyle w:val="ListNumber"/>
+      </w:pPr>
+      <w:r>
+        <w:t>Manual Min impact: increase Manual Min for a known SPL Master/location so it is above available stock. Confirm the row appears after refresh/regeneration.</w:t>
+      </w:r>
+    </w:p>
+    <w:p>
+      <w:pPr>
+        <w:pStyle w:val="ListNumber"/>
+      </w:pPr>
+      <w:r>
+        <w:t>Inbound impact: for a SKU/location with inbound stock, confirm inbound is included in the displayed row and in the available-stock calculation.</w:t>
+      </w:r>
+    </w:p>
+    <w:p>
+      <w:pPr>
+        <w:pStyle w:val="ListNumber"/>
+      </w:pPr>
+      <w:r>
+        <w:t>Allocated impact: for a SKU/location with allocated stock, confirm allocated is subtracted from available stock.</w:t>
+      </w:r>
+    </w:p>
+    <w:p>
+      <w:pPr>
+        <w:pStyle w:val="ListNumber"/>
+      </w:pPr>
+      <w:r>
+        <w:t>Date filter: compare Today and Yesterday. Confirm the page recalculates or filters using the selected date.</w:t>
+      </w:r>
+    </w:p>
+    <w:p>
+      <w:pPr>
+        <w:pStyle w:val="ListNumber"/>
+      </w:pPr>
+      <w:r>
+        <w:t>Export: export the table and confirm SKU, Location, Forecast Date, Baseline Demand, Stock on hand, Manual Min, Manual Max, Inbound, Allocated, and Min Qty match the UI.</w:t>
+      </w:r>
+    </w:p>
+    <w:p>
+      <w:pPr>
+        <w:pStyle w:val="Heading3"/>
+      </w:pPr>
+      <w:r>
+        <w:t>Missing Data / Open Questions</w:t>
+      </w:r>
+    </w:p>
+    <w:p>
+      <w:pPr>
+        <w:pStyle w:val="ListBullet"/>
+      </w:pPr>
+      <w:r>
+        <w:t>Formula for Baseline Demand.</w:t>
+      </w:r>
+    </w:p>
+    <w:p>
+      <w:pPr>
+        <w:pStyle w:val="ListBullet"/>
+      </w:pPr>
+      <w:r>
+        <w:t>Formula for Pre-emptive Fill Rate.</w:t>
+      </w:r>
+    </w:p>
+    <w:p>
+      <w:pPr>
+        <w:pStyle w:val="ListBullet"/>
+      </w:pPr>
+      <w:r>
+        <w:t>Whether SKU should display SPL Master or primary part number. For CoCre8, SPL Master is preferred.</w:t>
+      </w:r>
+    </w:p>
+    <w:p>
+      <w:pPr>
+        <w:pStyle w:val="ListBullet"/>
+      </w:pPr>
+      <w:r>
+        <w:t>Whether this page is meant to show inventory risk only, or true customer SLA breach risk.</w:t>
+      </w:r>
+    </w:p>
+    <w:p>
+      <w:pPr>
+        <w:pStyle w:val="ListBullet"/>
+      </w:pPr>
+      <w:r>
+        <w:t>If true SLA breach risk is required, we still need customer/site SLA rules, active call due times, breach status, and SLA penalty/cost data.</w:t>
+      </w:r>
+    </w:p>
+    <w:p>
+      <w:pPr>
+        <w:pStyle w:val="ListBullet"/>
+      </w:pPr>
+      <w:r>
+        <w:t>Outbound stock is not available for CoCre8 MVP.</w:t>
+      </w:r>
+    </w:p>
+    <w:p>
+      <w:pPr>
+        <w:pStyle w:val="Heading3"/>
+      </w:pPr>
+      <w:r>
+        <w:t>MVP Decision</w:t>
+      </w:r>
+    </w:p>
+    <w:p>
+      <w:r>
+        <w:t>For CoCre8 MVP, this page should either be implemented as a stock-at-risk page using forecast and stock data, or marked out of scope until the SLA risk formula and required SLA data are confirmed.</w:t>
       </w:r>
     </w:p>
     <w:sectPr>

</xml_diff>

<commit_message>
Add what-if analysis acceptance criteria
</commit_message>
<xml_diff>
--- a/Acceptance Criteria and Unit Tests - updated.docx
+++ b/Acceptance Criteria and Unit Tests - updated.docx
@@ -3036,6 +3036,527 @@
     <w:p>
       <w:r>
         <w:t>For CoCre8 MVP, this page should either be implemented as a stock-at-risk page using forecast and stock data, or marked out of scope until the SLA risk formula and required SLA data are confirmed.</w:t>
+      </w:r>
+    </w:p>
+    <w:p>
+      <w:r>
+        <w:br w:type="page"/>
+      </w:r>
+    </w:p>
+    <w:p>
+      <w:pPr>
+        <w:pStyle w:val="Heading2"/>
+      </w:pPr>
+      <w:r>
+        <w:t>What-if Analysis</w:t>
+      </w:r>
+    </w:p>
+    <w:p>
+      <w:pPr>
+        <w:pStyle w:val="Heading3"/>
+      </w:pPr>
+      <w:r>
+        <w:t>Current Understanding</w:t>
+      </w:r>
+    </w:p>
+    <w:p>
+      <w:r>
+        <w:t>This page should be an AI question-and-answer layer over the planning data that has been uploaded. It should not answer from general knowledge only, and it should not say that part-level demand is unavailable when PartsUsage, Parts, WarehouseStockOnHand, and forecast rows contain part-level and SPL Master-level data.</w:t>
+      </w:r>
+    </w:p>
+    <w:p>
+      <w:r>
+        <w:t>For CoCre8, useful answers should usually be at SPL Master level first, with the actual part numbers shown as evidence. Where the question asks about a part category such as hard drives, the tool should use Parts.partType, productType, productClass, and description to identify matching parts, then use usage, stock, and forecast data to answer.</w:t>
+      </w:r>
+    </w:p>
+    <w:p>
+      <w:pPr>
+        <w:pStyle w:val="Heading3"/>
+      </w:pPr>
+      <w:r>
+        <w:t>What the Page Should Show</w:t>
+      </w:r>
+    </w:p>
+    <w:p>
+      <w:pPr>
+        <w:pStyle w:val="ListBullet"/>
+      </w:pPr>
+      <w:r>
+        <w:t>A chat input, visible answer history, and clear answer text.</w:t>
+      </w:r>
+    </w:p>
+    <w:p>
+      <w:pPr>
+        <w:pStyle w:val="ListBullet"/>
+      </w:pPr>
+      <w:r>
+        <w:t>Answers that use uploaded planning data: Parts, PartsUsage, WarehouseStockOnHand, Warehouses, WarehouseExclusions, PurchaseOrders, and forecast output where relevant.</w:t>
+      </w:r>
+    </w:p>
+    <w:p>
+      <w:pPr>
+        <w:pStyle w:val="ListBullet"/>
+      </w:pPr>
+      <w:r>
+        <w:t>The answer should show the key numbers used, not only a narrative conclusion.</w:t>
+      </w:r>
+    </w:p>
+    <w:p>
+      <w:pPr>
+        <w:pStyle w:val="ListBullet"/>
+      </w:pPr>
+      <w:r>
+        <w:t>When a question can be answered, the tool should answer directly and list the source data used.</w:t>
+      </w:r>
+    </w:p>
+    <w:p>
+      <w:pPr>
+        <w:pStyle w:val="ListBullet"/>
+      </w:pPr>
+      <w:r>
+        <w:t>When a question cannot be answered, the tool should say exactly which field or dataset is missing.</w:t>
+      </w:r>
+    </w:p>
+    <w:p>
+      <w:pPr>
+        <w:pStyle w:val="ListBullet"/>
+      </w:pPr>
+      <w:r>
+        <w:t>The tool should not invent stock, usage, lead time, or forecast values.</w:t>
+      </w:r>
+    </w:p>
+    <w:p>
+      <w:pPr>
+        <w:pStyle w:val="ListBullet"/>
+      </w:pPr>
+      <w:r>
+        <w:t>The tool should respect location groups and interchangeable warehouse pools. It should not silently mix Massmart, Royal Swazi, and main SPL stock.</w:t>
+      </w:r>
+    </w:p>
+    <w:p>
+      <w:pPr>
+        <w:pStyle w:val="Heading3"/>
+      </w:pPr>
+      <w:r>
+        <w:t>Acceptance Criteria</w:t>
+      </w:r>
+    </w:p>
+    <w:p>
+      <w:pPr>
+        <w:pStyle w:val="ListBullet"/>
+      </w:pPr>
+      <w:r>
+        <w:t>The tool can answer simple factual questions from uploaded data, such as current stock for a part by warehouse, top-used parts, and recent usage history.</w:t>
+      </w:r>
+    </w:p>
+    <w:p>
+      <w:pPr>
+        <w:pStyle w:val="ListBullet"/>
+      </w:pPr>
+      <w:r>
+        <w:t>The tool can answer SPL Master questions by grouping all alternative parts that map to the same SPL Master.</w:t>
+      </w:r>
+    </w:p>
+    <w:p>
+      <w:pPr>
+        <w:pStyle w:val="ListBullet"/>
+      </w:pPr>
+      <w:r>
+        <w:t>The tool can answer location-level questions using the same location/grouping rules as Forecasting Home.</w:t>
+      </w:r>
+    </w:p>
+    <w:p>
+      <w:pPr>
+        <w:pStyle w:val="ListBullet"/>
+      </w:pPr>
+      <w:r>
+        <w:t>The tool can answer category questions, for example hard drives, using part metadata rather than keyword guessing alone.</w:t>
+      </w:r>
+    </w:p>
+    <w:p>
+      <w:pPr>
+        <w:pStyle w:val="ListBullet"/>
+      </w:pPr>
+      <w:r>
+        <w:t>For forecast questions, the tool should use the forecast output if available. If no forecast output is available to the chat service, it should say that specifically, not claim that usage or part-level data is missing.</w:t>
+      </w:r>
+    </w:p>
+    <w:p>
+      <w:pPr>
+        <w:pStyle w:val="ListBullet"/>
+      </w:pPr>
+      <w:r>
+        <w:t>Every numeric answer should be traceable to named fields, for example quantityUsed, quantityOnHand, quantityInbound, quantityAllocated, SPLMaster, partType, and warehouseCode.</w:t>
+      </w:r>
+    </w:p>
+    <w:p>
+      <w:pPr>
+        <w:pStyle w:val="ListBullet"/>
+      </w:pPr>
+      <w:r>
+        <w:t>If a question asks for a recommended order quantity, the answer should separate factual inputs from recommendation logic: expected demand, current stock, inbound stock, allocated stock, manual min/max, lead time, and any assumptions.</w:t>
+      </w:r>
+    </w:p>
+    <w:p>
+      <w:pPr>
+        <w:pStyle w:val="ListBullet"/>
+      </w:pPr>
+      <w:r>
+        <w:t>The tool should avoid overconfident answers where business rules are still open, for example cost category preference, criticality, or kit handling.</w:t>
+      </w:r>
+    </w:p>
+    <w:p>
+      <w:pPr>
+        <w:pStyle w:val="Heading3"/>
+      </w:pPr>
+      <w:r>
+        <w:t>Known Data Fixtures for Tests</w:t>
+      </w:r>
+    </w:p>
+    <w:p>
+      <w:pPr>
+        <w:pStyle w:val="ListBullet"/>
+      </w:pPr>
+      <w:r>
+        <w:t>As of the refreshed PartsUsage upload on 2026-06-18, the file contains 875 usage rows and runs through 2026-06-18.</w:t>
+      </w:r>
+    </w:p>
+    <w:p>
+      <w:pPr>
+        <w:pStyle w:val="ListBullet"/>
+      </w:pPr>
+      <w:r>
+        <w:t>Top total usage in the refreshed PartsUsage evidence: part 38063390 has total quantity 90 across 33 usage rows, with latest usage on 2026-06-15.</w:t>
+      </w:r>
+    </w:p>
+    <w:p>
+      <w:pPr>
+        <w:pStyle w:val="ListBullet"/>
+      </w:pPr>
+      <w:r>
+        <w:t>For the last 365 days, uploaded usage shows part DB.VYQ11.002 as the highest-used part by quantity: 88 units across 75 rows, latest usage on 2026-06-15.</w:t>
+      </w:r>
+    </w:p>
+    <w:p>
+      <w:pPr>
+        <w:pStyle w:val="ListBullet"/>
+      </w:pPr>
+      <w:r>
+        <w:t>For CoCre8 hard-drive-like SPL Masters in the last 365 days, SPL8005179 is the highest usage group found: 11 units across 4 rows, mainly part 38066705.</w:t>
+      </w:r>
+    </w:p>
+    <w:p>
+      <w:pPr>
+        <w:pStyle w:val="ListBullet"/>
+      </w:pPr>
+      <w:r>
+        <w:t>WarehouseStockOnHand shows part 38063390 in FUJITSU with quantityOnHand 10, quantityAllocated 11, and quantityInbound 0.</w:t>
+      </w:r>
+    </w:p>
+    <w:p>
+      <w:pPr>
+        <w:pStyle w:val="ListBullet"/>
+      </w:pPr>
+      <w:r>
+        <w:t>WarehouseStockOnHand shows part 38064009 in six warehouses with total quantityOnHand 6, including FUJITSU 1 and FUJ CT 1.</w:t>
+      </w:r>
+    </w:p>
+    <w:p>
+      <w:pPr>
+        <w:pStyle w:val="Heading3"/>
+      </w:pPr>
+      <w:r>
+        <w:t>Test Cases</w:t>
+      </w:r>
+    </w:p>
+    <w:tbl>
+      <w:tblPr>
+        <w:tblStyle w:val="TableGrid"/>
+        <w:tblW w:type="auto" w:w="0"/>
+        <w:jc w:val="center"/>
+        <w:tblLook w:firstColumn="1" w:firstRow="1" w:lastColumn="0" w:lastRow="0" w:noHBand="0" w:noVBand="1" w:val="04A0"/>
+      </w:tblPr>
+      <w:tblGrid>
+        <w:gridCol w:w="2880"/>
+        <w:gridCol w:w="2880"/>
+        <w:gridCol w:w="2880"/>
+      </w:tblGrid>
+      <w:tr>
+        <w:tc>
+          <w:tcPr>
+            <w:tcW w:type="dxa" w:w="2880"/>
+          </w:tcPr>
+          <w:p>
+            <w:r>
+              <w:t>Question</w:t>
+            </w:r>
+          </w:p>
+        </w:tc>
+        <w:tc>
+          <w:tcPr>
+            <w:tcW w:type="dxa" w:w="2880"/>
+          </w:tcPr>
+          <w:p>
+            <w:r>
+              <w:t>Expected Behaviour</w:t>
+            </w:r>
+          </w:p>
+        </w:tc>
+        <w:tc>
+          <w:tcPr>
+            <w:tcW w:type="dxa" w:w="2880"/>
+          </w:tcPr>
+          <w:p>
+            <w:r>
+              <w:t>Pass / Fail Signal</w:t>
+            </w:r>
+          </w:p>
+        </w:tc>
+      </w:tr>
+      <w:tr>
+        <w:tc>
+          <w:tcPr>
+            <w:tcW w:type="dxa" w:w="2880"/>
+          </w:tcPr>
+          <w:p>
+            <w:r>
+              <w:t>Which part has the highest forecast demand next month?</w:t>
+            </w:r>
+          </w:p>
+        </w:tc>
+        <w:tc>
+          <w:tcPr>
+            <w:tcW w:type="dxa" w:w="2880"/>
+          </w:tcPr>
+          <w:p>
+            <w:r>
+              <w:t>Use forecast output at SPL Master/location level if available. If forecast output is not available to the chat layer, say that forecast output is missing but do not say part-level data is missing.</w:t>
+            </w:r>
+          </w:p>
+        </w:tc>
+        <w:tc>
+          <w:tcPr>
+            <w:tcW w:type="dxa" w:w="2880"/>
+          </w:tcPr>
+          <w:p>
+            <w:r>
+              <w:t>Fails if it answers only with aggregate counts or says there is no part-level demand data.</w:t>
+            </w:r>
+          </w:p>
+        </w:tc>
+      </w:tr>
+      <w:tr>
+        <w:tc>
+          <w:tcPr>
+            <w:tcW w:type="dxa" w:w="2880"/>
+          </w:tcPr>
+          <w:p>
+            <w:r>
+              <w:t>Which part has the highest usage in the last 12 months?</w:t>
+            </w:r>
+          </w:p>
+        </w:tc>
+        <w:tc>
+          <w:tcPr>
+            <w:tcW w:type="dxa" w:w="2880"/>
+          </w:tcPr>
+          <w:p>
+            <w:r>
+              <w:t>Return the highest-used part/SPL Master from PartsUsage, with quantity and date range. Current fixture: DB.VYQ11.002 has 88 units in the last 365 days; for CoCre8 main-stock-only questions use the relevant location filter.</w:t>
+            </w:r>
+          </w:p>
+        </w:tc>
+        <w:tc>
+          <w:tcPr>
+            <w:tcW w:type="dxa" w:w="2880"/>
+          </w:tcPr>
+          <w:p>
+            <w:r>
+              <w:t>Fails if it refuses despite PartsUsage containing part-level usage.</w:t>
+            </w:r>
+          </w:p>
+        </w:tc>
+      </w:tr>
+      <w:tr>
+        <w:tc>
+          <w:tcPr>
+            <w:tcW w:type="dxa" w:w="2880"/>
+          </w:tcPr>
+          <w:p>
+            <w:r>
+              <w:t>How many hard drives should we order for July?</w:t>
+            </w:r>
+          </w:p>
+        </w:tc>
+        <w:tc>
+          <w:tcPr>
+            <w:tcW w:type="dxa" w:w="2880"/>
+          </w:tcPr>
+          <w:p>
+            <w:r>
+              <w:t>Identify hard-drive parts using partType/productType/description, then show expected demand, current stock, inbound, allocated, and lead time. Current hard-drive fixture: SPL8005179 has 11 units used in the last 365 days.</w:t>
+            </w:r>
+          </w:p>
+        </w:tc>
+        <w:tc>
+          <w:tcPr>
+            <w:tcW w:type="dxa" w:w="2880"/>
+          </w:tcPr>
+          <w:p>
+            <w:r>
+              <w:t>Passes if it gives a cautious recommendation with inputs and assumptions; fails if it says no hard-drive usage data exists.</w:t>
+            </w:r>
+          </w:p>
+        </w:tc>
+      </w:tr>
+      <w:tr>
+        <w:tc>
+          <w:tcPr>
+            <w:tcW w:type="dxa" w:w="2880"/>
+          </w:tcPr>
+          <w:p>
+            <w:r>
+              <w:t>How much stock do we have for part 38063390?</w:t>
+            </w:r>
+          </w:p>
+        </w:tc>
+        <w:tc>
+          <w:tcPr>
+            <w:tcW w:type="dxa" w:w="2880"/>
+          </w:tcPr>
+          <w:p>
+            <w:r>
+              <w:t>Use WarehouseStockOnHand and answer by warehouse. Current fixture: FUJITSU has quantityOnHand 10, allocated 11, inbound 0.</w:t>
+            </w:r>
+          </w:p>
+        </w:tc>
+        <w:tc>
+          <w:tcPr>
+            <w:tcW w:type="dxa" w:w="2880"/>
+          </w:tcPr>
+          <w:p>
+            <w:r>
+              <w:t>Fails if the answer gives unexplained or different stock numbers.</w:t>
+            </w:r>
+          </w:p>
+        </w:tc>
+      </w:tr>
+      <w:tr>
+        <w:tc>
+          <w:tcPr>
+            <w:tcW w:type="dxa" w:w="2880"/>
+          </w:tcPr>
+          <w:p>
+            <w:r>
+              <w:t>Show usage for SPL8005179 by location.</w:t>
+            </w:r>
+          </w:p>
+        </w:tc>
+        <w:tc>
+          <w:tcPr>
+            <w:tcW w:type="dxa" w:w="2880"/>
+          </w:tcPr>
+          <w:p>
+            <w:r>
+              <w:t>Group all alternative parts under SPL8005179 and show usage by warehouse/location. Current fixture includes 11 units in the last 365 days, mainly 38066705.</w:t>
+            </w:r>
+          </w:p>
+        </w:tc>
+        <w:tc>
+          <w:tcPr>
+            <w:tcW w:type="dxa" w:w="2880"/>
+          </w:tcPr>
+          <w:p>
+            <w:r>
+              <w:t>Fails if it treats only one part row as the whole SPL Master without explaining.</w:t>
+            </w:r>
+          </w:p>
+        </w:tc>
+      </w:tr>
+      <w:tr>
+        <w:tc>
+          <w:tcPr>
+            <w:tcW w:type="dxa" w:w="2880"/>
+          </w:tcPr>
+          <w:p>
+            <w:r>
+              <w:t>Can we fulfil one 38064009 call from Cape Town main stock?</w:t>
+            </w:r>
+          </w:p>
+        </w:tc>
+        <w:tc>
+          <w:tcPr>
+            <w:tcW w:type="dxa" w:w="2880"/>
+          </w:tcPr>
+          <w:p>
+            <w:r>
+              <w:t>Use FUJ CT and other allowed CPT main warehouses only. Current fixture shows FUJ CT has quantityOnHand 1 for 38064009.</w:t>
+            </w:r>
+          </w:p>
+        </w:tc>
+        <w:tc>
+          <w:tcPr>
+            <w:tcW w:type="dxa" w:w="2880"/>
+          </w:tcPr>
+          <w:p>
+            <w:r>
+              <w:t>Fails if it mixes unrelated customer/virtual warehouses without saying so.</w:t>
+            </w:r>
+          </w:p>
+        </w:tc>
+      </w:tr>
+    </w:tbl>
+    <w:p>
+      <w:pPr>
+        <w:pStyle w:val="Heading3"/>
+      </w:pPr>
+      <w:r>
+        <w:t>Open Questions</w:t>
+      </w:r>
+    </w:p>
+    <w:p>
+      <w:pPr>
+        <w:pStyle w:val="ListBullet"/>
+      </w:pPr>
+      <w:r>
+        <w:t>Does the chat service have direct access to generated forecast rows, or only to uploaded CSVs?</w:t>
+      </w:r>
+    </w:p>
+    <w:p>
+      <w:pPr>
+        <w:pStyle w:val="ListBullet"/>
+      </w:pPr>
+      <w:r>
+        <w:t>Should answers always prefer SPL Master level, or only when the question explicitly asks for master/alternate grouping?</w:t>
+      </w:r>
+    </w:p>
+    <w:p>
+      <w:pPr>
+        <w:pStyle w:val="ListBullet"/>
+      </w:pPr>
+      <w:r>
+        <w:t>What formula should be used when turning forecast demand into a recommended purchase quantity?</w:t>
+      </w:r>
+    </w:p>
+    <w:p>
+      <w:pPr>
+        <w:pStyle w:val="ListBullet"/>
+      </w:pPr>
+      <w:r>
+        <w:t>Should virtual/fault/quarantine warehouses be excluded from fulfilment answers by default?</w:t>
+      </w:r>
+    </w:p>
+    <w:p>
+      <w:pPr>
+        <w:pStyle w:val="Heading3"/>
+      </w:pPr>
+      <w:r>
+        <w:t>MVP Decision</w:t>
+      </w:r>
+    </w:p>
+    <w:p>
+      <w:r>
+        <w:t>For MVP, the What-if Analysis page should be accepted only if it can answer factual stock, usage, and forecast questions from uploaded data with traceable numbers. More advanced AI recommendations can come later, once the calculation rules and data access path are confirmed.</w:t>
       </w:r>
     </w:p>
     <w:sectPr>

</xml_diff>

<commit_message>
Add purchase order acceptance criteria
</commit_message>
<xml_diff>
--- a/Acceptance Criteria and Unit Tests - updated.docx
+++ b/Acceptance Criteria and Unit Tests - updated.docx
@@ -3557,6 +3557,767 @@
     <w:p>
       <w:r>
         <w:t>For MVP, the What-if Analysis page should be accepted only if it can answer factual stock, usage, and forecast questions from uploaded data with traceable numbers. More advanced AI recommendations can come later, once the calculation rules and data access path are confirmed.</w:t>
+      </w:r>
+    </w:p>
+    <w:p>
+      <w:r>
+        <w:br w:type="page"/>
+      </w:r>
+    </w:p>
+    <w:p>
+      <w:pPr>
+        <w:pStyle w:val="Heading2"/>
+      </w:pPr>
+      <w:r>
+        <w:t>Purchase Orders</w:t>
+      </w:r>
+    </w:p>
+    <w:p>
+      <w:pPr>
+        <w:pStyle w:val="Heading3"/>
+      </w:pPr>
+      <w:r>
+        <w:t>Goal</w:t>
+      </w:r>
+    </w:p>
+    <w:p>
+      <w:r>
+        <w:t>The Purchase Orders section should help the planner decide which parts need replenishment and then create a CoCre8 PO request. For CoCre8 MVP, the output does not need to create a live SAP PO or Fujitsu portal order. It is acceptable if it generates a structured email/request asking CoCre8 to raise or approve a purchase order for the selected parts.</w:t>
+      </w:r>
+    </w:p>
+    <w:p>
+      <w:pPr>
+        <w:pStyle w:val="Heading3"/>
+      </w:pPr>
+      <w:r>
+        <w:t>Sub-pages</w:t>
+      </w:r>
+    </w:p>
+    <w:p>
+      <w:pPr>
+        <w:pStyle w:val="ListBullet"/>
+      </w:pPr>
+      <w:r>
+        <w:t>Suggested Purchase Orders</w:t>
+      </w:r>
+    </w:p>
+    <w:p>
+      <w:pPr>
+        <w:pStyle w:val="ListBullet"/>
+      </w:pPr>
+      <w:r>
+        <w:t>Generated Purchase Orders</w:t>
+      </w:r>
+    </w:p>
+    <w:p>
+      <w:pPr>
+        <w:pStyle w:val="Heading3"/>
+      </w:pPr>
+      <w:r>
+        <w:t>Suggested Purchase Orders</w:t>
+      </w:r>
+    </w:p>
+    <w:p>
+      <w:pPr>
+        <w:pStyle w:val="Heading4"/>
+      </w:pPr>
+      <w:r>
+        <w:t>Acceptance Criteria</w:t>
+      </w:r>
+    </w:p>
+    <w:p>
+      <w:pPr>
+        <w:pStyle w:val="ListBullet"/>
+      </w:pPr>
+      <w:r>
+        <w:t>The page should show suggested replenishment rows when a part/SPL Master has a shortage against the agreed minimum stock, manual minimum, or forecast demand rule.</w:t>
+      </w:r>
+    </w:p>
+    <w:p>
+      <w:pPr>
+        <w:pStyle w:val="ListBullet"/>
+      </w:pPr>
+      <w:r>
+        <w:t>The page should not remain blank if uploaded stock, forecast, and cost data produce one or more positive suggested quantities.</w:t>
+      </w:r>
+    </w:p>
+    <w:p>
+      <w:pPr>
+        <w:pStyle w:val="ListBullet"/>
+      </w:pPr>
+      <w:r>
+        <w:t>The calculation should work at SPL Master level first, with the actual recommended purchase part shown clearly.</w:t>
+      </w:r>
+    </w:p>
+    <w:p>
+      <w:pPr>
+        <w:pStyle w:val="ListBullet"/>
+      </w:pPr>
+      <w:r>
+        <w:t>Available stock should be calculated as stock on hand plus inbound minus allocated, using WarehouseStockOnHand.quantityOnHand, quantityInbound, and quantityAllocated.</w:t>
+      </w:r>
+    </w:p>
+    <w:p>
+      <w:pPr>
+        <w:pStyle w:val="ListBullet"/>
+      </w:pPr>
+      <w:r>
+        <w:t>Suggested Quantity should be a positive whole number and should be traceable to the shortage or forecast calculation used.</w:t>
+      </w:r>
+    </w:p>
+    <w:p>
+      <w:pPr>
+        <w:pStyle w:val="ListBullet"/>
+      </w:pPr>
+      <w:r>
+        <w:t>No. of Days should have a documented meaning. If it means lead time, it should use Parts.purchaseLeadTimeDays. If it means days of cover, it should use expected daily usage.</w:t>
+      </w:r>
+    </w:p>
+    <w:p>
+      <w:pPr>
+        <w:pStyle w:val="ListBullet"/>
+      </w:pPr>
+      <w:r>
+        <w:t>Suggested order date should be the date the tool recommends ordering. For MVP this can default to today when stock is already short or forecast demand cannot be met.</w:t>
+      </w:r>
+    </w:p>
+    <w:p>
+      <w:pPr>
+        <w:pStyle w:val="ListBullet"/>
+      </w:pPr>
+      <w:r>
+        <w:t>Expected delivery date should be suggested order date plus purchase lead time days, unless a confirmed supplier ETA exists.</w:t>
+      </w:r>
+    </w:p>
+    <w:p>
+      <w:pPr>
+        <w:pStyle w:val="ListBullet"/>
+      </w:pPr>
+      <w:r>
+        <w:t>Last Cost should come from PartCost.cost or the latest confirmed CoCre8 cost evidence, not from unreliable SAP PO line cost values.</w:t>
+      </w:r>
+    </w:p>
+    <w:p>
+      <w:pPr>
+        <w:pStyle w:val="ListBullet"/>
+      </w:pPr>
+      <w:r>
+        <w:t>Estimated Total Cost should equal Suggested Quantity multiplied by Last Cost, with blank or warning state if no cost is available.</w:t>
+      </w:r>
+    </w:p>
+    <w:p>
+      <w:pPr>
+        <w:pStyle w:val="ListBullet"/>
+      </w:pPr>
+      <w:r>
+        <w:t>The user should be able to select one or more suggested rows and click Create Purchase Orders.</w:t>
+      </w:r>
+    </w:p>
+    <w:p>
+      <w:pPr>
+        <w:pStyle w:val="ListBullet"/>
+      </w:pPr>
+      <w:r>
+        <w:t>For CoCre8 MVP, Create Purchase Orders may generate a PO request email or request record rather than a live integrated purchase order.</w:t>
+      </w:r>
+    </w:p>
+    <w:p>
+      <w:pPr>
+        <w:pStyle w:val="ListBullet"/>
+      </w:pPr>
+      <w:r>
+        <w:t>The page should explain why no rows are shown, for example no shortages, no min values, no forecast output, or missing calculation setup. It should not only show No Data Found when the calculation cannot run.</w:t>
+      </w:r>
+    </w:p>
+    <w:p>
+      <w:pPr>
+        <w:pStyle w:val="Heading4"/>
+      </w:pPr>
+      <w:r>
+        <w:t>Suggested PO Test Cases</w:t>
+      </w:r>
+    </w:p>
+    <w:tbl>
+      <w:tblPr>
+        <w:tblStyle w:val="TableGrid"/>
+        <w:tblW w:type="auto" w:w="0"/>
+        <w:jc w:val="center"/>
+        <w:tblLook w:firstColumn="1" w:firstRow="1" w:lastColumn="0" w:lastRow="0" w:noHBand="0" w:noVBand="1" w:val="04A0"/>
+      </w:tblPr>
+      <w:tblGrid>
+        <w:gridCol w:w="2880"/>
+        <w:gridCol w:w="2880"/>
+        <w:gridCol w:w="2880"/>
+      </w:tblGrid>
+      <w:tr>
+        <w:tc>
+          <w:tcPr>
+            <w:tcW w:type="dxa" w:w="2880"/>
+          </w:tcPr>
+          <w:p>
+            <w:r>
+              <w:t>Scenario</w:t>
+            </w:r>
+          </w:p>
+        </w:tc>
+        <w:tc>
+          <w:tcPr>
+            <w:tcW w:type="dxa" w:w="2880"/>
+          </w:tcPr>
+          <w:p>
+            <w:r>
+              <w:t>Expected Result</w:t>
+            </w:r>
+          </w:p>
+        </w:tc>
+        <w:tc>
+          <w:tcPr>
+            <w:tcW w:type="dxa" w:w="2880"/>
+          </w:tcPr>
+          <w:p>
+            <w:r>
+              <w:t>Pass / Fail Signal</w:t>
+            </w:r>
+          </w:p>
+        </w:tc>
+      </w:tr>
+      <w:tr>
+        <w:tc>
+          <w:tcPr>
+            <w:tcW w:type="dxa" w:w="2880"/>
+          </w:tcPr>
+          <w:p>
+            <w:r>
+              <w:t>Manual minimum creates shortage</w:t>
+            </w:r>
+          </w:p>
+        </w:tc>
+        <w:tc>
+          <w:tcPr>
+            <w:tcW w:type="dxa" w:w="2880"/>
+          </w:tcPr>
+          <w:p>
+            <w:r>
+              <w:t>Set a manual min above available stock for a known part/SPL Master/location. The row appears with Suggested Quantity equal to the shortage unless the documented formula says otherwise.</w:t>
+            </w:r>
+          </w:p>
+        </w:tc>
+        <w:tc>
+          <w:tcPr>
+            <w:tcW w:type="dxa" w:w="2880"/>
+          </w:tcPr>
+          <w:p>
+            <w:r>
+              <w:t>Fails if Suggested PO remains blank after forecast regeneration.</w:t>
+            </w:r>
+          </w:p>
+        </w:tc>
+      </w:tr>
+      <w:tr>
+        <w:tc>
+          <w:tcPr>
+            <w:tcW w:type="dxa" w:w="2880"/>
+          </w:tcPr>
+          <w:p>
+            <w:r>
+              <w:t>Allocated stock creates shortage</w:t>
+            </w:r>
+          </w:p>
+        </w:tc>
+        <w:tc>
+          <w:tcPr>
+            <w:tcW w:type="dxa" w:w="2880"/>
+          </w:tcPr>
+          <w:p>
+            <w:r>
+              <w:t>Use a row where allocated exceeds on-hand stock. Example fixture: part 38063390 in FUJITSU has quantityOnHand 10, quantityAllocated 11, quantityInbound 0, so available stock is -1 before any min/forecast rule.</w:t>
+            </w:r>
+          </w:p>
+        </w:tc>
+        <w:tc>
+          <w:tcPr>
+            <w:tcW w:type="dxa" w:w="2880"/>
+          </w:tcPr>
+          <w:p>
+            <w:r>
+              <w:t>Fails if allocated stock is ignored.</w:t>
+            </w:r>
+          </w:p>
+        </w:tc>
+      </w:tr>
+      <w:tr>
+        <w:tc>
+          <w:tcPr>
+            <w:tcW w:type="dxa" w:w="2880"/>
+          </w:tcPr>
+          <w:p>
+            <w:r>
+              <w:t>Inbound stock offsets shortage</w:t>
+            </w:r>
+          </w:p>
+        </w:tc>
+        <w:tc>
+          <w:tcPr>
+            <w:tcW w:type="dxa" w:w="2880"/>
+          </w:tcPr>
+          <w:p>
+            <w:r>
+              <w:t>For a part with inbound stock, confirm inbound reduces or removes the suggested quantity.</w:t>
+            </w:r>
+          </w:p>
+        </w:tc>
+        <w:tc>
+          <w:tcPr>
+            <w:tcW w:type="dxa" w:w="2880"/>
+          </w:tcPr>
+          <w:p>
+            <w:r>
+              <w:t>Fails if inbound is displayed but not included in the calculation.</w:t>
+            </w:r>
+          </w:p>
+        </w:tc>
+      </w:tr>
+      <w:tr>
+        <w:tc>
+          <w:tcPr>
+            <w:tcW w:type="dxa" w:w="2880"/>
+          </w:tcPr>
+          <w:p>
+            <w:r>
+              <w:t>Cost calculation</w:t>
+            </w:r>
+          </w:p>
+        </w:tc>
+        <w:tc>
+          <w:tcPr>
+            <w:tcW w:type="dxa" w:w="2880"/>
+          </w:tcPr>
+          <w:p>
+            <w:r>
+              <w:t>A suggested row with Last Cost populated should show Estimated Total Cost = Suggested Quantity x Last Cost.</w:t>
+            </w:r>
+          </w:p>
+        </w:tc>
+        <w:tc>
+          <w:tcPr>
+            <w:tcW w:type="dxa" w:w="2880"/>
+          </w:tcPr>
+          <w:p>
+            <w:r>
+              <w:t>Fails if total cost does not reconcile to the displayed values.</w:t>
+            </w:r>
+          </w:p>
+        </w:tc>
+      </w:tr>
+      <w:tr>
+        <w:tc>
+          <w:tcPr>
+            <w:tcW w:type="dxa" w:w="2880"/>
+          </w:tcPr>
+          <w:p>
+            <w:r>
+              <w:t>Create PO request</w:t>
+            </w:r>
+          </w:p>
+        </w:tc>
+        <w:tc>
+          <w:tcPr>
+            <w:tcW w:type="dxa" w:w="2880"/>
+          </w:tcPr>
+          <w:p>
+            <w:r>
+              <w:t>Select one or more rows and click Create Purchase Orders. A generated CoCre8 PO request/email should include part, SPL Master if available, quantity, location/warehouse, cost, and reason.</w:t>
+            </w:r>
+          </w:p>
+        </w:tc>
+        <w:tc>
+          <w:tcPr>
+            <w:tcW w:type="dxa" w:w="2880"/>
+          </w:tcPr>
+          <w:p>
+            <w:r>
+              <w:t>Fails if the button does nothing or creates a request with missing selected lines.</w:t>
+            </w:r>
+          </w:p>
+        </w:tc>
+      </w:tr>
+      <w:tr>
+        <w:tc>
+          <w:tcPr>
+            <w:tcW w:type="dxa" w:w="2880"/>
+          </w:tcPr>
+          <w:p>
+            <w:r>
+              <w:t>No suggestion explanation</w:t>
+            </w:r>
+          </w:p>
+        </w:tc>
+        <w:tc>
+          <w:tcPr>
+            <w:tcW w:type="dxa" w:w="2880"/>
+          </w:tcPr>
+          <w:p>
+            <w:r>
+              <w:t>If there are genuinely no suggested rows, the page should display or make available the reason: no shortages, no mins, no forecast demand, or calculation not configured.</w:t>
+            </w:r>
+          </w:p>
+        </w:tc>
+        <w:tc>
+          <w:tcPr>
+            <w:tcW w:type="dxa" w:w="2880"/>
+          </w:tcPr>
+          <w:p>
+            <w:r>
+              <w:t>Fails if it only says No Data Found without diagnostic reason.</w:t>
+            </w:r>
+          </w:p>
+        </w:tc>
+      </w:tr>
+    </w:tbl>
+    <w:p>
+      <w:pPr>
+        <w:pStyle w:val="Heading3"/>
+      </w:pPr>
+      <w:r>
+        <w:t>Generated Purchase Orders</w:t>
+      </w:r>
+    </w:p>
+    <w:p>
+      <w:pPr>
+        <w:pStyle w:val="Heading4"/>
+      </w:pPr>
+      <w:r>
+        <w:t>Acceptance Criteria</w:t>
+      </w:r>
+    </w:p>
+    <w:p>
+      <w:pPr>
+        <w:pStyle w:val="ListBullet"/>
+      </w:pPr>
+      <w:r>
+        <w:t>The page should show purchase order records for the current CoCre8 tenant only.</w:t>
+      </w:r>
+    </w:p>
+    <w:p>
+      <w:pPr>
+        <w:pStyle w:val="ListBullet"/>
+      </w:pPr>
+      <w:r>
+        <w:t>The page must not show generated purchase orders or test data from another customer.</w:t>
+      </w:r>
+    </w:p>
+    <w:p>
+      <w:pPr>
+        <w:pStyle w:val="ListBullet"/>
+      </w:pPr>
+      <w:r>
+        <w:t>If this page is intended to show imported historical POs, it should show CoCre8 uploaded PurchaseOrders.csv records such as 26PO000277 or 26PO000344, not unrelated ORD-number records.</w:t>
+      </w:r>
+    </w:p>
+    <w:p>
+      <w:pPr>
+        <w:pStyle w:val="ListBullet"/>
+      </w:pPr>
+      <w:r>
+        <w:t>If this page is intended to show only POs generated inside the tool, it may be empty before the first generated CoCre8 PO request, but it must still not show another client's records.</w:t>
+      </w:r>
+    </w:p>
+    <w:p>
+      <w:pPr>
+        <w:pStyle w:val="ListBullet"/>
+      </w:pPr>
+      <w:r>
+        <w:t>Each generated PO row should show order number or generated request number, item names/parts, item count, order date, and available actions.</w:t>
+      </w:r>
+    </w:p>
+    <w:p>
+      <w:pPr>
+        <w:pStyle w:val="ListBullet"/>
+      </w:pPr>
+      <w:r>
+        <w:t>Opening a generated PO should show the line-level parts, quantities, warehouse/location, cost, status, and source reason for each line.</w:t>
+      </w:r>
+    </w:p>
+    <w:p>
+      <w:pPr>
+        <w:pStyle w:val="ListBullet"/>
+      </w:pPr>
+      <w:r>
+        <w:t>Deleting a generated PO should either be disabled after submission or should require confirmation and audit the action.</w:t>
+      </w:r>
+    </w:p>
+    <w:p>
+      <w:pPr>
+        <w:pStyle w:val="ListBullet"/>
+      </w:pPr>
+      <w:r>
+        <w:t>Generated records should be created from the selected rows on Suggested Purchase Orders and should persist after page refresh.</w:t>
+      </w:r>
+    </w:p>
+    <w:p>
+      <w:pPr>
+        <w:pStyle w:val="Heading4"/>
+      </w:pPr>
+      <w:r>
+        <w:t>Generated PO Test Cases</w:t>
+      </w:r>
+    </w:p>
+    <w:tbl>
+      <w:tblPr>
+        <w:tblStyle w:val="TableGrid"/>
+        <w:tblW w:type="auto" w:w="0"/>
+        <w:jc w:val="center"/>
+        <w:tblLook w:firstColumn="1" w:firstRow="1" w:lastColumn="0" w:lastRow="0" w:noHBand="0" w:noVBand="1" w:val="04A0"/>
+      </w:tblPr>
+      <w:tblGrid>
+        <w:gridCol w:w="2880"/>
+        <w:gridCol w:w="2880"/>
+        <w:gridCol w:w="2880"/>
+      </w:tblGrid>
+      <w:tr>
+        <w:tc>
+          <w:tcPr>
+            <w:tcW w:type="dxa" w:w="2880"/>
+          </w:tcPr>
+          <w:p>
+            <w:r>
+              <w:t>Scenario</w:t>
+            </w:r>
+          </w:p>
+        </w:tc>
+        <w:tc>
+          <w:tcPr>
+            <w:tcW w:type="dxa" w:w="2880"/>
+          </w:tcPr>
+          <w:p>
+            <w:r>
+              <w:t>Expected Result</w:t>
+            </w:r>
+          </w:p>
+        </w:tc>
+        <w:tc>
+          <w:tcPr>
+            <w:tcW w:type="dxa" w:w="2880"/>
+          </w:tcPr>
+          <w:p>
+            <w:r>
+              <w:t>Pass / Fail Signal</w:t>
+            </w:r>
+          </w:p>
+        </w:tc>
+      </w:tr>
+      <w:tr>
+        <w:tc>
+          <w:tcPr>
+            <w:tcW w:type="dxa" w:w="2880"/>
+          </w:tcPr>
+          <w:p>
+            <w:r>
+              <w:t>Tenant isolation</w:t>
+            </w:r>
+          </w:p>
+        </w:tc>
+        <w:tc>
+          <w:tcPr>
+            <w:tcW w:type="dxa" w:w="2880"/>
+          </w:tcPr>
+          <w:p>
+            <w:r>
+              <w:t>Open Generated PO for CoCre8. The table should not contain unrelated order numbers/items from another customer, such as ORD29 with non-CoCre8 item names.</w:t>
+            </w:r>
+          </w:p>
+        </w:tc>
+        <w:tc>
+          <w:tcPr>
+            <w:tcW w:type="dxa" w:w="2880"/>
+          </w:tcPr>
+          <w:p>
+            <w:r>
+              <w:t>Fails immediately if another client's generated POs are visible.</w:t>
+            </w:r>
+          </w:p>
+        </w:tc>
+      </w:tr>
+      <w:tr>
+        <w:tc>
+          <w:tcPr>
+            <w:tcW w:type="dxa" w:w="2880"/>
+          </w:tcPr>
+          <w:p>
+            <w:r>
+              <w:t>Imported PO visibility decision</w:t>
+            </w:r>
+          </w:p>
+        </w:tc>
+        <w:tc>
+          <w:tcPr>
+            <w:tcW w:type="dxa" w:w="2880"/>
+          </w:tcPr>
+          <w:p>
+            <w:r>
+              <w:t>If imported PurchaseOrders.csv records are in scope for this page, uploaded CoCre8 PO numbers should be visible, for example 26PO000277 and 26PO000344 from the current upload.</w:t>
+            </w:r>
+          </w:p>
+        </w:tc>
+        <w:tc>
+          <w:tcPr>
+            <w:tcW w:type="dxa" w:w="2880"/>
+          </w:tcPr>
+          <w:p>
+            <w:r>
+              <w:t>Fails if imported records are expected but only unrelated generated records appear.</w:t>
+            </w:r>
+          </w:p>
+        </w:tc>
+      </w:tr>
+      <w:tr>
+        <w:tc>
+          <w:tcPr>
+            <w:tcW w:type="dxa" w:w="2880"/>
+          </w:tcPr>
+          <w:p>
+            <w:r>
+              <w:t>Generated request appears</w:t>
+            </w:r>
+          </w:p>
+        </w:tc>
+        <w:tc>
+          <w:tcPr>
+            <w:tcW w:type="dxa" w:w="2880"/>
+          </w:tcPr>
+          <w:p>
+            <w:r>
+              <w:t>Create a PO request from Suggested Purchase Orders. Confirm a new row appears on Generated PO with the selected item count and current date.</w:t>
+            </w:r>
+          </w:p>
+        </w:tc>
+        <w:tc>
+          <w:tcPr>
+            <w:tcW w:type="dxa" w:w="2880"/>
+          </w:tcPr>
+          <w:p>
+            <w:r>
+              <w:t>Fails if the generated request is not persisted or has the wrong selected lines.</w:t>
+            </w:r>
+          </w:p>
+        </w:tc>
+      </w:tr>
+      <w:tr>
+        <w:tc>
+          <w:tcPr>
+            <w:tcW w:type="dxa" w:w="2880"/>
+          </w:tcPr>
+          <w:p>
+            <w:r>
+              <w:t>View action</w:t>
+            </w:r>
+          </w:p>
+        </w:tc>
+        <w:tc>
+          <w:tcPr>
+            <w:tcW w:type="dxa" w:w="2880"/>
+          </w:tcPr>
+          <w:p>
+            <w:r>
+              <w:t>Click view on a generated PO. Confirm the details show every selected line with part number, quantity, cost, warehouse/location, and reason.</w:t>
+            </w:r>
+          </w:p>
+        </w:tc>
+        <w:tc>
+          <w:tcPr>
+            <w:tcW w:type="dxa" w:w="2880"/>
+          </w:tcPr>
+          <w:p>
+            <w:r>
+              <w:t>Fails if the detail view only shows a summary and loses line-level data.</w:t>
+            </w:r>
+          </w:p>
+        </w:tc>
+      </w:tr>
+      <w:tr>
+        <w:tc>
+          <w:tcPr>
+            <w:tcW w:type="dxa" w:w="2880"/>
+          </w:tcPr>
+          <w:p>
+            <w:r>
+              <w:t>Status lifecycle</w:t>
+            </w:r>
+          </w:p>
+        </w:tc>
+        <w:tc>
+          <w:tcPr>
+            <w:tcW w:type="dxa" w:w="2880"/>
+          </w:tcPr>
+          <w:p>
+            <w:r>
+              <w:t>Generated PO/request should have a clear status such as Draft, Sent, Approved, Accepted, Fulfilled, or Cancelled.</w:t>
+            </w:r>
+          </w:p>
+        </w:tc>
+        <w:tc>
+          <w:tcPr>
+            <w:tcW w:type="dxa" w:w="2880"/>
+          </w:tcPr>
+          <w:p>
+            <w:r>
+              <w:t>Fails if status cannot be understood or is mixed with SAP/import statuses without mapping.</w:t>
+            </w:r>
+          </w:p>
+        </w:tc>
+      </w:tr>
+    </w:tbl>
+    <w:p>
+      <w:pPr>
+        <w:pStyle w:val="Heading3"/>
+      </w:pPr>
+      <w:r>
+        <w:t>Open Questions</w:t>
+      </w:r>
+    </w:p>
+    <w:p>
+      <w:pPr>
+        <w:pStyle w:val="ListBullet"/>
+      </w:pPr>
+      <w:r>
+        <w:t>Should Generated PO show only records created inside Planning V2, or should it also include imported PurchaseOrders.csv history?</w:t>
+      </w:r>
+    </w:p>
+    <w:p>
+      <w:pPr>
+        <w:pStyle w:val="ListBullet"/>
+      </w:pPr>
+      <w:r>
+        <w:t>What exact formula should create Suggested Quantity: manual min shortage, calculated min shortage, forecast horizon demand, or a combination?</w:t>
+      </w:r>
+    </w:p>
+    <w:p>
+      <w:pPr>
+        <w:pStyle w:val="ListBullet"/>
+      </w:pPr>
+      <w:r>
+        <w:t>Should suggested orders be for the primary part, the cheapest valid alternative, or the exact part that created the shortage?</w:t>
+      </w:r>
+    </w:p>
+    <w:p>
+      <w:pPr>
+        <w:pStyle w:val="ListBullet"/>
+      </w:pPr>
+      <w:r>
+        <w:t>What statuses should be used for CoCre8 PO request lifecycle before a real CoCre8 PO number exists?</w:t>
+      </w:r>
+    </w:p>
+    <w:p>
+      <w:pPr>
+        <w:pStyle w:val="Heading3"/>
+      </w:pPr>
+      <w:r>
+        <w:t>MVP Decision</w:t>
+      </w:r>
+    </w:p>
+    <w:p>
+      <w:r>
+        <w:t>For CoCre8 MVP, Suggested Purchase Orders should at minimum produce shortage-based suggestions from stock, inbound, allocated, cost, and manual/calculated mins. Create Purchase Orders can generate a structured email or internal request rather than a live SAP or Fujitsu order. Generated Purchase Orders must be tenant-isolated and must not display another customer's data.</w:t>
       </w:r>
     </w:p>
     <w:sectPr>

</xml_diff>

<commit_message>
Add item master acceptance criteria
</commit_message>
<xml_diff>
--- a/Acceptance Criteria and Unit Tests - updated.docx
+++ b/Acceptance Criteria and Unit Tests - updated.docx
@@ -4318,6 +4318,498 @@
     <w:p>
       <w:r>
         <w:t>For CoCre8 MVP, Suggested Purchase Orders should at minimum produce shortage-based suggestions from stock, inbound, allocated, cost, and manual/calculated mins. Create Purchase Orders can generate a structured email or internal request rather than a live SAP or Fujitsu order. Generated Purchase Orders must be tenant-isolated and must not display another customer's data.</w:t>
+      </w:r>
+    </w:p>
+    <w:p>
+      <w:r>
+        <w:br w:type="page"/>
+      </w:r>
+    </w:p>
+    <w:p>
+      <w:pPr>
+        <w:pStyle w:val="Heading2"/>
+      </w:pPr>
+      <w:r>
+        <w:t>Item Master</w:t>
+      </w:r>
+    </w:p>
+    <w:p>
+      <w:pPr>
+        <w:pStyle w:val="Heading3"/>
+      </w:pPr>
+      <w:r>
+        <w:t>Goal</w:t>
+      </w:r>
+    </w:p>
+    <w:p>
+      <w:r>
+        <w:t>The Item Master page should show the uploaded parts as a tree grouped by SPL Master, warehouse/location, and actual part number. For CoCre8 the page is mainly a browse and verification screen: it does not need deep editing for MVP, but the master/warehouse/part grouping and stock totals must reconcile exactly to the uploaded stock data.</w:t>
+      </w:r>
+    </w:p>
+    <w:p>
+      <w:pPr>
+        <w:pStyle w:val="Heading3"/>
+      </w:pPr>
+      <w:r>
+        <w:t>Acceptance Criteria</w:t>
+      </w:r>
+    </w:p>
+    <w:p>
+      <w:pPr>
+        <w:pStyle w:val="ListBullet"/>
+      </w:pPr>
+      <w:r>
+        <w:t>The top-level row should be the SPL Master where one exists. Parts without an SPL Master may appear as their own part-level group.</w:t>
+      </w:r>
+    </w:p>
+    <w:p>
+      <w:pPr>
+        <w:pStyle w:val="ListBullet"/>
+      </w:pPr>
+      <w:r>
+        <w:t>The primary part number and description shown for a master should come from Parts.csv, using the primary part/main alternative mapping.</w:t>
+      </w:r>
+    </w:p>
+    <w:p>
+      <w:pPr>
+        <w:pStyle w:val="ListBullet"/>
+      </w:pPr>
+      <w:r>
+        <w:t>Expanding a master should show warehouse/location rows for stock held under that master.</w:t>
+      </w:r>
+    </w:p>
+    <w:p>
+      <w:pPr>
+        <w:pStyle w:val="ListBullet"/>
+      </w:pPr>
+      <w:r>
+        <w:t>Expanding a warehouse should show the actual part numbers held in that warehouse.</w:t>
+      </w:r>
+    </w:p>
+    <w:p>
+      <w:pPr>
+        <w:pStyle w:val="ListBullet"/>
+      </w:pPr>
+      <w:r>
+        <w:t>Parent stock totals must equal the sum of their visible child rows. The SPL Master stock total must equal the sum of quantityOnHand for all parts mapped to that SPL Master, after applying the same tenant and filter rules.</w:t>
+      </w:r>
+    </w:p>
+    <w:p>
+      <w:pPr>
+        <w:pStyle w:val="ListBullet"/>
+      </w:pPr>
+      <w:r>
+        <w:t>Warehouse-level stock must equal the sum of quantityOnHand for that master in that warehouse.</w:t>
+      </w:r>
+    </w:p>
+    <w:p>
+      <w:pPr>
+        <w:pStyle w:val="ListBullet"/>
+      </w:pPr>
+      <w:r>
+        <w:t>Part-level stock must equal WarehouseStockOnHand.quantityOnHand for that part and warehouse.</w:t>
+      </w:r>
+    </w:p>
+    <w:p>
+      <w:pPr>
+        <w:pStyle w:val="ListBullet"/>
+      </w:pPr>
+      <w:r>
+        <w:t>The page must not use usage quantity, allocated quantity, inbound quantity, uniqueId, cost, or row counts as stock on hand.</w:t>
+      </w:r>
+    </w:p>
+    <w:p>
+      <w:pPr>
+        <w:pStyle w:val="ListBullet"/>
+      </w:pPr>
+      <w:r>
+        <w:t>Search should work by SPL Master, primary part, actual part number, and description.</w:t>
+      </w:r>
+    </w:p>
+    <w:p>
+      <w:pPr>
+        <w:pStyle w:val="ListBullet"/>
+      </w:pPr>
+      <w:r>
+        <w:t>The page should not show parts or stock from another customer tenant.</w:t>
+      </w:r>
+    </w:p>
+    <w:p>
+      <w:pPr>
+        <w:pStyle w:val="ListBullet"/>
+      </w:pPr>
+      <w:r>
+        <w:t>If virtual/fault/quarantine warehouses are included, they should be visibly distinguishable from fulfilment stock or filterable out.</w:t>
+      </w:r>
+    </w:p>
+    <w:p>
+      <w:pPr>
+        <w:pStyle w:val="Heading3"/>
+      </w:pPr>
+      <w:r>
+        <w:t>Known Data Fixtures for Tests</w:t>
+      </w:r>
+    </w:p>
+    <w:p>
+      <w:pPr>
+        <w:pStyle w:val="ListBullet"/>
+      </w:pPr>
+      <w:r>
+        <w:t>Part 38061313 maps to SPL8006854 and has description Mobo RX2540 M4.</w:t>
+      </w:r>
+    </w:p>
+    <w:p>
+      <w:pPr>
+        <w:pStyle w:val="ListBullet"/>
+      </w:pPr>
+      <w:r>
+        <w:t>WarehouseStockOnHand shows part 38061313 quantityOnHand totals: FUJ CT 2, FUJITSU 4, FUJMIW-J 1, FUJMSM C 1, FUJMSVCJ 1, SCRPFUJ 1. Total part stock is 10.</w:t>
+      </w:r>
+    </w:p>
+    <w:p>
+      <w:pPr>
+        <w:pStyle w:val="ListBullet"/>
+      </w:pPr>
+      <w:r>
+        <w:t>SPL8006854 has four mapped parts in Parts.csv: 38058909, 38059355, 38060372, and 38061313. Total quantityOnHand across those parts is 11.</w:t>
+      </w:r>
+    </w:p>
+    <w:p>
+      <w:pPr>
+        <w:pStyle w:val="ListBullet"/>
+      </w:pPr>
+      <w:r>
+        <w:t>The screenshot showing SPL8006854 / primary part 38061313 with stock 160 does not reconcile to the current uploaded WarehouseStockOnHand data and should fail.</w:t>
+      </w:r>
+    </w:p>
+    <w:p>
+      <w:pPr>
+        <w:pStyle w:val="ListBullet"/>
+      </w:pPr>
+      <w:r>
+        <w:t>SPL8005748 has five mapped parts and current uploaded total quantityOnHand 9, not 168.</w:t>
+      </w:r>
+    </w:p>
+    <w:p>
+      <w:pPr>
+        <w:pStyle w:val="Heading3"/>
+      </w:pPr>
+      <w:r>
+        <w:t>Test Cases</w:t>
+      </w:r>
+    </w:p>
+    <w:tbl>
+      <w:tblPr>
+        <w:tblStyle w:val="TableGrid"/>
+        <w:tblW w:type="auto" w:w="0"/>
+        <w:jc w:val="center"/>
+        <w:tblLook w:firstColumn="1" w:firstRow="1" w:lastColumn="0" w:lastRow="0" w:noHBand="0" w:noVBand="1" w:val="04A0"/>
+      </w:tblPr>
+      <w:tblGrid>
+        <w:gridCol w:w="2880"/>
+        <w:gridCol w:w="2880"/>
+        <w:gridCol w:w="2880"/>
+      </w:tblGrid>
+      <w:tr>
+        <w:tc>
+          <w:tcPr>
+            <w:tcW w:type="dxa" w:w="2880"/>
+          </w:tcPr>
+          <w:p>
+            <w:r>
+              <w:t>Scenario</w:t>
+            </w:r>
+          </w:p>
+        </w:tc>
+        <w:tc>
+          <w:tcPr>
+            <w:tcW w:type="dxa" w:w="2880"/>
+          </w:tcPr>
+          <w:p>
+            <w:r>
+              <w:t>Expected Result</w:t>
+            </w:r>
+          </w:p>
+        </w:tc>
+        <w:tc>
+          <w:tcPr>
+            <w:tcW w:type="dxa" w:w="2880"/>
+          </w:tcPr>
+          <w:p>
+            <w:r>
+              <w:t>Pass / Fail Signal</w:t>
+            </w:r>
+          </w:p>
+        </w:tc>
+      </w:tr>
+      <w:tr>
+        <w:tc>
+          <w:tcPr>
+            <w:tcW w:type="dxa" w:w="2880"/>
+          </w:tcPr>
+          <w:p>
+            <w:r>
+              <w:t>Master stock reconciliation</w:t>
+            </w:r>
+          </w:p>
+        </w:tc>
+        <w:tc>
+          <w:tcPr>
+            <w:tcW w:type="dxa" w:w="2880"/>
+          </w:tcPr>
+          <w:p>
+            <w:r>
+              <w:t>Search for SPL8006854. The master stock total should equal 11 using the current uploaded stock file.</w:t>
+            </w:r>
+          </w:p>
+        </w:tc>
+        <w:tc>
+          <w:tcPr>
+            <w:tcW w:type="dxa" w:w="2880"/>
+          </w:tcPr>
+          <w:p>
+            <w:r>
+              <w:t>Fails if it shows 160 or any value that does not equal the sum of mapped part quantityOnHand.</w:t>
+            </w:r>
+          </w:p>
+        </w:tc>
+      </w:tr>
+      <w:tr>
+        <w:tc>
+          <w:tcPr>
+            <w:tcW w:type="dxa" w:w="2880"/>
+          </w:tcPr>
+          <w:p>
+            <w:r>
+              <w:t>Part stock reconciliation</w:t>
+            </w:r>
+          </w:p>
+        </w:tc>
+        <w:tc>
+          <w:tcPr>
+            <w:tcW w:type="dxa" w:w="2880"/>
+          </w:tcPr>
+          <w:p>
+            <w:r>
+              <w:t>Expand SPL8006854 and find part 38061313. The total stock for that actual part across all warehouses should equal 10.</w:t>
+            </w:r>
+          </w:p>
+        </w:tc>
+        <w:tc>
+          <w:tcPr>
+            <w:tcW w:type="dxa" w:w="2880"/>
+          </w:tcPr>
+          <w:p>
+            <w:r>
+              <w:t>Fails if the part-level total uses master total, usage total, or another calculated value.</w:t>
+            </w:r>
+          </w:p>
+        </w:tc>
+      </w:tr>
+      <w:tr>
+        <w:tc>
+          <w:tcPr>
+            <w:tcW w:type="dxa" w:w="2880"/>
+          </w:tcPr>
+          <w:p>
+            <w:r>
+              <w:t>Warehouse child sum</w:t>
+            </w:r>
+          </w:p>
+        </w:tc>
+        <w:tc>
+          <w:tcPr>
+            <w:tcW w:type="dxa" w:w="2880"/>
+          </w:tcPr>
+          <w:p>
+            <w:r>
+              <w:t>Under SPL8006854, FUJITSU should show 4 units for part 38061313 plus any other mapped alternatives present in FUJITSU.</w:t>
+            </w:r>
+          </w:p>
+        </w:tc>
+        <w:tc>
+          <w:tcPr>
+            <w:tcW w:type="dxa" w:w="2880"/>
+          </w:tcPr>
+          <w:p>
+            <w:r>
+              <w:t>Fails if the warehouse total does not equal the sum of visible child parts.</w:t>
+            </w:r>
+          </w:p>
+        </w:tc>
+      </w:tr>
+      <w:tr>
+        <w:tc>
+          <w:tcPr>
+            <w:tcW w:type="dxa" w:w="2880"/>
+          </w:tcPr>
+          <w:p>
+            <w:r>
+              <w:t>Expanded tree consistency</w:t>
+            </w:r>
+          </w:p>
+        </w:tc>
+        <w:tc>
+          <w:tcPr>
+            <w:tcW w:type="dxa" w:w="2880"/>
+          </w:tcPr>
+          <w:p>
+            <w:r>
+              <w:t>For any expanded master, parent total = sum of warehouse rows, and each warehouse row = sum of part rows.</w:t>
+            </w:r>
+          </w:p>
+        </w:tc>
+        <w:tc>
+          <w:tcPr>
+            <w:tcW w:type="dxa" w:w="2880"/>
+          </w:tcPr>
+          <w:p>
+            <w:r>
+              <w:t>Fails if parent/child totals do not reconcile.</w:t>
+            </w:r>
+          </w:p>
+        </w:tc>
+      </w:tr>
+      <w:tr>
+        <w:tc>
+          <w:tcPr>
+            <w:tcW w:type="dxa" w:w="2880"/>
+          </w:tcPr>
+          <w:p>
+            <w:r>
+              <w:t>Search by actual part</w:t>
+            </w:r>
+          </w:p>
+        </w:tc>
+        <w:tc>
+          <w:tcPr>
+            <w:tcW w:type="dxa" w:w="2880"/>
+          </w:tcPr>
+          <w:p>
+            <w:r>
+              <w:t>Search for 38061313. The page should return SPL8006854 and show 38061313 as the primary/actual part.</w:t>
+            </w:r>
+          </w:p>
+        </w:tc>
+        <w:tc>
+          <w:tcPr>
+            <w:tcW w:type="dxa" w:w="2880"/>
+          </w:tcPr>
+          <w:p>
+            <w:r>
+              <w:t>Fails if search only works by SPL Master and cannot find actual part numbers.</w:t>
+            </w:r>
+          </w:p>
+        </w:tc>
+      </w:tr>
+      <w:tr>
+        <w:tc>
+          <w:tcPr>
+            <w:tcW w:type="dxa" w:w="2880"/>
+          </w:tcPr>
+          <w:p>
+            <w:r>
+              <w:t>Tenant isolation</w:t>
+            </w:r>
+          </w:p>
+        </w:tc>
+        <w:tc>
+          <w:tcPr>
+            <w:tcW w:type="dxa" w:w="2880"/>
+          </w:tcPr>
+          <w:p>
+            <w:r>
+              <w:t>Search or browse should not show non-CoCre8 items or warehouses created from another customer dataset.</w:t>
+            </w:r>
+          </w:p>
+        </w:tc>
+        <w:tc>
+          <w:tcPr>
+            <w:tcW w:type="dxa" w:w="2880"/>
+          </w:tcPr>
+          <w:p>
+            <w:r>
+              <w:t>Fails if unrelated customer parts appear in the CoCre8 Item Master.</w:t>
+            </w:r>
+          </w:p>
+        </w:tc>
+      </w:tr>
+      <w:tr>
+        <w:tc>
+          <w:tcPr>
+            <w:tcW w:type="dxa" w:w="2880"/>
+          </w:tcPr>
+          <w:p>
+            <w:r>
+              <w:t>Virtual stock handling</w:t>
+            </w:r>
+          </w:p>
+        </w:tc>
+        <w:tc>
+          <w:tcPr>
+            <w:tcW w:type="dxa" w:w="2880"/>
+          </w:tcPr>
+          <w:p>
+            <w:r>
+              <w:t>If SCRPFUJ, FUJFAULT, QURN, or similar virtual/fault warehouses appear, they should be identifiable and should not be silently counted as available fulfilment stock elsewhere.</w:t>
+            </w:r>
+          </w:p>
+        </w:tc>
+        <w:tc>
+          <w:tcPr>
+            <w:tcW w:type="dxa" w:w="2880"/>
+          </w:tcPr>
+          <w:p>
+            <w:r>
+              <w:t>Fails if virtual stock is mixed into fulfilment totals without a clear label or filter.</w:t>
+            </w:r>
+          </w:p>
+        </w:tc>
+      </w:tr>
+    </w:tbl>
+    <w:p>
+      <w:pPr>
+        <w:pStyle w:val="Heading3"/>
+      </w:pPr>
+      <w:r>
+        <w:t>Open Questions</w:t>
+      </w:r>
+    </w:p>
+    <w:p>
+      <w:pPr>
+        <w:pStyle w:val="ListBullet"/>
+      </w:pPr>
+      <w:r>
+        <w:t>Should the top-level stock total include all warehouses, or only active/replenishable fulfilment warehouses?</w:t>
+      </w:r>
+    </w:p>
+    <w:p>
+      <w:pPr>
+        <w:pStyle w:val="ListBullet"/>
+      </w:pPr>
+      <w:r>
+        <w:t>Should virtual/fault/quarantine stock be shown in the tree but excluded from stock available for planning?</w:t>
+      </w:r>
+    </w:p>
+    <w:p>
+      <w:pPr>
+        <w:pStyle w:val="ListBullet"/>
+      </w:pPr>
+      <w:r>
+        <w:t>Should the page show inbound and allocated quantities as separate columns so stock differences can be explained?</w:t>
+      </w:r>
+    </w:p>
+    <w:p>
+      <w:pPr>
+        <w:pStyle w:val="Heading3"/>
+      </w:pPr>
+      <w:r>
+        <w:t>MVP Decision</w:t>
+      </w:r>
+    </w:p>
+    <w:p>
+      <w:r>
+        <w:t>For MVP, the Item Master page is acceptable if it browses the correct CoCre8 part/master/warehouse tree and every stock count reconciles to WarehouseStockOnHand.quantityOnHand. The current screenshot values such as 160 for SPL8006854 should be treated as a calculation or data-binding defect until proven otherwise.</w:t>
       </w:r>
     </w:p>
     <w:sectPr>

</xml_diff>

<commit_message>
Add user management acceptance criteria
</commit_message>
<xml_diff>
--- a/Acceptance Criteria and Unit Tests - updated.docx
+++ b/Acceptance Criteria and Unit Tests - updated.docx
@@ -136,7 +136,6 @@
       </w:r>
     </w:p>
     <w:p>
-      <w:pPr/>
       <w:r>
         <w:t>Reference check for FUJITSU-only actual usage from live SAP DNs, 2026-01-01 to 2026-06-18:</w:t>
       </w:r>
@@ -947,7 +946,6 @@
           </w:tcPr>
           <w:p>
             <w:r>
-              <w:lastRenderedPageBreak/>
               <w:t>34076231</w:t>
             </w:r>
           </w:p>
@@ -1031,6 +1029,7 @@
         <w:pStyle w:val="Heading4"/>
       </w:pPr>
       <w:r>
+        <w:lastRenderedPageBreak/>
         <w:t>Test Cases</w:t>
       </w:r>
     </w:p>
@@ -1175,23 +1174,23 @@
         <w:pStyle w:val="ListNumber"/>
       </w:pPr>
       <w:r>
+        <w:t>FUJ CT/Cape Town grouping: select FUJ CT or CPT and assert the treemap includes FUJ CT plus expected same-address CT warehouses with stock, and excludes FUJITSU/JHB warehouses.</w:t>
+      </w:r>
+    </w:p>
+    <w:p>
+      <w:pPr>
+        <w:pStyle w:val="ListNumber"/>
+      </w:pPr>
+      <w:r>
+        <w:t>Excluded warehouse check: assert no warehouse code beginning CHL and no MXT warehouse appears in the treemap or dropdown.</w:t>
+      </w:r>
+    </w:p>
+    <w:p>
+      <w:pPr>
+        <w:pStyle w:val="ListNumber"/>
+      </w:pPr>
+      <w:r>
         <w:lastRenderedPageBreak/>
-        <w:t>FUJ CT/Cape Town grouping: select FUJ CT or CPT and assert the treemap includes FUJ CT plus expected same-address CT warehouses with stock, and excludes FUJITSU/JHB warehouses.</w:t>
-      </w:r>
-    </w:p>
-    <w:p>
-      <w:pPr>
-        <w:pStyle w:val="ListNumber"/>
-      </w:pPr>
-      <w:r>
-        <w:t>Excluded warehouse check: assert no warehouse code beginning CHL and no MXT warehouse appears in the treemap or dropdown.</w:t>
-      </w:r>
-    </w:p>
-    <w:p>
-      <w:pPr>
-        <w:pStyle w:val="ListNumber"/>
-      </w:pPr>
-      <w:r>
         <w:t>Reconciliation: for any selected location/pool, sum the tile values and compare to WarehouseStockOnHand.quantityOnHand for the included warehouse codes.</w:t>
       </w:r>
     </w:p>
@@ -2737,6 +2736,7 @@
         <w:pStyle w:val="Heading2"/>
       </w:pPr>
       <w:r>
+        <w:lastRenderedPageBreak/>
         <w:t>SLA's at Risk</w:t>
       </w:r>
     </w:p>
@@ -2902,6 +2902,7 @@
         <w:pStyle w:val="ListBullet"/>
       </w:pPr>
       <w:r>
+        <w:lastRenderedPageBreak/>
         <w:t>Export should contain the same rows and values shown on screen.</w:t>
       </w:r>
     </w:p>
@@ -3048,6 +3049,7 @@
         <w:pStyle w:val="Heading2"/>
       </w:pPr>
       <w:r>
+        <w:lastRenderedPageBreak/>
         <w:t>What-if Analysis</w:t>
       </w:r>
     </w:p>
@@ -3194,6 +3196,7 @@
         <w:pStyle w:val="ListBullet"/>
       </w:pPr>
       <w:r>
+        <w:lastRenderedPageBreak/>
         <w:t>If a question asks for a recommended order quantity, the answer should separate factual inputs from recommendation logic: expected demand, current stock, inbound stock, allocated stock, manual min/max, lead time, and any assumptions.</w:t>
       </w:r>
     </w:p>
@@ -3272,9 +3275,501 @@
     <w:tbl>
       <w:tblPr>
         <w:tblStyle w:val="TableGrid"/>
-        <w:tblW w:type="auto" w:w="0"/>
+        <w:tblW w:w="0" w:type="auto"/>
         <w:jc w:val="center"/>
-        <w:tblLook w:firstColumn="1" w:firstRow="1" w:lastColumn="0" w:lastRow="0" w:noHBand="0" w:noVBand="1" w:val="04A0"/>
+        <w:tblLook w:val="04A0" w:firstRow="1" w:lastRow="0" w:firstColumn="1" w:lastColumn="0" w:noHBand="0" w:noVBand="1"/>
+      </w:tblPr>
+      <w:tblGrid>
+        <w:gridCol w:w="2569"/>
+        <w:gridCol w:w="3630"/>
+        <w:gridCol w:w="2657"/>
+      </w:tblGrid>
+      <w:tr>
+        <w:trPr>
+          <w:jc w:val="center"/>
+        </w:trPr>
+        <w:tc>
+          <w:tcPr>
+            <w:tcW w:w="2880" w:type="dxa"/>
+          </w:tcPr>
+          <w:p>
+            <w:r>
+              <w:t>Question</w:t>
+            </w:r>
+          </w:p>
+        </w:tc>
+        <w:tc>
+          <w:tcPr>
+            <w:tcW w:w="2880" w:type="dxa"/>
+          </w:tcPr>
+          <w:p>
+            <w:r>
+              <w:t>Expected Behaviour</w:t>
+            </w:r>
+          </w:p>
+        </w:tc>
+        <w:tc>
+          <w:tcPr>
+            <w:tcW w:w="2880" w:type="dxa"/>
+          </w:tcPr>
+          <w:p>
+            <w:r>
+              <w:t>Pass / Fail Signal</w:t>
+            </w:r>
+          </w:p>
+        </w:tc>
+      </w:tr>
+      <w:tr>
+        <w:trPr>
+          <w:jc w:val="center"/>
+        </w:trPr>
+        <w:tc>
+          <w:tcPr>
+            <w:tcW w:w="2880" w:type="dxa"/>
+          </w:tcPr>
+          <w:p>
+            <w:r>
+              <w:t>Which part has the highest forecast demand next month?</w:t>
+            </w:r>
+          </w:p>
+        </w:tc>
+        <w:tc>
+          <w:tcPr>
+            <w:tcW w:w="2880" w:type="dxa"/>
+          </w:tcPr>
+          <w:p>
+            <w:r>
+              <w:t>Use forecast output at SPL Master/location level if available. If forecast output is not available to the chat layer, say that forecast output is missing but do not say part-level data is missing.</w:t>
+            </w:r>
+          </w:p>
+        </w:tc>
+        <w:tc>
+          <w:tcPr>
+            <w:tcW w:w="2880" w:type="dxa"/>
+          </w:tcPr>
+          <w:p>
+            <w:r>
+              <w:t>Fails if it answers only with aggregate counts or says there is no part-level demand data.</w:t>
+            </w:r>
+          </w:p>
+        </w:tc>
+      </w:tr>
+      <w:tr>
+        <w:trPr>
+          <w:jc w:val="center"/>
+        </w:trPr>
+        <w:tc>
+          <w:tcPr>
+            <w:tcW w:w="2880" w:type="dxa"/>
+          </w:tcPr>
+          <w:p>
+            <w:r>
+              <w:t>Which part has the highest usage in the last 12 months?</w:t>
+            </w:r>
+          </w:p>
+        </w:tc>
+        <w:tc>
+          <w:tcPr>
+            <w:tcW w:w="2880" w:type="dxa"/>
+          </w:tcPr>
+          <w:p>
+            <w:r>
+              <w:t>Return the highest-used part/SPL Master from PartsUsage, with quantity and date range. Current fixture: DB.VYQ11.002 has 88 units in the last 365 days; for CoCre8 main-stock-only questions use the relevant location filter.</w:t>
+            </w:r>
+          </w:p>
+        </w:tc>
+        <w:tc>
+          <w:tcPr>
+            <w:tcW w:w="2880" w:type="dxa"/>
+          </w:tcPr>
+          <w:p>
+            <w:r>
+              <w:t>Fails if it refuses despite PartsUsage containing part-level usage.</w:t>
+            </w:r>
+          </w:p>
+        </w:tc>
+      </w:tr>
+      <w:tr>
+        <w:trPr>
+          <w:jc w:val="center"/>
+        </w:trPr>
+        <w:tc>
+          <w:tcPr>
+            <w:tcW w:w="2880" w:type="dxa"/>
+          </w:tcPr>
+          <w:p>
+            <w:r>
+              <w:t>How many hard drives should we order for July?</w:t>
+            </w:r>
+          </w:p>
+        </w:tc>
+        <w:tc>
+          <w:tcPr>
+            <w:tcW w:w="2880" w:type="dxa"/>
+          </w:tcPr>
+          <w:p>
+            <w:r>
+              <w:t>Identify hard-drive parts using partType/productType/description, then show expected demand, current stock, inbound, allocated, and lead time. Current hard-drive fixture: SPL8005179 has 11 units used in the last 365 days.</w:t>
+            </w:r>
+          </w:p>
+        </w:tc>
+        <w:tc>
+          <w:tcPr>
+            <w:tcW w:w="2880" w:type="dxa"/>
+          </w:tcPr>
+          <w:p>
+            <w:r>
+              <w:t>Passes if it gives a cautious recommendation with inputs and assumptions; fails if it says no hard-drive usage data exists.</w:t>
+            </w:r>
+          </w:p>
+        </w:tc>
+      </w:tr>
+      <w:tr>
+        <w:trPr>
+          <w:jc w:val="center"/>
+        </w:trPr>
+        <w:tc>
+          <w:tcPr>
+            <w:tcW w:w="2880" w:type="dxa"/>
+          </w:tcPr>
+          <w:p>
+            <w:r>
+              <w:t>How much stock do we have for part 38063390?</w:t>
+            </w:r>
+          </w:p>
+        </w:tc>
+        <w:tc>
+          <w:tcPr>
+            <w:tcW w:w="2880" w:type="dxa"/>
+          </w:tcPr>
+          <w:p>
+            <w:r>
+              <w:t>Use WarehouseStockOnHand and answer by warehouse. Current fixture: FUJITSU has quantityOnHand 10, allocated 11, inbound 0.</w:t>
+            </w:r>
+          </w:p>
+        </w:tc>
+        <w:tc>
+          <w:tcPr>
+            <w:tcW w:w="2880" w:type="dxa"/>
+          </w:tcPr>
+          <w:p>
+            <w:r>
+              <w:t>Fails if the answer gives unexplained or different stock numbers.</w:t>
+            </w:r>
+          </w:p>
+        </w:tc>
+      </w:tr>
+      <w:tr>
+        <w:trPr>
+          <w:jc w:val="center"/>
+        </w:trPr>
+        <w:tc>
+          <w:tcPr>
+            <w:tcW w:w="2880" w:type="dxa"/>
+          </w:tcPr>
+          <w:p>
+            <w:r>
+              <w:lastRenderedPageBreak/>
+              <w:t>Show usage for SPL8005179 by location.</w:t>
+            </w:r>
+          </w:p>
+        </w:tc>
+        <w:tc>
+          <w:tcPr>
+            <w:tcW w:w="2880" w:type="dxa"/>
+          </w:tcPr>
+          <w:p>
+            <w:r>
+              <w:t>Group all alternative parts under SPL8005179 and show usage by warehouse/location. Current fixture includes 11 units in the last 365 days, mainly 38066705.</w:t>
+            </w:r>
+          </w:p>
+        </w:tc>
+        <w:tc>
+          <w:tcPr>
+            <w:tcW w:w="2880" w:type="dxa"/>
+          </w:tcPr>
+          <w:p>
+            <w:r>
+              <w:t>Fails if it treats only one part row as the whole SPL Master without explaining.</w:t>
+            </w:r>
+          </w:p>
+        </w:tc>
+      </w:tr>
+      <w:tr>
+        <w:trPr>
+          <w:jc w:val="center"/>
+        </w:trPr>
+        <w:tc>
+          <w:tcPr>
+            <w:tcW w:w="2880" w:type="dxa"/>
+          </w:tcPr>
+          <w:p>
+            <w:r>
+              <w:t>Can we fulfil one 38064009 call from Cape Town main stock?</w:t>
+            </w:r>
+          </w:p>
+        </w:tc>
+        <w:tc>
+          <w:tcPr>
+            <w:tcW w:w="2880" w:type="dxa"/>
+          </w:tcPr>
+          <w:p>
+            <w:r>
+              <w:t>Use FUJ CT and other allowed CPT main warehouses only. Current fixture shows FUJ CT has quantityOnHand 1 for 38064009.</w:t>
+            </w:r>
+          </w:p>
+        </w:tc>
+        <w:tc>
+          <w:tcPr>
+            <w:tcW w:w="2880" w:type="dxa"/>
+          </w:tcPr>
+          <w:p>
+            <w:r>
+              <w:t>Fails if it mixes unrelated customer/virtual warehouses without saying so.</w:t>
+            </w:r>
+          </w:p>
+        </w:tc>
+      </w:tr>
+    </w:tbl>
+    <w:p>
+      <w:pPr>
+        <w:pStyle w:val="Heading3"/>
+      </w:pPr>
+      <w:r>
+        <w:t>Open Questions</w:t>
+      </w:r>
+    </w:p>
+    <w:p>
+      <w:pPr>
+        <w:pStyle w:val="ListBullet"/>
+      </w:pPr>
+      <w:r>
+        <w:t>Does the chat service have direct access to generated forecast rows, or only to uploaded CSVs?</w:t>
+      </w:r>
+    </w:p>
+    <w:p>
+      <w:pPr>
+        <w:pStyle w:val="ListBullet"/>
+      </w:pPr>
+      <w:r>
+        <w:t>Should answers always prefer SPL Master level, or only when the question explicitly asks for master/alternate grouping?</w:t>
+      </w:r>
+    </w:p>
+    <w:p>
+      <w:pPr>
+        <w:pStyle w:val="ListBullet"/>
+      </w:pPr>
+      <w:r>
+        <w:t>What formula should be used when turning forecast demand into a recommended purchase quantity?</w:t>
+      </w:r>
+    </w:p>
+    <w:p>
+      <w:pPr>
+        <w:pStyle w:val="ListBullet"/>
+      </w:pPr>
+      <w:r>
+        <w:t>Should virtual/fault/quarantine warehouses be excluded from fulfilment answers by default?</w:t>
+      </w:r>
+    </w:p>
+    <w:p>
+      <w:pPr>
+        <w:pStyle w:val="Heading3"/>
+      </w:pPr>
+      <w:r>
+        <w:t>MVP Decision</w:t>
+      </w:r>
+    </w:p>
+    <w:p>
+      <w:r>
+        <w:t>For MVP, the What-if Analysis page should be accepted only if it can answer factual stock, usage, and forecast questions from uploaded data with traceable numbers. More advanced AI recommendations can come later, once the calculation rules and data access path are confirmed.</w:t>
+      </w:r>
+    </w:p>
+    <w:p>
+      <w:r>
+        <w:br w:type="page"/>
+      </w:r>
+    </w:p>
+    <w:p>
+      <w:pPr>
+        <w:pStyle w:val="Heading2"/>
+      </w:pPr>
+      <w:r>
+        <w:lastRenderedPageBreak/>
+        <w:t>Purchase Orders</w:t>
+      </w:r>
+    </w:p>
+    <w:p>
+      <w:pPr>
+        <w:pStyle w:val="Heading3"/>
+      </w:pPr>
+      <w:r>
+        <w:t>Goal</w:t>
+      </w:r>
+    </w:p>
+    <w:p>
+      <w:r>
+        <w:t>The Purchase Orders section should help the planner decide which parts need replenishment and then create a CoCre8 PO request. For CoCre8 MVP, the output does not need to create a live SAP PO or Fujitsu portal order. It is acceptable if it generates a structured email/request asking CoCre8 to raise or approve a purchase order for the selected parts.</w:t>
+      </w:r>
+    </w:p>
+    <w:p>
+      <w:pPr>
+        <w:pStyle w:val="Heading3"/>
+      </w:pPr>
+      <w:r>
+        <w:t>Sub-pages</w:t>
+      </w:r>
+    </w:p>
+    <w:p>
+      <w:pPr>
+        <w:pStyle w:val="ListBullet"/>
+      </w:pPr>
+      <w:r>
+        <w:t>Suggested Purchase Orders</w:t>
+      </w:r>
+    </w:p>
+    <w:p>
+      <w:pPr>
+        <w:pStyle w:val="ListBullet"/>
+      </w:pPr>
+      <w:r>
+        <w:t>Generated Purchase Orders</w:t>
+      </w:r>
+    </w:p>
+    <w:p>
+      <w:pPr>
+        <w:pStyle w:val="Heading3"/>
+      </w:pPr>
+      <w:r>
+        <w:t>Suggested Purchase Orders</w:t>
+      </w:r>
+    </w:p>
+    <w:p>
+      <w:pPr>
+        <w:pStyle w:val="Heading4"/>
+      </w:pPr>
+      <w:r>
+        <w:t>Acceptance Criteria</w:t>
+      </w:r>
+    </w:p>
+    <w:p>
+      <w:pPr>
+        <w:pStyle w:val="ListBullet"/>
+      </w:pPr>
+      <w:r>
+        <w:t>The page should show suggested replenishment rows when a part/SPL Master has a shortage against the agreed minimum stock, manual minimum, or forecast demand rule.</w:t>
+      </w:r>
+    </w:p>
+    <w:p>
+      <w:pPr>
+        <w:pStyle w:val="ListBullet"/>
+      </w:pPr>
+      <w:r>
+        <w:t>The page should not remain blank if uploaded stock, forecast, and cost data produce one or more positive suggested quantities.</w:t>
+      </w:r>
+    </w:p>
+    <w:p>
+      <w:pPr>
+        <w:pStyle w:val="ListBullet"/>
+      </w:pPr>
+      <w:r>
+        <w:t>The calculation should work at SPL Master level first, with the actual recommended purchase part shown clearly.</w:t>
+      </w:r>
+    </w:p>
+    <w:p>
+      <w:pPr>
+        <w:pStyle w:val="ListBullet"/>
+      </w:pPr>
+      <w:r>
+        <w:t>Available stock should be calculated as stock on hand plus inbound minus allocated, using WarehouseStockOnHand.quantityOnHand, quantityInbound, and quantityAllocated.</w:t>
+      </w:r>
+    </w:p>
+    <w:p>
+      <w:pPr>
+        <w:pStyle w:val="ListBullet"/>
+      </w:pPr>
+      <w:r>
+        <w:t>Suggested Quantity should be a positive whole number and should be traceable to the shortage or forecast calculation used.</w:t>
+      </w:r>
+    </w:p>
+    <w:p>
+      <w:pPr>
+        <w:pStyle w:val="ListBullet"/>
+      </w:pPr>
+      <w:r>
+        <w:t>No. of Days should have a documented meaning. If it means lead time, it should use Parts.purchaseLeadTimeDays. If it means days of cover, it should use expected daily usage.</w:t>
+      </w:r>
+    </w:p>
+    <w:p>
+      <w:pPr>
+        <w:pStyle w:val="ListBullet"/>
+      </w:pPr>
+      <w:r>
+        <w:t>Suggested order date should be the date the tool recommends ordering. For MVP this can default to today when stock is already short or forecast demand cannot be met.</w:t>
+      </w:r>
+    </w:p>
+    <w:p>
+      <w:pPr>
+        <w:pStyle w:val="ListBullet"/>
+      </w:pPr>
+      <w:r>
+        <w:t>Expected delivery date should be suggested order date plus purchase lead time days, unless a confirmed supplier ETA exists.</w:t>
+      </w:r>
+    </w:p>
+    <w:p>
+      <w:pPr>
+        <w:pStyle w:val="ListBullet"/>
+      </w:pPr>
+      <w:r>
+        <w:t>Last Cost should come from PartCost.cost or the latest confirmed CoCre8 cost evidence, not from unreliable SAP PO line cost values.</w:t>
+      </w:r>
+    </w:p>
+    <w:p>
+      <w:pPr>
+        <w:pStyle w:val="ListBullet"/>
+      </w:pPr>
+      <w:r>
+        <w:t>Estimated Total Cost should equal Suggested Quantity multiplied by Last Cost, with blank or warning state if no cost is available.</w:t>
+      </w:r>
+    </w:p>
+    <w:p>
+      <w:pPr>
+        <w:pStyle w:val="ListBullet"/>
+      </w:pPr>
+      <w:r>
+        <w:t>The user should be able to select one or more suggested rows and click Create Purchase Orders.</w:t>
+      </w:r>
+    </w:p>
+    <w:p>
+      <w:pPr>
+        <w:pStyle w:val="ListBullet"/>
+      </w:pPr>
+      <w:r>
+        <w:t>For CoCre8 MVP, Create Purchase Orders may generate a PO request email or request record rather than a live integrated purchase order.</w:t>
+      </w:r>
+    </w:p>
+    <w:p>
+      <w:pPr>
+        <w:pStyle w:val="ListBullet"/>
+      </w:pPr>
+      <w:r>
+        <w:lastRenderedPageBreak/>
+        <w:t>The page should explain why no rows are shown, for example no shortages, no min values, no forecast output, or missing calculation setup. It should not only show No Data Found when the calculation cannot run.</w:t>
+      </w:r>
+    </w:p>
+    <w:p>
+      <w:pPr>
+        <w:pStyle w:val="Heading4"/>
+      </w:pPr>
+      <w:r>
+        <w:t>Suggested PO Test Cases</w:t>
+      </w:r>
+    </w:p>
+    <w:tbl>
+      <w:tblPr>
+        <w:tblStyle w:val="TableGrid"/>
+        <w:tblW w:w="0" w:type="auto"/>
+        <w:jc w:val="center"/>
+        <w:tblLook w:val="04A0" w:firstRow="1" w:lastRow="0" w:firstColumn="1" w:lastColumn="0" w:noHBand="0" w:noVBand="1"/>
       </w:tblPr>
       <w:tblGrid>
         <w:gridCol w:w="2880"/>
@@ -3282,29 +3777,32 @@
         <w:gridCol w:w="2880"/>
       </w:tblGrid>
       <w:tr>
-        <w:tc>
-          <w:tcPr>
-            <w:tcW w:type="dxa" w:w="2880"/>
-          </w:tcPr>
-          <w:p>
-            <w:r>
-              <w:t>Question</w:t>
-            </w:r>
-          </w:p>
-        </w:tc>
-        <w:tc>
-          <w:tcPr>
-            <w:tcW w:type="dxa" w:w="2880"/>
-          </w:tcPr>
-          <w:p>
-            <w:r>
-              <w:t>Expected Behaviour</w:t>
-            </w:r>
-          </w:p>
-        </w:tc>
-        <w:tc>
-          <w:tcPr>
-            <w:tcW w:type="dxa" w:w="2880"/>
+        <w:trPr>
+          <w:jc w:val="center"/>
+        </w:trPr>
+        <w:tc>
+          <w:tcPr>
+            <w:tcW w:w="2880" w:type="dxa"/>
+          </w:tcPr>
+          <w:p>
+            <w:r>
+              <w:t>Scenario</w:t>
+            </w:r>
+          </w:p>
+        </w:tc>
+        <w:tc>
+          <w:tcPr>
+            <w:tcW w:w="2880" w:type="dxa"/>
+          </w:tcPr>
+          <w:p>
+            <w:r>
+              <w:t>Expected Result</w:t>
+            </w:r>
+          </w:p>
+        </w:tc>
+        <w:tc>
+          <w:tcPr>
+            <w:tcW w:w="2880" w:type="dxa"/>
           </w:tcPr>
           <w:p>
             <w:r>
@@ -3314,193 +3812,211 @@
         </w:tc>
       </w:tr>
       <w:tr>
-        <w:tc>
-          <w:tcPr>
-            <w:tcW w:type="dxa" w:w="2880"/>
-          </w:tcPr>
-          <w:p>
-            <w:r>
-              <w:t>Which part has the highest forecast demand next month?</w:t>
-            </w:r>
-          </w:p>
-        </w:tc>
-        <w:tc>
-          <w:tcPr>
-            <w:tcW w:type="dxa" w:w="2880"/>
-          </w:tcPr>
-          <w:p>
-            <w:r>
-              <w:t>Use forecast output at SPL Master/location level if available. If forecast output is not available to the chat layer, say that forecast output is missing but do not say part-level data is missing.</w:t>
-            </w:r>
-          </w:p>
-        </w:tc>
-        <w:tc>
-          <w:tcPr>
-            <w:tcW w:type="dxa" w:w="2880"/>
-          </w:tcPr>
-          <w:p>
-            <w:r>
-              <w:t>Fails if it answers only with aggregate counts or says there is no part-level demand data.</w:t>
+        <w:trPr>
+          <w:jc w:val="center"/>
+        </w:trPr>
+        <w:tc>
+          <w:tcPr>
+            <w:tcW w:w="2880" w:type="dxa"/>
+          </w:tcPr>
+          <w:p>
+            <w:r>
+              <w:t>Manual minimum creates shortage</w:t>
+            </w:r>
+          </w:p>
+        </w:tc>
+        <w:tc>
+          <w:tcPr>
+            <w:tcW w:w="2880" w:type="dxa"/>
+          </w:tcPr>
+          <w:p>
+            <w:r>
+              <w:t>Set a manual min above available stock for a known part/SPL Master/location. The row appears with Suggested Quantity equal to the shortage unless the documented formula says otherwise.</w:t>
+            </w:r>
+          </w:p>
+        </w:tc>
+        <w:tc>
+          <w:tcPr>
+            <w:tcW w:w="2880" w:type="dxa"/>
+          </w:tcPr>
+          <w:p>
+            <w:r>
+              <w:t>Fails if Suggested PO remains blank after forecast regeneration.</w:t>
             </w:r>
           </w:p>
         </w:tc>
       </w:tr>
       <w:tr>
-        <w:tc>
-          <w:tcPr>
-            <w:tcW w:type="dxa" w:w="2880"/>
-          </w:tcPr>
-          <w:p>
-            <w:r>
-              <w:t>Which part has the highest usage in the last 12 months?</w:t>
-            </w:r>
-          </w:p>
-        </w:tc>
-        <w:tc>
-          <w:tcPr>
-            <w:tcW w:type="dxa" w:w="2880"/>
-          </w:tcPr>
-          <w:p>
-            <w:r>
-              <w:t>Return the highest-used part/SPL Master from PartsUsage, with quantity and date range. Current fixture: DB.VYQ11.002 has 88 units in the last 365 days; for CoCre8 main-stock-only questions use the relevant location filter.</w:t>
-            </w:r>
-          </w:p>
-        </w:tc>
-        <w:tc>
-          <w:tcPr>
-            <w:tcW w:type="dxa" w:w="2880"/>
-          </w:tcPr>
-          <w:p>
-            <w:r>
-              <w:t>Fails if it refuses despite PartsUsage containing part-level usage.</w:t>
+        <w:trPr>
+          <w:jc w:val="center"/>
+        </w:trPr>
+        <w:tc>
+          <w:tcPr>
+            <w:tcW w:w="2880" w:type="dxa"/>
+          </w:tcPr>
+          <w:p>
+            <w:r>
+              <w:t>Allocated stock creates shortage</w:t>
+            </w:r>
+          </w:p>
+        </w:tc>
+        <w:tc>
+          <w:tcPr>
+            <w:tcW w:w="2880" w:type="dxa"/>
+          </w:tcPr>
+          <w:p>
+            <w:r>
+              <w:t>Use a row where allocated exceeds on-hand stock. Example fixture: part 38063390 in FUJITSU has quantityOnHand 10, quantityAllocated 11, quantityInbound 0, so available stock is -1 before any min/forecast rule.</w:t>
+            </w:r>
+          </w:p>
+        </w:tc>
+        <w:tc>
+          <w:tcPr>
+            <w:tcW w:w="2880" w:type="dxa"/>
+          </w:tcPr>
+          <w:p>
+            <w:r>
+              <w:t>Fails if allocated stock is ignored.</w:t>
             </w:r>
           </w:p>
         </w:tc>
       </w:tr>
       <w:tr>
-        <w:tc>
-          <w:tcPr>
-            <w:tcW w:type="dxa" w:w="2880"/>
-          </w:tcPr>
-          <w:p>
-            <w:r>
-              <w:t>How many hard drives should we order for July?</w:t>
-            </w:r>
-          </w:p>
-        </w:tc>
-        <w:tc>
-          <w:tcPr>
-            <w:tcW w:type="dxa" w:w="2880"/>
-          </w:tcPr>
-          <w:p>
-            <w:r>
-              <w:t>Identify hard-drive parts using partType/productType/description, then show expected demand, current stock, inbound, allocated, and lead time. Current hard-drive fixture: SPL8005179 has 11 units used in the last 365 days.</w:t>
-            </w:r>
-          </w:p>
-        </w:tc>
-        <w:tc>
-          <w:tcPr>
-            <w:tcW w:type="dxa" w:w="2880"/>
-          </w:tcPr>
-          <w:p>
-            <w:r>
-              <w:t>Passes if it gives a cautious recommendation with inputs and assumptions; fails if it says no hard-drive usage data exists.</w:t>
+        <w:trPr>
+          <w:jc w:val="center"/>
+        </w:trPr>
+        <w:tc>
+          <w:tcPr>
+            <w:tcW w:w="2880" w:type="dxa"/>
+          </w:tcPr>
+          <w:p>
+            <w:r>
+              <w:t>Inbound stock offsets shortage</w:t>
+            </w:r>
+          </w:p>
+        </w:tc>
+        <w:tc>
+          <w:tcPr>
+            <w:tcW w:w="2880" w:type="dxa"/>
+          </w:tcPr>
+          <w:p>
+            <w:r>
+              <w:t>For a part with inbound stock, confirm inbound reduces or removes the suggested quantity.</w:t>
+            </w:r>
+          </w:p>
+        </w:tc>
+        <w:tc>
+          <w:tcPr>
+            <w:tcW w:w="2880" w:type="dxa"/>
+          </w:tcPr>
+          <w:p>
+            <w:r>
+              <w:t>Fails if inbound is displayed but not included in the calculation.</w:t>
             </w:r>
           </w:p>
         </w:tc>
       </w:tr>
       <w:tr>
-        <w:tc>
-          <w:tcPr>
-            <w:tcW w:type="dxa" w:w="2880"/>
-          </w:tcPr>
-          <w:p>
-            <w:r>
-              <w:t>How much stock do we have for part 38063390?</w:t>
-            </w:r>
-          </w:p>
-        </w:tc>
-        <w:tc>
-          <w:tcPr>
-            <w:tcW w:type="dxa" w:w="2880"/>
-          </w:tcPr>
-          <w:p>
-            <w:r>
-              <w:t>Use WarehouseStockOnHand and answer by warehouse. Current fixture: FUJITSU has quantityOnHand 10, allocated 11, inbound 0.</w:t>
-            </w:r>
-          </w:p>
-        </w:tc>
-        <w:tc>
-          <w:tcPr>
-            <w:tcW w:type="dxa" w:w="2880"/>
-          </w:tcPr>
-          <w:p>
-            <w:r>
-              <w:t>Fails if the answer gives unexplained or different stock numbers.</w:t>
+        <w:trPr>
+          <w:jc w:val="center"/>
+        </w:trPr>
+        <w:tc>
+          <w:tcPr>
+            <w:tcW w:w="2880" w:type="dxa"/>
+          </w:tcPr>
+          <w:p>
+            <w:r>
+              <w:t>Cost calculation</w:t>
+            </w:r>
+          </w:p>
+        </w:tc>
+        <w:tc>
+          <w:tcPr>
+            <w:tcW w:w="2880" w:type="dxa"/>
+          </w:tcPr>
+          <w:p>
+            <w:r>
+              <w:t>A suggested row with Last Cost populated should show Estimated Total Cost = Suggested Quantity x Last Cost.</w:t>
+            </w:r>
+          </w:p>
+        </w:tc>
+        <w:tc>
+          <w:tcPr>
+            <w:tcW w:w="2880" w:type="dxa"/>
+          </w:tcPr>
+          <w:p>
+            <w:r>
+              <w:t>Fails if total cost does not reconcile to the displayed values.</w:t>
             </w:r>
           </w:p>
         </w:tc>
       </w:tr>
       <w:tr>
-        <w:tc>
-          <w:tcPr>
-            <w:tcW w:type="dxa" w:w="2880"/>
-          </w:tcPr>
-          <w:p>
-            <w:r>
-              <w:t>Show usage for SPL8005179 by location.</w:t>
-            </w:r>
-          </w:p>
-        </w:tc>
-        <w:tc>
-          <w:tcPr>
-            <w:tcW w:type="dxa" w:w="2880"/>
-          </w:tcPr>
-          <w:p>
-            <w:r>
-              <w:t>Group all alternative parts under SPL8005179 and show usage by warehouse/location. Current fixture includes 11 units in the last 365 days, mainly 38066705.</w:t>
-            </w:r>
-          </w:p>
-        </w:tc>
-        <w:tc>
-          <w:tcPr>
-            <w:tcW w:type="dxa" w:w="2880"/>
-          </w:tcPr>
-          <w:p>
-            <w:r>
-              <w:t>Fails if it treats only one part row as the whole SPL Master without explaining.</w:t>
+        <w:trPr>
+          <w:jc w:val="center"/>
+        </w:trPr>
+        <w:tc>
+          <w:tcPr>
+            <w:tcW w:w="2880" w:type="dxa"/>
+          </w:tcPr>
+          <w:p>
+            <w:r>
+              <w:t>Create PO request</w:t>
+            </w:r>
+          </w:p>
+        </w:tc>
+        <w:tc>
+          <w:tcPr>
+            <w:tcW w:w="2880" w:type="dxa"/>
+          </w:tcPr>
+          <w:p>
+            <w:r>
+              <w:t>Select one or more rows and click Create Purchase Orders. A generated CoCre8 PO request/email should include part, SPL Master if available, quantity, location/warehouse, cost, and reason.</w:t>
+            </w:r>
+          </w:p>
+        </w:tc>
+        <w:tc>
+          <w:tcPr>
+            <w:tcW w:w="2880" w:type="dxa"/>
+          </w:tcPr>
+          <w:p>
+            <w:r>
+              <w:t>Fails if the button does nothing or creates a request with missing selected lines.</w:t>
             </w:r>
           </w:p>
         </w:tc>
       </w:tr>
       <w:tr>
-        <w:tc>
-          <w:tcPr>
-            <w:tcW w:type="dxa" w:w="2880"/>
-          </w:tcPr>
-          <w:p>
-            <w:r>
-              <w:t>Can we fulfil one 38064009 call from Cape Town main stock?</w:t>
-            </w:r>
-          </w:p>
-        </w:tc>
-        <w:tc>
-          <w:tcPr>
-            <w:tcW w:type="dxa" w:w="2880"/>
-          </w:tcPr>
-          <w:p>
-            <w:r>
-              <w:t>Use FUJ CT and other allowed CPT main warehouses only. Current fixture shows FUJ CT has quantityOnHand 1 for 38064009.</w:t>
-            </w:r>
-          </w:p>
-        </w:tc>
-        <w:tc>
-          <w:tcPr>
-            <w:tcW w:type="dxa" w:w="2880"/>
-          </w:tcPr>
-          <w:p>
-            <w:r>
-              <w:t>Fails if it mixes unrelated customer/virtual warehouses without saying so.</w:t>
+        <w:trPr>
+          <w:jc w:val="center"/>
+        </w:trPr>
+        <w:tc>
+          <w:tcPr>
+            <w:tcW w:w="2880" w:type="dxa"/>
+          </w:tcPr>
+          <w:p>
+            <w:r>
+              <w:t>No suggestion explanation</w:t>
+            </w:r>
+          </w:p>
+        </w:tc>
+        <w:tc>
+          <w:tcPr>
+            <w:tcW w:w="2880" w:type="dxa"/>
+          </w:tcPr>
+          <w:p>
+            <w:r>
+              <w:t>If there are genuinely no suggested rows, the page should display or make available the reason: no shortages, no mins, no forecast demand, or calculation not configured.</w:t>
+            </w:r>
+          </w:p>
+        </w:tc>
+        <w:tc>
+          <w:tcPr>
+            <w:tcW w:w="2880" w:type="dxa"/>
+          </w:tcPr>
+          <w:p>
+            <w:r>
+              <w:t>Fails if it only says No Data Found without diagnostic reason.</w:t>
             </w:r>
           </w:p>
         </w:tc>
@@ -3511,7 +4027,16 @@
         <w:pStyle w:val="Heading3"/>
       </w:pPr>
       <w:r>
-        <w:t>Open Questions</w:t>
+        <w:lastRenderedPageBreak/>
+        <w:t>Generated Purchase Orders</w:t>
+      </w:r>
+    </w:p>
+    <w:p>
+      <w:pPr>
+        <w:pStyle w:val="Heading4"/>
+      </w:pPr>
+      <w:r>
+        <w:t>Acceptance Criteria</w:t>
       </w:r>
     </w:p>
     <w:p>
@@ -3519,7 +4044,7 @@
         <w:pStyle w:val="ListBullet"/>
       </w:pPr>
       <w:r>
-        <w:t>Does the chat service have direct access to generated forecast rows, or only to uploaded CSVs?</w:t>
+        <w:t>The page should show purchase order records for the current CoCre8 tenant only.</w:t>
       </w:r>
     </w:p>
     <w:p>
@@ -3527,7 +4052,7 @@
         <w:pStyle w:val="ListBullet"/>
       </w:pPr>
       <w:r>
-        <w:t>Should answers always prefer SPL Master level, or only when the question explicitly asks for master/alternate grouping?</w:t>
+        <w:t>The page must not show generated purchase orders or test data from another customer.</w:t>
       </w:r>
     </w:p>
     <w:p>
@@ -3535,7 +4060,7 @@
         <w:pStyle w:val="ListBullet"/>
       </w:pPr>
       <w:r>
-        <w:t>What formula should be used when turning forecast demand into a recommended purchase quantity?</w:t>
+        <w:t>If this page is intended to show imported historical POs, it should show CoCre8 uploaded PurchaseOrders.csv records such as 26PO000277 or 26PO000344, not unrelated ORD-number records.</w:t>
       </w:r>
     </w:p>
     <w:p>
@@ -3543,54 +4068,7 @@
         <w:pStyle w:val="ListBullet"/>
       </w:pPr>
       <w:r>
-        <w:t>Should virtual/fault/quarantine warehouses be excluded from fulfilment answers by default?</w:t>
-      </w:r>
-    </w:p>
-    <w:p>
-      <w:pPr>
-        <w:pStyle w:val="Heading3"/>
-      </w:pPr>
-      <w:r>
-        <w:t>MVP Decision</w:t>
-      </w:r>
-    </w:p>
-    <w:p>
-      <w:r>
-        <w:t>For MVP, the What-if Analysis page should be accepted only if it can answer factual stock, usage, and forecast questions from uploaded data with traceable numbers. More advanced AI recommendations can come later, once the calculation rules and data access path are confirmed.</w:t>
-      </w:r>
-    </w:p>
-    <w:p>
-      <w:r>
-        <w:br w:type="page"/>
-      </w:r>
-    </w:p>
-    <w:p>
-      <w:pPr>
-        <w:pStyle w:val="Heading2"/>
-      </w:pPr>
-      <w:r>
-        <w:t>Purchase Orders</w:t>
-      </w:r>
-    </w:p>
-    <w:p>
-      <w:pPr>
-        <w:pStyle w:val="Heading3"/>
-      </w:pPr>
-      <w:r>
-        <w:t>Goal</w:t>
-      </w:r>
-    </w:p>
-    <w:p>
-      <w:r>
-        <w:t>The Purchase Orders section should help the planner decide which parts need replenishment and then create a CoCre8 PO request. For CoCre8 MVP, the output does not need to create a live SAP PO or Fujitsu portal order. It is acceptable if it generates a structured email/request asking CoCre8 to raise or approve a purchase order for the selected parts.</w:t>
-      </w:r>
-    </w:p>
-    <w:p>
-      <w:pPr>
-        <w:pStyle w:val="Heading3"/>
-      </w:pPr>
-      <w:r>
-        <w:t>Sub-pages</w:t>
+        <w:t>If this page is intended to show only POs generated inside the tool, it may be empty before the first generated CoCre8 PO request, but it must still not show another client's records.</w:t>
       </w:r>
     </w:p>
     <w:p>
@@ -3598,7 +4076,7 @@
         <w:pStyle w:val="ListBullet"/>
       </w:pPr>
       <w:r>
-        <w:t>Suggested Purchase Orders</w:t>
+        <w:t>Each generated PO row should show order number or generated request number, item names/parts, item count, order date, and available actions.</w:t>
       </w:r>
     </w:p>
     <w:p>
@@ -3606,15 +4084,23 @@
         <w:pStyle w:val="ListBullet"/>
       </w:pPr>
       <w:r>
-        <w:t>Generated Purchase Orders</w:t>
-      </w:r>
-    </w:p>
-    <w:p>
-      <w:pPr>
-        <w:pStyle w:val="Heading3"/>
-      </w:pPr>
-      <w:r>
-        <w:t>Suggested Purchase Orders</w:t>
+        <w:t>Opening a generated PO should show the line-level parts, quantities, warehouse/location, cost, status, and source reason for each line.</w:t>
+      </w:r>
+    </w:p>
+    <w:p>
+      <w:pPr>
+        <w:pStyle w:val="ListBullet"/>
+      </w:pPr>
+      <w:r>
+        <w:t>Deleting a generated PO should either be disabled after submission or should require confirmation and audit the action.</w:t>
+      </w:r>
+    </w:p>
+    <w:p>
+      <w:pPr>
+        <w:pStyle w:val="ListBullet"/>
+      </w:pPr>
+      <w:r>
+        <w:t>Generated records should be created from the selected rows on Suggested Purchase Orders and should persist after page refresh.</w:t>
       </w:r>
     </w:p>
     <w:p>
@@ -3622,127 +4108,15 @@
         <w:pStyle w:val="Heading4"/>
       </w:pPr>
       <w:r>
-        <w:t>Acceptance Criteria</w:t>
-      </w:r>
-    </w:p>
-    <w:p>
-      <w:pPr>
-        <w:pStyle w:val="ListBullet"/>
-      </w:pPr>
-      <w:r>
-        <w:t>The page should show suggested replenishment rows when a part/SPL Master has a shortage against the agreed minimum stock, manual minimum, or forecast demand rule.</w:t>
-      </w:r>
-    </w:p>
-    <w:p>
-      <w:pPr>
-        <w:pStyle w:val="ListBullet"/>
-      </w:pPr>
-      <w:r>
-        <w:t>The page should not remain blank if uploaded stock, forecast, and cost data produce one or more positive suggested quantities.</w:t>
-      </w:r>
-    </w:p>
-    <w:p>
-      <w:pPr>
-        <w:pStyle w:val="ListBullet"/>
-      </w:pPr>
-      <w:r>
-        <w:t>The calculation should work at SPL Master level first, with the actual recommended purchase part shown clearly.</w:t>
-      </w:r>
-    </w:p>
-    <w:p>
-      <w:pPr>
-        <w:pStyle w:val="ListBullet"/>
-      </w:pPr>
-      <w:r>
-        <w:t>Available stock should be calculated as stock on hand plus inbound minus allocated, using WarehouseStockOnHand.quantityOnHand, quantityInbound, and quantityAllocated.</w:t>
-      </w:r>
-    </w:p>
-    <w:p>
-      <w:pPr>
-        <w:pStyle w:val="ListBullet"/>
-      </w:pPr>
-      <w:r>
-        <w:t>Suggested Quantity should be a positive whole number and should be traceable to the shortage or forecast calculation used.</w:t>
-      </w:r>
-    </w:p>
-    <w:p>
-      <w:pPr>
-        <w:pStyle w:val="ListBullet"/>
-      </w:pPr>
-      <w:r>
-        <w:t>No. of Days should have a documented meaning. If it means lead time, it should use Parts.purchaseLeadTimeDays. If it means days of cover, it should use expected daily usage.</w:t>
-      </w:r>
-    </w:p>
-    <w:p>
-      <w:pPr>
-        <w:pStyle w:val="ListBullet"/>
-      </w:pPr>
-      <w:r>
-        <w:t>Suggested order date should be the date the tool recommends ordering. For MVP this can default to today when stock is already short or forecast demand cannot be met.</w:t>
-      </w:r>
-    </w:p>
-    <w:p>
-      <w:pPr>
-        <w:pStyle w:val="ListBullet"/>
-      </w:pPr>
-      <w:r>
-        <w:t>Expected delivery date should be suggested order date plus purchase lead time days, unless a confirmed supplier ETA exists.</w:t>
-      </w:r>
-    </w:p>
-    <w:p>
-      <w:pPr>
-        <w:pStyle w:val="ListBullet"/>
-      </w:pPr>
-      <w:r>
-        <w:t>Last Cost should come from PartCost.cost or the latest confirmed CoCre8 cost evidence, not from unreliable SAP PO line cost values.</w:t>
-      </w:r>
-    </w:p>
-    <w:p>
-      <w:pPr>
-        <w:pStyle w:val="ListBullet"/>
-      </w:pPr>
-      <w:r>
-        <w:t>Estimated Total Cost should equal Suggested Quantity multiplied by Last Cost, with blank or warning state if no cost is available.</w:t>
-      </w:r>
-    </w:p>
-    <w:p>
-      <w:pPr>
-        <w:pStyle w:val="ListBullet"/>
-      </w:pPr>
-      <w:r>
-        <w:t>The user should be able to select one or more suggested rows and click Create Purchase Orders.</w:t>
-      </w:r>
-    </w:p>
-    <w:p>
-      <w:pPr>
-        <w:pStyle w:val="ListBullet"/>
-      </w:pPr>
-      <w:r>
-        <w:t>For CoCre8 MVP, Create Purchase Orders may generate a PO request email or request record rather than a live integrated purchase order.</w:t>
-      </w:r>
-    </w:p>
-    <w:p>
-      <w:pPr>
-        <w:pStyle w:val="ListBullet"/>
-      </w:pPr>
-      <w:r>
-        <w:t>The page should explain why no rows are shown, for example no shortages, no min values, no forecast output, or missing calculation setup. It should not only show No Data Found when the calculation cannot run.</w:t>
-      </w:r>
-    </w:p>
-    <w:p>
-      <w:pPr>
-        <w:pStyle w:val="Heading4"/>
-      </w:pPr>
-      <w:r>
-        <w:t>Suggested PO Test Cases</w:t>
+        <w:t>Generated PO Test Cases</w:t>
       </w:r>
     </w:p>
     <w:tbl>
       <w:tblPr>
         <w:tblStyle w:val="TableGrid"/>
-        <w:tblW w:type="auto" w:w="0"/>
+        <w:tblW w:w="0" w:type="auto"/>
         <w:jc w:val="center"/>
-        <w:tblLook w:firstColumn="1" w:firstRow="1" w:lastColumn="0" w:lastRow="0" w:noHBand="0" w:noVBand="1" w:val="04A0"/>
+        <w:tblLook w:val="04A0" w:firstRow="1" w:lastRow="0" w:firstColumn="1" w:lastColumn="0" w:noHBand="0" w:noVBand="1"/>
       </w:tblPr>
       <w:tblGrid>
         <w:gridCol w:w="2880"/>
@@ -3750,9 +4124,12 @@
         <w:gridCol w:w="2880"/>
       </w:tblGrid>
       <w:tr>
-        <w:tc>
-          <w:tcPr>
-            <w:tcW w:type="dxa" w:w="2880"/>
+        <w:trPr>
+          <w:jc w:val="center"/>
+        </w:trPr>
+        <w:tc>
+          <w:tcPr>
+            <w:tcW w:w="2880" w:type="dxa"/>
           </w:tcPr>
           <w:p>
             <w:r>
@@ -3762,7 +4139,7 @@
         </w:tc>
         <w:tc>
           <w:tcPr>
-            <w:tcW w:type="dxa" w:w="2880"/>
+            <w:tcW w:w="2880" w:type="dxa"/>
           </w:tcPr>
           <w:p>
             <w:r>
@@ -3772,7 +4149,7 @@
         </w:tc>
         <w:tc>
           <w:tcPr>
-            <w:tcW w:type="dxa" w:w="2880"/>
+            <w:tcW w:w="2880" w:type="dxa"/>
           </w:tcPr>
           <w:p>
             <w:r>
@@ -3782,193 +4159,181 @@
         </w:tc>
       </w:tr>
       <w:tr>
-        <w:tc>
-          <w:tcPr>
-            <w:tcW w:type="dxa" w:w="2880"/>
-          </w:tcPr>
-          <w:p>
-            <w:r>
-              <w:t>Manual minimum creates shortage</w:t>
-            </w:r>
-          </w:p>
-        </w:tc>
-        <w:tc>
-          <w:tcPr>
-            <w:tcW w:type="dxa" w:w="2880"/>
-          </w:tcPr>
-          <w:p>
-            <w:r>
-              <w:t>Set a manual min above available stock for a known part/SPL Master/location. The row appears with Suggested Quantity equal to the shortage unless the documented formula says otherwise.</w:t>
-            </w:r>
-          </w:p>
-        </w:tc>
-        <w:tc>
-          <w:tcPr>
-            <w:tcW w:type="dxa" w:w="2880"/>
-          </w:tcPr>
-          <w:p>
-            <w:r>
-              <w:t>Fails if Suggested PO remains blank after forecast regeneration.</w:t>
+        <w:trPr>
+          <w:jc w:val="center"/>
+        </w:trPr>
+        <w:tc>
+          <w:tcPr>
+            <w:tcW w:w="2880" w:type="dxa"/>
+          </w:tcPr>
+          <w:p>
+            <w:r>
+              <w:t>Tenant isolation</w:t>
+            </w:r>
+          </w:p>
+        </w:tc>
+        <w:tc>
+          <w:tcPr>
+            <w:tcW w:w="2880" w:type="dxa"/>
+          </w:tcPr>
+          <w:p>
+            <w:r>
+              <w:t>Open Generated PO for CoCre8. The table should not contain unrelated order numbers/items from another customer, such as ORD29 with non-CoCre8 item names.</w:t>
+            </w:r>
+          </w:p>
+        </w:tc>
+        <w:tc>
+          <w:tcPr>
+            <w:tcW w:w="2880" w:type="dxa"/>
+          </w:tcPr>
+          <w:p>
+            <w:r>
+              <w:t>Fails immediately if another client's generated POs are visible.</w:t>
             </w:r>
           </w:p>
         </w:tc>
       </w:tr>
       <w:tr>
-        <w:tc>
-          <w:tcPr>
-            <w:tcW w:type="dxa" w:w="2880"/>
-          </w:tcPr>
-          <w:p>
-            <w:r>
-              <w:t>Allocated stock creates shortage</w:t>
-            </w:r>
-          </w:p>
-        </w:tc>
-        <w:tc>
-          <w:tcPr>
-            <w:tcW w:type="dxa" w:w="2880"/>
-          </w:tcPr>
-          <w:p>
-            <w:r>
-              <w:t>Use a row where allocated exceeds on-hand stock. Example fixture: part 38063390 in FUJITSU has quantityOnHand 10, quantityAllocated 11, quantityInbound 0, so available stock is -1 before any min/forecast rule.</w:t>
-            </w:r>
-          </w:p>
-        </w:tc>
-        <w:tc>
-          <w:tcPr>
-            <w:tcW w:type="dxa" w:w="2880"/>
-          </w:tcPr>
-          <w:p>
-            <w:r>
-              <w:t>Fails if allocated stock is ignored.</w:t>
+        <w:trPr>
+          <w:jc w:val="center"/>
+        </w:trPr>
+        <w:tc>
+          <w:tcPr>
+            <w:tcW w:w="2880" w:type="dxa"/>
+          </w:tcPr>
+          <w:p>
+            <w:r>
+              <w:t>Imported PO visibility decision</w:t>
+            </w:r>
+          </w:p>
+        </w:tc>
+        <w:tc>
+          <w:tcPr>
+            <w:tcW w:w="2880" w:type="dxa"/>
+          </w:tcPr>
+          <w:p>
+            <w:r>
+              <w:t>If imported PurchaseOrders.csv records are in scope for this page, uploaded CoCre8 PO numbers should be visible, for example 26PO000277 and 26PO000344 from the current upload.</w:t>
+            </w:r>
+          </w:p>
+        </w:tc>
+        <w:tc>
+          <w:tcPr>
+            <w:tcW w:w="2880" w:type="dxa"/>
+          </w:tcPr>
+          <w:p>
+            <w:r>
+              <w:t>Fails if imported records are expected but only unrelated generated records appear.</w:t>
             </w:r>
           </w:p>
         </w:tc>
       </w:tr>
       <w:tr>
-        <w:tc>
-          <w:tcPr>
-            <w:tcW w:type="dxa" w:w="2880"/>
-          </w:tcPr>
-          <w:p>
-            <w:r>
-              <w:t>Inbound stock offsets shortage</w:t>
-            </w:r>
-          </w:p>
-        </w:tc>
-        <w:tc>
-          <w:tcPr>
-            <w:tcW w:type="dxa" w:w="2880"/>
-          </w:tcPr>
-          <w:p>
-            <w:r>
-              <w:t>For a part with inbound stock, confirm inbound reduces or removes the suggested quantity.</w:t>
-            </w:r>
-          </w:p>
-        </w:tc>
-        <w:tc>
-          <w:tcPr>
-            <w:tcW w:type="dxa" w:w="2880"/>
-          </w:tcPr>
-          <w:p>
-            <w:r>
-              <w:t>Fails if inbound is displayed but not included in the calculation.</w:t>
+        <w:trPr>
+          <w:jc w:val="center"/>
+        </w:trPr>
+        <w:tc>
+          <w:tcPr>
+            <w:tcW w:w="2880" w:type="dxa"/>
+          </w:tcPr>
+          <w:p>
+            <w:r>
+              <w:t>Generated request appears</w:t>
+            </w:r>
+          </w:p>
+        </w:tc>
+        <w:tc>
+          <w:tcPr>
+            <w:tcW w:w="2880" w:type="dxa"/>
+          </w:tcPr>
+          <w:p>
+            <w:r>
+              <w:t>Create a PO request from Suggested Purchase Orders. Confirm a new row appears on Generated PO with the selected item count and current date.</w:t>
+            </w:r>
+          </w:p>
+        </w:tc>
+        <w:tc>
+          <w:tcPr>
+            <w:tcW w:w="2880" w:type="dxa"/>
+          </w:tcPr>
+          <w:p>
+            <w:r>
+              <w:t>Fails if the generated request is not persisted or has the wrong selected lines.</w:t>
             </w:r>
           </w:p>
         </w:tc>
       </w:tr>
       <w:tr>
-        <w:tc>
-          <w:tcPr>
-            <w:tcW w:type="dxa" w:w="2880"/>
-          </w:tcPr>
-          <w:p>
-            <w:r>
-              <w:t>Cost calculation</w:t>
-            </w:r>
-          </w:p>
-        </w:tc>
-        <w:tc>
-          <w:tcPr>
-            <w:tcW w:type="dxa" w:w="2880"/>
-          </w:tcPr>
-          <w:p>
-            <w:r>
-              <w:t>A suggested row with Last Cost populated should show Estimated Total Cost = Suggested Quantity x Last Cost.</w:t>
-            </w:r>
-          </w:p>
-        </w:tc>
-        <w:tc>
-          <w:tcPr>
-            <w:tcW w:type="dxa" w:w="2880"/>
-          </w:tcPr>
-          <w:p>
-            <w:r>
-              <w:t>Fails if total cost does not reconcile to the displayed values.</w:t>
+        <w:trPr>
+          <w:jc w:val="center"/>
+        </w:trPr>
+        <w:tc>
+          <w:tcPr>
+            <w:tcW w:w="2880" w:type="dxa"/>
+          </w:tcPr>
+          <w:p>
+            <w:r>
+              <w:t>View action</w:t>
+            </w:r>
+          </w:p>
+        </w:tc>
+        <w:tc>
+          <w:tcPr>
+            <w:tcW w:w="2880" w:type="dxa"/>
+          </w:tcPr>
+          <w:p>
+            <w:r>
+              <w:t xml:space="preserve">Click view on a generated PO. Confirm the details show every selected line with part number, quantity, </w:t>
+            </w:r>
+            <w:r>
+              <w:lastRenderedPageBreak/>
+              <w:t>cost, warehouse/location, and reason.</w:t>
+            </w:r>
+          </w:p>
+        </w:tc>
+        <w:tc>
+          <w:tcPr>
+            <w:tcW w:w="2880" w:type="dxa"/>
+          </w:tcPr>
+          <w:p>
+            <w:r>
+              <w:lastRenderedPageBreak/>
+              <w:t>Fails if the detail view only shows a summary and loses line-level data.</w:t>
             </w:r>
           </w:p>
         </w:tc>
       </w:tr>
       <w:tr>
-        <w:tc>
-          <w:tcPr>
-            <w:tcW w:type="dxa" w:w="2880"/>
-          </w:tcPr>
-          <w:p>
-            <w:r>
-              <w:t>Create PO request</w:t>
-            </w:r>
-          </w:p>
-        </w:tc>
-        <w:tc>
-          <w:tcPr>
-            <w:tcW w:type="dxa" w:w="2880"/>
-          </w:tcPr>
-          <w:p>
-            <w:r>
-              <w:t>Select one or more rows and click Create Purchase Orders. A generated CoCre8 PO request/email should include part, SPL Master if available, quantity, location/warehouse, cost, and reason.</w:t>
-            </w:r>
-          </w:p>
-        </w:tc>
-        <w:tc>
-          <w:tcPr>
-            <w:tcW w:type="dxa" w:w="2880"/>
-          </w:tcPr>
-          <w:p>
-            <w:r>
-              <w:t>Fails if the button does nothing or creates a request with missing selected lines.</w:t>
-            </w:r>
-          </w:p>
-        </w:tc>
-      </w:tr>
-      <w:tr>
-        <w:tc>
-          <w:tcPr>
-            <w:tcW w:type="dxa" w:w="2880"/>
-          </w:tcPr>
-          <w:p>
-            <w:r>
-              <w:t>No suggestion explanation</w:t>
-            </w:r>
-          </w:p>
-        </w:tc>
-        <w:tc>
-          <w:tcPr>
-            <w:tcW w:type="dxa" w:w="2880"/>
-          </w:tcPr>
-          <w:p>
-            <w:r>
-              <w:t>If there are genuinely no suggested rows, the page should display or make available the reason: no shortages, no mins, no forecast demand, or calculation not configured.</w:t>
-            </w:r>
-          </w:p>
-        </w:tc>
-        <w:tc>
-          <w:tcPr>
-            <w:tcW w:type="dxa" w:w="2880"/>
-          </w:tcPr>
-          <w:p>
-            <w:r>
-              <w:t>Fails if it only says No Data Found without diagnostic reason.</w:t>
+        <w:trPr>
+          <w:jc w:val="center"/>
+        </w:trPr>
+        <w:tc>
+          <w:tcPr>
+            <w:tcW w:w="2880" w:type="dxa"/>
+          </w:tcPr>
+          <w:p>
+            <w:r>
+              <w:t>Status lifecycle</w:t>
+            </w:r>
+          </w:p>
+        </w:tc>
+        <w:tc>
+          <w:tcPr>
+            <w:tcW w:w="2880" w:type="dxa"/>
+          </w:tcPr>
+          <w:p>
+            <w:r>
+              <w:t>Generated PO/request should have a clear status such as Draft, Sent, Approved, Accepted, Fulfilled, or Cancelled.</w:t>
+            </w:r>
+          </w:p>
+        </w:tc>
+        <w:tc>
+          <w:tcPr>
+            <w:tcW w:w="2880" w:type="dxa"/>
+          </w:tcPr>
+          <w:p>
+            <w:r>
+              <w:t>Fails if status cannot be understood or is mixed with SAP/import statuses without mapping.</w:t>
             </w:r>
           </w:p>
         </w:tc>
@@ -3979,12 +4344,84 @@
         <w:pStyle w:val="Heading3"/>
       </w:pPr>
       <w:r>
-        <w:t>Generated Purchase Orders</w:t>
-      </w:r>
-    </w:p>
-    <w:p>
-      <w:pPr>
-        <w:pStyle w:val="Heading4"/>
+        <w:t>Open Questions</w:t>
+      </w:r>
+    </w:p>
+    <w:p>
+      <w:pPr>
+        <w:pStyle w:val="ListBullet"/>
+      </w:pPr>
+      <w:r>
+        <w:t>Should Generated PO show only records created inside Planning V2, or should it also include imported PurchaseOrders.csv history?</w:t>
+      </w:r>
+    </w:p>
+    <w:p>
+      <w:pPr>
+        <w:pStyle w:val="ListBullet"/>
+      </w:pPr>
+      <w:r>
+        <w:t>What exact formula should create Suggested Quantity: manual min shortage, calculated min shortage, forecast horizon demand, or a combination?</w:t>
+      </w:r>
+    </w:p>
+    <w:p>
+      <w:pPr>
+        <w:pStyle w:val="ListBullet"/>
+      </w:pPr>
+      <w:r>
+        <w:t>Should suggested orders be for the primary part, the cheapest valid alternative, or the exact part that created the shortage?</w:t>
+      </w:r>
+    </w:p>
+    <w:p>
+      <w:pPr>
+        <w:pStyle w:val="ListBullet"/>
+      </w:pPr>
+      <w:r>
+        <w:t>What statuses should be used for CoCre8 PO request lifecycle before a real CoCre8 PO number exists?</w:t>
+      </w:r>
+    </w:p>
+    <w:p>
+      <w:pPr>
+        <w:pStyle w:val="Heading3"/>
+      </w:pPr>
+      <w:r>
+        <w:t>MVP Decision</w:t>
+      </w:r>
+    </w:p>
+    <w:p>
+      <w:r>
+        <w:t>For CoCre8 MVP, Suggested Purchase Orders should at minimum produce shortage-based suggestions from stock, inbound, allocated, cost, and manual/calculated mins. Create Purchase Orders can generate a structured email or internal request rather than a live SAP or Fujitsu order. Generated Purchase Orders must be tenant-isolated and must not display another customer's data.</w:t>
+      </w:r>
+    </w:p>
+    <w:p>
+      <w:r>
+        <w:br w:type="page"/>
+      </w:r>
+    </w:p>
+    <w:p>
+      <w:pPr>
+        <w:pStyle w:val="Heading2"/>
+      </w:pPr>
+      <w:r>
+        <w:lastRenderedPageBreak/>
+        <w:t>Item Master</w:t>
+      </w:r>
+    </w:p>
+    <w:p>
+      <w:pPr>
+        <w:pStyle w:val="Heading3"/>
+      </w:pPr>
+      <w:r>
+        <w:t>Goal</w:t>
+      </w:r>
+    </w:p>
+    <w:p>
+      <w:r>
+        <w:t>The Item Master page should show the uploaded parts as a tree grouped by SPL Master, warehouse/location, and actual part number. For CoCre8 the page is mainly a browse and verification screen: it does not need deep editing for MVP, but the master/warehouse/part grouping and stock totals must reconcile exactly to the uploaded stock data.</w:t>
+      </w:r>
+    </w:p>
+    <w:p>
+      <w:pPr>
+        <w:pStyle w:val="Heading3"/>
       </w:pPr>
       <w:r>
         <w:t>Acceptance Criteria</w:t>
@@ -3995,7 +4432,7 @@
         <w:pStyle w:val="ListBullet"/>
       </w:pPr>
       <w:r>
-        <w:t>The page should show purchase order records for the current CoCre8 tenant only.</w:t>
+        <w:t>The top-level row should be the SPL Master where one exists. Parts without an SPL Master may appear as their own part-level group.</w:t>
       </w:r>
     </w:p>
     <w:p>
@@ -4003,7 +4440,7 @@
         <w:pStyle w:val="ListBullet"/>
       </w:pPr>
       <w:r>
-        <w:t>The page must not show generated purchase orders or test data from another customer.</w:t>
+        <w:t>The primary part number and description shown for a master should come from Parts.csv, using the primary part/main alternative mapping.</w:t>
       </w:r>
     </w:p>
     <w:p>
@@ -4011,7 +4448,7 @@
         <w:pStyle w:val="ListBullet"/>
       </w:pPr>
       <w:r>
-        <w:t>If this page is intended to show imported historical POs, it should show CoCre8 uploaded PurchaseOrders.csv records such as 26PO000277 or 26PO000344, not unrelated ORD-number records.</w:t>
+        <w:t>Expanding a master should show warehouse/location rows for stock held under that master.</w:t>
       </w:r>
     </w:p>
     <w:p>
@@ -4019,7 +4456,7 @@
         <w:pStyle w:val="ListBullet"/>
       </w:pPr>
       <w:r>
-        <w:t>If this page is intended to show only POs generated inside the tool, it may be empty before the first generated CoCre8 PO request, but it must still not show another client's records.</w:t>
+        <w:t>Expanding a warehouse should show the actual part numbers held in that warehouse.</w:t>
       </w:r>
     </w:p>
     <w:p>
@@ -4027,7 +4464,7 @@
         <w:pStyle w:val="ListBullet"/>
       </w:pPr>
       <w:r>
-        <w:t>Each generated PO row should show order number or generated request number, item names/parts, item count, order date, and available actions.</w:t>
+        <w:t>Parent stock totals must equal the sum of their visible child rows. The SPL Master stock total must equal the sum of quantityOnHand for all parts mapped to that SPL Master, after applying the same tenant and filter rules.</w:t>
       </w:r>
     </w:p>
     <w:p>
@@ -4035,7 +4472,7 @@
         <w:pStyle w:val="ListBullet"/>
       </w:pPr>
       <w:r>
-        <w:t>Opening a generated PO should show the line-level parts, quantities, warehouse/location, cost, status, and source reason for each line.</w:t>
+        <w:t>Warehouse-level stock must equal the sum of quantityOnHand for that master in that warehouse.</w:t>
       </w:r>
     </w:p>
     <w:p>
@@ -4043,7 +4480,7 @@
         <w:pStyle w:val="ListBullet"/>
       </w:pPr>
       <w:r>
-        <w:t>Deleting a generated PO should either be disabled after submission or should require confirmation and audit the action.</w:t>
+        <w:t>Part-level stock must equal WarehouseStockOnHand.quantityOnHand for that part and warehouse.</w:t>
       </w:r>
     </w:p>
     <w:p>
@@ -4051,23 +4488,95 @@
         <w:pStyle w:val="ListBullet"/>
       </w:pPr>
       <w:r>
-        <w:t>Generated records should be created from the selected rows on Suggested Purchase Orders and should persist after page refresh.</w:t>
-      </w:r>
-    </w:p>
-    <w:p>
-      <w:pPr>
-        <w:pStyle w:val="Heading4"/>
-      </w:pPr>
-      <w:r>
-        <w:t>Generated PO Test Cases</w:t>
+        <w:t>The page must not use usage quantity, allocated quantity, inbound quantity, uniqueId, cost, or row counts as stock on hand.</w:t>
+      </w:r>
+    </w:p>
+    <w:p>
+      <w:pPr>
+        <w:pStyle w:val="ListBullet"/>
+      </w:pPr>
+      <w:r>
+        <w:t>Search should work by SPL Master, primary part, actual part number, and description.</w:t>
+      </w:r>
+    </w:p>
+    <w:p>
+      <w:pPr>
+        <w:pStyle w:val="ListBullet"/>
+      </w:pPr>
+      <w:r>
+        <w:t>The page should not show parts or stock from another customer tenant.</w:t>
+      </w:r>
+    </w:p>
+    <w:p>
+      <w:pPr>
+        <w:pStyle w:val="ListBullet"/>
+      </w:pPr>
+      <w:r>
+        <w:t>If virtual/fault/quarantine warehouses are included, they should be visibly distinguishable from fulfilment stock or filterable out.</w:t>
+      </w:r>
+    </w:p>
+    <w:p>
+      <w:pPr>
+        <w:pStyle w:val="Heading3"/>
+      </w:pPr>
+      <w:r>
+        <w:t>Known Data Fixtures for Tests</w:t>
+      </w:r>
+    </w:p>
+    <w:p>
+      <w:pPr>
+        <w:pStyle w:val="ListBullet"/>
+      </w:pPr>
+      <w:r>
+        <w:t>Part 38061313 maps to SPL8006854 and has description Mobo RX2540 M4.</w:t>
+      </w:r>
+    </w:p>
+    <w:p>
+      <w:pPr>
+        <w:pStyle w:val="ListBullet"/>
+      </w:pPr>
+      <w:r>
+        <w:t>WarehouseStockOnHand shows part 38061313 quantityOnHand totals: FUJ CT 2, FUJITSU 4, FUJMIW-J 1, FUJMSM C 1, FUJMSVCJ 1, SCRPFUJ 1. Total part stock is 10.</w:t>
+      </w:r>
+    </w:p>
+    <w:p>
+      <w:pPr>
+        <w:pStyle w:val="ListBullet"/>
+      </w:pPr>
+      <w:r>
+        <w:t>SPL8006854 has four mapped parts in Parts.csv: 38058909, 38059355, 38060372, and 38061313. Total quantityOnHand across those parts is 11.</w:t>
+      </w:r>
+    </w:p>
+    <w:p>
+      <w:pPr>
+        <w:pStyle w:val="ListBullet"/>
+      </w:pPr>
+      <w:r>
+        <w:t>The screenshot showing SPL8006854 / primary part 38061313 with stock 160 does not reconcile to the current uploaded WarehouseStockOnHand data and should fail.</w:t>
+      </w:r>
+    </w:p>
+    <w:p>
+      <w:pPr>
+        <w:pStyle w:val="ListBullet"/>
+      </w:pPr>
+      <w:r>
+        <w:t>SPL8005748 has five mapped parts and current uploaded total quantityOnHand 9, not 168.</w:t>
+      </w:r>
+    </w:p>
+    <w:p>
+      <w:pPr>
+        <w:pStyle w:val="Heading3"/>
+      </w:pPr>
+      <w:r>
+        <w:t>Test Cases</w:t>
       </w:r>
     </w:p>
     <w:tbl>
       <w:tblPr>
         <w:tblStyle w:val="TableGrid"/>
-        <w:tblW w:type="auto" w:w="0"/>
+        <w:tblW w:w="0" w:type="auto"/>
         <w:jc w:val="center"/>
-        <w:tblLook w:firstColumn="1" w:firstRow="1" w:lastColumn="0" w:lastRow="0" w:noHBand="0" w:noVBand="1" w:val="04A0"/>
+        <w:tblLook w:val="04A0" w:firstRow="1" w:lastRow="0" w:firstColumn="1" w:lastColumn="0" w:noHBand="0" w:noVBand="1"/>
       </w:tblPr>
       <w:tblGrid>
         <w:gridCol w:w="2880"/>
@@ -4075,9 +4584,12 @@
         <w:gridCol w:w="2880"/>
       </w:tblGrid>
       <w:tr>
-        <w:tc>
-          <w:tcPr>
-            <w:tcW w:type="dxa" w:w="2880"/>
+        <w:trPr>
+          <w:jc w:val="center"/>
+        </w:trPr>
+        <w:tc>
+          <w:tcPr>
+            <w:tcW w:w="2880" w:type="dxa"/>
           </w:tcPr>
           <w:p>
             <w:r>
@@ -4087,7 +4599,7 @@
         </w:tc>
         <w:tc>
           <w:tcPr>
-            <w:tcW w:type="dxa" w:w="2880"/>
+            <w:tcW w:w="2880" w:type="dxa"/>
           </w:tcPr>
           <w:p>
             <w:r>
@@ -4097,7 +4609,7 @@
         </w:tc>
         <w:tc>
           <w:tcPr>
-            <w:tcW w:type="dxa" w:w="2880"/>
+            <w:tcW w:w="2880" w:type="dxa"/>
           </w:tcPr>
           <w:p>
             <w:r>
@@ -4107,161 +4619,256 @@
         </w:tc>
       </w:tr>
       <w:tr>
-        <w:tc>
-          <w:tcPr>
-            <w:tcW w:type="dxa" w:w="2880"/>
-          </w:tcPr>
-          <w:p>
-            <w:r>
-              <w:t>Tenant isolation</w:t>
-            </w:r>
-          </w:p>
-        </w:tc>
-        <w:tc>
-          <w:tcPr>
-            <w:tcW w:type="dxa" w:w="2880"/>
-          </w:tcPr>
-          <w:p>
-            <w:r>
-              <w:t>Open Generated PO for CoCre8. The table should not contain unrelated order numbers/items from another customer, such as ORD29 with non-CoCre8 item names.</w:t>
-            </w:r>
-          </w:p>
-        </w:tc>
-        <w:tc>
-          <w:tcPr>
-            <w:tcW w:type="dxa" w:w="2880"/>
-          </w:tcPr>
-          <w:p>
-            <w:r>
-              <w:t>Fails immediately if another client's generated POs are visible.</w:t>
+        <w:trPr>
+          <w:jc w:val="center"/>
+        </w:trPr>
+        <w:tc>
+          <w:tcPr>
+            <w:tcW w:w="2880" w:type="dxa"/>
+          </w:tcPr>
+          <w:p>
+            <w:r>
+              <w:t>Master stock reconciliation</w:t>
+            </w:r>
+          </w:p>
+        </w:tc>
+        <w:tc>
+          <w:tcPr>
+            <w:tcW w:w="2880" w:type="dxa"/>
+          </w:tcPr>
+          <w:p>
+            <w:r>
+              <w:t xml:space="preserve">Search for SPL8006854. The </w:t>
+            </w:r>
+            <w:r>
+              <w:lastRenderedPageBreak/>
+              <w:t>master stock total should equal 11 using the current uploaded stock file.</w:t>
+            </w:r>
+          </w:p>
+        </w:tc>
+        <w:tc>
+          <w:tcPr>
+            <w:tcW w:w="2880" w:type="dxa"/>
+          </w:tcPr>
+          <w:p>
+            <w:r>
+              <w:lastRenderedPageBreak/>
+              <w:t xml:space="preserve">Fails if it shows 160 or any </w:t>
+            </w:r>
+            <w:r>
+              <w:lastRenderedPageBreak/>
+              <w:t>value that does not equal the sum of mapped part quantityOnHand.</w:t>
             </w:r>
           </w:p>
         </w:tc>
       </w:tr>
       <w:tr>
-        <w:tc>
-          <w:tcPr>
-            <w:tcW w:type="dxa" w:w="2880"/>
-          </w:tcPr>
-          <w:p>
-            <w:r>
-              <w:t>Imported PO visibility decision</w:t>
-            </w:r>
-          </w:p>
-        </w:tc>
-        <w:tc>
-          <w:tcPr>
-            <w:tcW w:type="dxa" w:w="2880"/>
-          </w:tcPr>
-          <w:p>
-            <w:r>
-              <w:t>If imported PurchaseOrders.csv records are in scope for this page, uploaded CoCre8 PO numbers should be visible, for example 26PO000277 and 26PO000344 from the current upload.</w:t>
-            </w:r>
-          </w:p>
-        </w:tc>
-        <w:tc>
-          <w:tcPr>
-            <w:tcW w:type="dxa" w:w="2880"/>
-          </w:tcPr>
-          <w:p>
-            <w:r>
-              <w:t>Fails if imported records are expected but only unrelated generated records appear.</w:t>
+        <w:trPr>
+          <w:jc w:val="center"/>
+        </w:trPr>
+        <w:tc>
+          <w:tcPr>
+            <w:tcW w:w="2880" w:type="dxa"/>
+          </w:tcPr>
+          <w:p>
+            <w:r>
+              <w:lastRenderedPageBreak/>
+              <w:t>Part stock reconciliation</w:t>
+            </w:r>
+          </w:p>
+        </w:tc>
+        <w:tc>
+          <w:tcPr>
+            <w:tcW w:w="2880" w:type="dxa"/>
+          </w:tcPr>
+          <w:p>
+            <w:r>
+              <w:t>Expand SPL8006854 and find part 38061313. The total stock for that actual part across all warehouses should equal 10.</w:t>
+            </w:r>
+          </w:p>
+        </w:tc>
+        <w:tc>
+          <w:tcPr>
+            <w:tcW w:w="2880" w:type="dxa"/>
+          </w:tcPr>
+          <w:p>
+            <w:r>
+              <w:t>Fails if the part-level total uses master total, usage total, or another calculated value.</w:t>
             </w:r>
           </w:p>
         </w:tc>
       </w:tr>
       <w:tr>
-        <w:tc>
-          <w:tcPr>
-            <w:tcW w:type="dxa" w:w="2880"/>
-          </w:tcPr>
-          <w:p>
-            <w:r>
-              <w:t>Generated request appears</w:t>
-            </w:r>
-          </w:p>
-        </w:tc>
-        <w:tc>
-          <w:tcPr>
-            <w:tcW w:type="dxa" w:w="2880"/>
-          </w:tcPr>
-          <w:p>
-            <w:r>
-              <w:t>Create a PO request from Suggested Purchase Orders. Confirm a new row appears on Generated PO with the selected item count and current date.</w:t>
-            </w:r>
-          </w:p>
-        </w:tc>
-        <w:tc>
-          <w:tcPr>
-            <w:tcW w:type="dxa" w:w="2880"/>
-          </w:tcPr>
-          <w:p>
-            <w:r>
-              <w:t>Fails if the generated request is not persisted or has the wrong selected lines.</w:t>
+        <w:trPr>
+          <w:jc w:val="center"/>
+        </w:trPr>
+        <w:tc>
+          <w:tcPr>
+            <w:tcW w:w="2880" w:type="dxa"/>
+          </w:tcPr>
+          <w:p>
+            <w:r>
+              <w:t>Warehouse child sum</w:t>
+            </w:r>
+          </w:p>
+        </w:tc>
+        <w:tc>
+          <w:tcPr>
+            <w:tcW w:w="2880" w:type="dxa"/>
+          </w:tcPr>
+          <w:p>
+            <w:r>
+              <w:t>Under SPL8006854, FUJITSU should show 4 units for part 38061313 plus any other mapped alternatives present in FUJITSU.</w:t>
+            </w:r>
+          </w:p>
+        </w:tc>
+        <w:tc>
+          <w:tcPr>
+            <w:tcW w:w="2880" w:type="dxa"/>
+          </w:tcPr>
+          <w:p>
+            <w:r>
+              <w:t>Fails if the warehouse total does not equal the sum of visible child parts.</w:t>
             </w:r>
           </w:p>
         </w:tc>
       </w:tr>
       <w:tr>
-        <w:tc>
-          <w:tcPr>
-            <w:tcW w:type="dxa" w:w="2880"/>
-          </w:tcPr>
-          <w:p>
-            <w:r>
-              <w:t>View action</w:t>
-            </w:r>
-          </w:p>
-        </w:tc>
-        <w:tc>
-          <w:tcPr>
-            <w:tcW w:type="dxa" w:w="2880"/>
-          </w:tcPr>
-          <w:p>
-            <w:r>
-              <w:t>Click view on a generated PO. Confirm the details show every selected line with part number, quantity, cost, warehouse/location, and reason.</w:t>
-            </w:r>
-          </w:p>
-        </w:tc>
-        <w:tc>
-          <w:tcPr>
-            <w:tcW w:type="dxa" w:w="2880"/>
-          </w:tcPr>
-          <w:p>
-            <w:r>
-              <w:t>Fails if the detail view only shows a summary and loses line-level data.</w:t>
+        <w:trPr>
+          <w:jc w:val="center"/>
+        </w:trPr>
+        <w:tc>
+          <w:tcPr>
+            <w:tcW w:w="2880" w:type="dxa"/>
+          </w:tcPr>
+          <w:p>
+            <w:r>
+              <w:t>Expanded tree consistency</w:t>
+            </w:r>
+          </w:p>
+        </w:tc>
+        <w:tc>
+          <w:tcPr>
+            <w:tcW w:w="2880" w:type="dxa"/>
+          </w:tcPr>
+          <w:p>
+            <w:r>
+              <w:t>For any expanded master, parent total = sum of warehouse rows, and each warehouse row = sum of part rows.</w:t>
+            </w:r>
+          </w:p>
+        </w:tc>
+        <w:tc>
+          <w:tcPr>
+            <w:tcW w:w="2880" w:type="dxa"/>
+          </w:tcPr>
+          <w:p>
+            <w:r>
+              <w:t>Fails if parent/child totals do not reconcile.</w:t>
             </w:r>
           </w:p>
         </w:tc>
       </w:tr>
       <w:tr>
-        <w:tc>
-          <w:tcPr>
-            <w:tcW w:type="dxa" w:w="2880"/>
-          </w:tcPr>
-          <w:p>
-            <w:r>
-              <w:t>Status lifecycle</w:t>
-            </w:r>
-          </w:p>
-        </w:tc>
-        <w:tc>
-          <w:tcPr>
-            <w:tcW w:type="dxa" w:w="2880"/>
-          </w:tcPr>
-          <w:p>
-            <w:r>
-              <w:t>Generated PO/request should have a clear status such as Draft, Sent, Approved, Accepted, Fulfilled, or Cancelled.</w:t>
-            </w:r>
-          </w:p>
-        </w:tc>
-        <w:tc>
-          <w:tcPr>
-            <w:tcW w:type="dxa" w:w="2880"/>
-          </w:tcPr>
-          <w:p>
-            <w:r>
-              <w:t>Fails if status cannot be understood or is mixed with SAP/import statuses without mapping.</w:t>
+        <w:trPr>
+          <w:jc w:val="center"/>
+        </w:trPr>
+        <w:tc>
+          <w:tcPr>
+            <w:tcW w:w="2880" w:type="dxa"/>
+          </w:tcPr>
+          <w:p>
+            <w:r>
+              <w:t>Search by actual part</w:t>
+            </w:r>
+          </w:p>
+        </w:tc>
+        <w:tc>
+          <w:tcPr>
+            <w:tcW w:w="2880" w:type="dxa"/>
+          </w:tcPr>
+          <w:p>
+            <w:r>
+              <w:t>Search for 38061313. The page should return SPL8006854 and show 38061313 as the primary/actual part.</w:t>
+            </w:r>
+          </w:p>
+        </w:tc>
+        <w:tc>
+          <w:tcPr>
+            <w:tcW w:w="2880" w:type="dxa"/>
+          </w:tcPr>
+          <w:p>
+            <w:r>
+              <w:t>Fails if search only works by SPL Master and cannot find actual part numbers.</w:t>
+            </w:r>
+          </w:p>
+        </w:tc>
+      </w:tr>
+      <w:tr>
+        <w:trPr>
+          <w:jc w:val="center"/>
+        </w:trPr>
+        <w:tc>
+          <w:tcPr>
+            <w:tcW w:w="2880" w:type="dxa"/>
+          </w:tcPr>
+          <w:p>
+            <w:r>
+              <w:t>Tenant isolation</w:t>
+            </w:r>
+          </w:p>
+        </w:tc>
+        <w:tc>
+          <w:tcPr>
+            <w:tcW w:w="2880" w:type="dxa"/>
+          </w:tcPr>
+          <w:p>
+            <w:r>
+              <w:t>Search or browse should not show non-CoCre8 items or warehouses created from another customer dataset.</w:t>
+            </w:r>
+          </w:p>
+        </w:tc>
+        <w:tc>
+          <w:tcPr>
+            <w:tcW w:w="2880" w:type="dxa"/>
+          </w:tcPr>
+          <w:p>
+            <w:r>
+              <w:t>Fails if unrelated customer parts appear in the CoCre8 Item Master.</w:t>
+            </w:r>
+          </w:p>
+        </w:tc>
+      </w:tr>
+      <w:tr>
+        <w:trPr>
+          <w:jc w:val="center"/>
+        </w:trPr>
+        <w:tc>
+          <w:tcPr>
+            <w:tcW w:w="2880" w:type="dxa"/>
+          </w:tcPr>
+          <w:p>
+            <w:r>
+              <w:t>Virtual stock handling</w:t>
+            </w:r>
+          </w:p>
+        </w:tc>
+        <w:tc>
+          <w:tcPr>
+            <w:tcW w:w="2880" w:type="dxa"/>
+          </w:tcPr>
+          <w:p>
+            <w:r>
+              <w:t>If SCRPFUJ, FUJFAULT, QURN, or similar virtual/fault warehouses appear, they should be identifiable and should not be silently counted as available fulfilment stock elsewhere.</w:t>
+            </w:r>
+          </w:p>
+        </w:tc>
+        <w:tc>
+          <w:tcPr>
+            <w:tcW w:w="2880" w:type="dxa"/>
+          </w:tcPr>
+          <w:p>
+            <w:r>
+              <w:t>Fails if virtual stock is mixed into fulfilment totals without a clear label or filter.</w:t>
             </w:r>
           </w:p>
         </w:tc>
@@ -4280,7 +4887,7 @@
         <w:pStyle w:val="ListBullet"/>
       </w:pPr>
       <w:r>
-        <w:t>Should Generated PO show only records created inside Planning V2, or should it also include imported PurchaseOrders.csv history?</w:t>
+        <w:t>Should the top-level stock total include all warehouses, or only active/replenishable fulfilment warehouses?</w:t>
       </w:r>
     </w:p>
     <w:p>
@@ -4288,7 +4895,7 @@
         <w:pStyle w:val="ListBullet"/>
       </w:pPr>
       <w:r>
-        <w:t>What exact formula should create Suggested Quantity: manual min shortage, calculated min shortage, forecast horizon demand, or a combination?</w:t>
+        <w:t>Should virtual/fault/quarantine stock be shown in the tree but excluded from stock available for planning?</w:t>
       </w:r>
     </w:p>
     <w:p>
@@ -4296,7 +4903,59 @@
         <w:pStyle w:val="ListBullet"/>
       </w:pPr>
       <w:r>
-        <w:t>Should suggested orders be for the primary part, the cheapest valid alternative, or the exact part that created the shortage?</w:t>
+        <w:t>Should the page show inbound and allocated quantities as separate columns so stock differences can be explained?</w:t>
+      </w:r>
+    </w:p>
+    <w:p>
+      <w:pPr>
+        <w:pStyle w:val="Heading3"/>
+      </w:pPr>
+      <w:r>
+        <w:t>MVP Decision</w:t>
+      </w:r>
+    </w:p>
+    <w:p>
+      <w:r>
+        <w:t xml:space="preserve">For MVP, the Item Master page is acceptable if it browses the correct CoCre8 part/master/warehouse tree and every stock count reconciles to </w:t>
+      </w:r>
+      <w:r>
+        <w:lastRenderedPageBreak/>
+        <w:t>WarehouseStockOnHand.quantityOnHand. The current screenshot values such as 160 for SPL8006854 should be treated as a calculation or data-binding defect until proven otherwise.</w:t>
+      </w:r>
+    </w:p>
+    <w:p>
+      <w:r>
+        <w:br w:type="page"/>
+      </w:r>
+    </w:p>
+    <w:p>
+      <w:pPr>
+        <w:pStyle w:val="Heading2"/>
+      </w:pPr>
+      <w:r>
+        <w:lastRenderedPageBreak/>
+        <w:t>User Management / Create User</w:t>
+      </w:r>
+    </w:p>
+    <w:p>
+      <w:pPr>
+        <w:pStyle w:val="Heading3"/>
+      </w:pPr>
+      <w:r>
+        <w:t>Goal</w:t>
+      </w:r>
+    </w:p>
+    <w:p>
+      <w:r>
+        <w:t>The User Management page should allow an authorised admin user to create a new user and assign module-level permissions. The created user should then be able to log in and only access the modules enabled for them.</w:t>
+      </w:r>
+    </w:p>
+    <w:p>
+      <w:pPr>
+        <w:pStyle w:val="Heading3"/>
+      </w:pPr>
+      <w:r>
+        <w:t>Acceptance Criteria</w:t>
       </w:r>
     </w:p>
     <w:p>
@@ -4304,54 +4963,7 @@
         <w:pStyle w:val="ListBullet"/>
       </w:pPr>
       <w:r>
-        <w:t>What statuses should be used for CoCre8 PO request lifecycle before a real CoCre8 PO number exists?</w:t>
-      </w:r>
-    </w:p>
-    <w:p>
-      <w:pPr>
-        <w:pStyle w:val="Heading3"/>
-      </w:pPr>
-      <w:r>
-        <w:t>MVP Decision</w:t>
-      </w:r>
-    </w:p>
-    <w:p>
-      <w:r>
-        <w:t>For CoCre8 MVP, Suggested Purchase Orders should at minimum produce shortage-based suggestions from stock, inbound, allocated, cost, and manual/calculated mins. Create Purchase Orders can generate a structured email or internal request rather than a live SAP or Fujitsu order. Generated Purchase Orders must be tenant-isolated and must not display another customer's data.</w:t>
-      </w:r>
-    </w:p>
-    <w:p>
-      <w:r>
-        <w:br w:type="page"/>
-      </w:r>
-    </w:p>
-    <w:p>
-      <w:pPr>
-        <w:pStyle w:val="Heading2"/>
-      </w:pPr>
-      <w:r>
-        <w:t>Item Master</w:t>
-      </w:r>
-    </w:p>
-    <w:p>
-      <w:pPr>
-        <w:pStyle w:val="Heading3"/>
-      </w:pPr>
-      <w:r>
-        <w:t>Goal</w:t>
-      </w:r>
-    </w:p>
-    <w:p>
-      <w:r>
-        <w:t>The Item Master page should show the uploaded parts as a tree grouped by SPL Master, warehouse/location, and actual part number. For CoCre8 the page is mainly a browse and verification screen: it does not need deep editing for MVP, but the master/warehouse/part grouping and stock totals must reconcile exactly to the uploaded stock data.</w:t>
-      </w:r>
-    </w:p>
-    <w:p>
-      <w:pPr>
-        <w:pStyle w:val="Heading3"/>
-      </w:pPr>
-      <w:r>
-        <w:t>Acceptance Criteria</w:t>
+        <w:t>The User Management page should show existing users with name, email, phone, and available actions.</w:t>
       </w:r>
     </w:p>
     <w:p>
@@ -4359,7 +4971,7 @@
         <w:pStyle w:val="ListBullet"/>
       </w:pPr>
       <w:r>
-        <w:t>The top-level row should be the SPL Master where one exists. Parts without an SPL Master may appear as their own part-level group.</w:t>
+        <w:t>Clicking Create New should open the Create User modal.</w:t>
       </w:r>
     </w:p>
     <w:p>
@@ -4367,7 +4979,7 @@
         <w:pStyle w:val="ListBullet"/>
       </w:pPr>
       <w:r>
-        <w:t>The primary part number and description shown for a master should come from Parts.csv, using the primary part/main alternative mapping.</w:t>
+        <w:t>The modal should allow entry of full name, email, and phone number.</w:t>
       </w:r>
     </w:p>
     <w:p>
@@ -4375,7 +4987,7 @@
         <w:pStyle w:val="ListBullet"/>
       </w:pPr>
       <w:r>
-        <w:t>Expanding a master should show warehouse/location rows for stock held under that master.</w:t>
+        <w:t>Email should be required and should be validated as an email address.</w:t>
       </w:r>
     </w:p>
     <w:p>
@@ -4383,7 +4995,7 @@
         <w:pStyle w:val="ListBullet"/>
       </w:pPr>
       <w:r>
-        <w:t>Expanding a warehouse should show the actual part numbers held in that warehouse.</w:t>
+        <w:t>Full name should be required.</w:t>
       </w:r>
     </w:p>
     <w:p>
@@ -4391,7 +5003,7 @@
         <w:pStyle w:val="ListBullet"/>
       </w:pPr>
       <w:r>
-        <w:t>Parent stock totals must equal the sum of their visible child rows. The SPL Master stock total must equal the sum of quantityOnHand for all parts mapped to that SPL Master, after applying the same tenant and filter rules.</w:t>
+        <w:t>Phone should either be optional or validated according to the agreed phone format.</w:t>
       </w:r>
     </w:p>
     <w:p>
@@ -4399,7 +5011,7 @@
         <w:pStyle w:val="ListBullet"/>
       </w:pPr>
       <w:r>
-        <w:t>Warehouse-level stock must equal the sum of quantityOnHand for that master in that warehouse.</w:t>
+        <w:t>The modal should show module permission toggles for the modules available in the tenant.</w:t>
       </w:r>
     </w:p>
     <w:p>
@@ -4407,7 +5019,7 @@
         <w:pStyle w:val="ListBullet"/>
       </w:pPr>
       <w:r>
-        <w:t>Part-level stock must equal WarehouseStockOnHand.quantityOnHand for that part and warehouse.</w:t>
+        <w:t>Saving a valid user should create the user record and close the modal or show clear success feedback.</w:t>
       </w:r>
     </w:p>
     <w:p>
@@ -4415,7 +5027,7 @@
         <w:pStyle w:val="ListBullet"/>
       </w:pPr>
       <w:r>
-        <w:t>The page must not use usage quantity, allocated quantity, inbound quantity, uniqueId, cost, or row counts as stock on hand.</w:t>
+        <w:t>The created user should appear in the User Management table after save/refresh.</w:t>
       </w:r>
     </w:p>
     <w:p>
@@ -4423,7 +5035,7 @@
         <w:pStyle w:val="ListBullet"/>
       </w:pPr>
       <w:r>
-        <w:t>Search should work by SPL Master, primary part, actual part number, and description.</w:t>
+        <w:t>The user permissions saved in the UI should be persisted in the database.</w:t>
       </w:r>
     </w:p>
     <w:p>
@@ -4431,7 +5043,7 @@
         <w:pStyle w:val="ListBullet"/>
       </w:pPr>
       <w:r>
-        <w:t>The page should not show parts or stock from another customer tenant.</w:t>
+        <w:t>When the created user logs in, the left navigation and route access should match the saved module permissions.</w:t>
       </w:r>
     </w:p>
     <w:p>
@@ -4439,15 +5051,7 @@
         <w:pStyle w:val="ListBullet"/>
       </w:pPr>
       <w:r>
-        <w:t>If virtual/fault/quarantine warehouses are included, they should be visibly distinguishable from fulfilment stock or filterable out.</w:t>
-      </w:r>
-    </w:p>
-    <w:p>
-      <w:pPr>
-        <w:pStyle w:val="Heading3"/>
-      </w:pPr>
-      <w:r>
-        <w:t>Known Data Fixtures for Tests</w:t>
+        <w:t>A user without permission for a module should not be able to access that module by direct URL.</w:t>
       </w:r>
     </w:p>
     <w:p>
@@ -4455,7 +5059,7 @@
         <w:pStyle w:val="ListBullet"/>
       </w:pPr>
       <w:r>
-        <w:t>Part 38061313 maps to SPL8006854 and has description Mobo RX2540 M4.</w:t>
+        <w:t>A user with permission for a module should be able to open that module and use normal read access for that page.</w:t>
       </w:r>
     </w:p>
     <w:p>
@@ -4463,31 +5067,7 @@
         <w:pStyle w:val="ListBullet"/>
       </w:pPr>
       <w:r>
-        <w:t>WarehouseStockOnHand shows part 38061313 quantityOnHand totals: FUJ CT 2, FUJITSU 4, FUJMIW-J 1, FUJMSM C 1, FUJMSVCJ 1, SCRPFUJ 1. Total part stock is 10.</w:t>
-      </w:r>
-    </w:p>
-    <w:p>
-      <w:pPr>
-        <w:pStyle w:val="ListBullet"/>
-      </w:pPr>
-      <w:r>
-        <w:t>SPL8006854 has four mapped parts in Parts.csv: 38058909, 38059355, 38060372, and 38061313. Total quantityOnHand across those parts is 11.</w:t>
-      </w:r>
-    </w:p>
-    <w:p>
-      <w:pPr>
-        <w:pStyle w:val="ListBullet"/>
-      </w:pPr>
-      <w:r>
-        <w:t>The screenshot showing SPL8006854 / primary part 38061313 with stock 160 does not reconcile to the current uploaded WarehouseStockOnHand data and should fail.</w:t>
-      </w:r>
-    </w:p>
-    <w:p>
-      <w:pPr>
-        <w:pStyle w:val="ListBullet"/>
-      </w:pPr>
-      <w:r>
-        <w:t>SPL8005748 has five mapped parts and current uploaded total quantityOnHand 9, not 168.</w:t>
+        <w:t>Create/update actions should be audited if the application has an audit table for user management.</w:t>
       </w:r>
     </w:p>
     <w:p>
@@ -4501,19 +5081,19 @@
     <w:tbl>
       <w:tblPr>
         <w:tblStyle w:val="TableGrid"/>
-        <w:tblW w:type="auto" w:w="0"/>
-        <w:jc w:val="center"/>
-        <w:tblLook w:firstColumn="1" w:firstRow="1" w:lastColumn="0" w:lastRow="0" w:noHBand="0" w:noVBand="1" w:val="04A0"/>
+        <w:tblW w:w="0" w:type="auto"/>
+        <w:tblLayout w:type="fixed"/>
+        <w:tblLook w:val="04A0" w:firstRow="1" w:lastRow="0" w:firstColumn="1" w:lastColumn="0" w:noHBand="0" w:noVBand="1"/>
       </w:tblPr>
       <w:tblGrid>
-        <w:gridCol w:w="2880"/>
-        <w:gridCol w:w="2880"/>
-        <w:gridCol w:w="2880"/>
+        <w:gridCol w:w="2952"/>
+        <w:gridCol w:w="2952"/>
+        <w:gridCol w:w="2952"/>
       </w:tblGrid>
       <w:tr>
         <w:tc>
           <w:tcPr>
-            <w:tcW w:type="dxa" w:w="2880"/>
+            <w:tcW w:w="2952" w:type="dxa"/>
           </w:tcPr>
           <w:p>
             <w:r>
@@ -4523,7 +5103,7 @@
         </w:tc>
         <w:tc>
           <w:tcPr>
-            <w:tcW w:type="dxa" w:w="2880"/>
+            <w:tcW w:w="2952" w:type="dxa"/>
           </w:tcPr>
           <w:p>
             <w:r>
@@ -4533,11 +5113,11 @@
         </w:tc>
         <w:tc>
           <w:tcPr>
-            <w:tcW w:type="dxa" w:w="2880"/>
-          </w:tcPr>
-          <w:p>
-            <w:r>
-              <w:t>Pass / Fail Signal</w:t>
+            <w:tcW w:w="2952" w:type="dxa"/>
+          </w:tcPr>
+          <w:p>
+            <w:r>
+              <w:t>How to Verify</w:t>
             </w:r>
           </w:p>
         </w:tc>
@@ -4545,31 +5125,31 @@
       <w:tr>
         <w:tc>
           <w:tcPr>
-            <w:tcW w:type="dxa" w:w="2880"/>
-          </w:tcPr>
-          <w:p>
-            <w:r>
-              <w:t>Master stock reconciliation</w:t>
-            </w:r>
-          </w:p>
-        </w:tc>
-        <w:tc>
-          <w:tcPr>
-            <w:tcW w:type="dxa" w:w="2880"/>
-          </w:tcPr>
-          <w:p>
-            <w:r>
-              <w:t>Search for SPL8006854. The master stock total should equal 11 using the current uploaded stock file.</w:t>
-            </w:r>
-          </w:p>
-        </w:tc>
-        <w:tc>
-          <w:tcPr>
-            <w:tcW w:type="dxa" w:w="2880"/>
-          </w:tcPr>
-          <w:p>
-            <w:r>
-              <w:t>Fails if it shows 160 or any value that does not equal the sum of mapped part quantityOnHand.</w:t>
+            <w:tcW w:w="2952" w:type="dxa"/>
+          </w:tcPr>
+          <w:p>
+            <w:r>
+              <w:t>Create user with valid details</w:t>
+            </w:r>
+          </w:p>
+        </w:tc>
+        <w:tc>
+          <w:tcPr>
+            <w:tcW w:w="2952" w:type="dxa"/>
+          </w:tcPr>
+          <w:p>
+            <w:r>
+              <w:t>A new user can be created with full name, email, phone, and selected module permissions.</w:t>
+            </w:r>
+          </w:p>
+        </w:tc>
+        <w:tc>
+          <w:tcPr>
+            <w:tcW w:w="2952" w:type="dxa"/>
+          </w:tcPr>
+          <w:p>
+            <w:r>
+              <w:t>Save in UI, confirm success, confirm row appears in User Management, and confirm database user record exists.</w:t>
             </w:r>
           </w:p>
         </w:tc>
@@ -4577,31 +5157,31 @@
       <w:tr>
         <w:tc>
           <w:tcPr>
-            <w:tcW w:type="dxa" w:w="2880"/>
-          </w:tcPr>
-          <w:p>
-            <w:r>
-              <w:t>Part stock reconciliation</w:t>
-            </w:r>
-          </w:p>
-        </w:tc>
-        <w:tc>
-          <w:tcPr>
-            <w:tcW w:type="dxa" w:w="2880"/>
-          </w:tcPr>
-          <w:p>
-            <w:r>
-              <w:t>Expand SPL8006854 and find part 38061313. The total stock for that actual part across all warehouses should equal 10.</w:t>
-            </w:r>
-          </w:p>
-        </w:tc>
-        <w:tc>
-          <w:tcPr>
-            <w:tcW w:type="dxa" w:w="2880"/>
-          </w:tcPr>
-          <w:p>
-            <w:r>
-              <w:t>Fails if the part-level total uses master total, usage total, or another calculated value.</w:t>
+            <w:tcW w:w="2952" w:type="dxa"/>
+          </w:tcPr>
+          <w:p>
+            <w:r>
+              <w:t>Required field validation</w:t>
+            </w:r>
+          </w:p>
+        </w:tc>
+        <w:tc>
+          <w:tcPr>
+            <w:tcW w:w="2952" w:type="dxa"/>
+          </w:tcPr>
+          <w:p>
+            <w:r>
+              <w:t>Save is blocked if full name or email is blank, with a clear validation message.</w:t>
+            </w:r>
+          </w:p>
+        </w:tc>
+        <w:tc>
+          <w:tcPr>
+            <w:tcW w:w="2952" w:type="dxa"/>
+          </w:tcPr>
+          <w:p>
+            <w:r>
+              <w:t>Attempt to save incomplete form and confirm no database user record is created.</w:t>
             </w:r>
           </w:p>
         </w:tc>
@@ -4609,31 +5189,31 @@
       <w:tr>
         <w:tc>
           <w:tcPr>
-            <w:tcW w:type="dxa" w:w="2880"/>
-          </w:tcPr>
-          <w:p>
-            <w:r>
-              <w:t>Warehouse child sum</w:t>
-            </w:r>
-          </w:p>
-        </w:tc>
-        <w:tc>
-          <w:tcPr>
-            <w:tcW w:type="dxa" w:w="2880"/>
-          </w:tcPr>
-          <w:p>
-            <w:r>
-              <w:t>Under SPL8006854, FUJITSU should show 4 units for part 38061313 plus any other mapped alternatives present in FUJITSU.</w:t>
-            </w:r>
-          </w:p>
-        </w:tc>
-        <w:tc>
-          <w:tcPr>
-            <w:tcW w:type="dxa" w:w="2880"/>
-          </w:tcPr>
-          <w:p>
-            <w:r>
-              <w:t>Fails if the warehouse total does not equal the sum of visible child parts.</w:t>
+            <w:tcW w:w="2952" w:type="dxa"/>
+          </w:tcPr>
+          <w:p>
+            <w:r>
+              <w:t>Email validation</w:t>
+            </w:r>
+          </w:p>
+        </w:tc>
+        <w:tc>
+          <w:tcPr>
+            <w:tcW w:w="2952" w:type="dxa"/>
+          </w:tcPr>
+          <w:p>
+            <w:r>
+              <w:t>Invalid email format is rejected.</w:t>
+            </w:r>
+          </w:p>
+        </w:tc>
+        <w:tc>
+          <w:tcPr>
+            <w:tcW w:w="2952" w:type="dxa"/>
+          </w:tcPr>
+          <w:p>
+            <w:r>
+              <w:t>Attempt to save an invalid email and confirm validation error and no database insert.</w:t>
             </w:r>
           </w:p>
         </w:tc>
@@ -4641,31 +5221,40 @@
       <w:tr>
         <w:tc>
           <w:tcPr>
-            <w:tcW w:type="dxa" w:w="2880"/>
-          </w:tcPr>
-          <w:p>
-            <w:r>
-              <w:t>Expanded tree consistency</w:t>
-            </w:r>
-          </w:p>
-        </w:tc>
-        <w:tc>
-          <w:tcPr>
-            <w:tcW w:type="dxa" w:w="2880"/>
-          </w:tcPr>
-          <w:p>
-            <w:r>
-              <w:t>For any expanded master, parent total = sum of warehouse rows, and each warehouse row = sum of part rows.</w:t>
-            </w:r>
-          </w:p>
-        </w:tc>
-        <w:tc>
-          <w:tcPr>
-            <w:tcW w:type="dxa" w:w="2880"/>
-          </w:tcPr>
-          <w:p>
-            <w:r>
-              <w:t>Fails if parent/child totals do not reconcile.</w:t>
+            <w:tcW w:w="2952" w:type="dxa"/>
+          </w:tcPr>
+          <w:p>
+            <w:r>
+              <w:t>Duplicate email handling</w:t>
+            </w:r>
+          </w:p>
+        </w:tc>
+        <w:tc>
+          <w:tcPr>
+            <w:tcW w:w="2952" w:type="dxa"/>
+          </w:tcPr>
+          <w:p>
+            <w:r>
+              <w:t xml:space="preserve">Creating a second user with the same email is blocked or </w:t>
+            </w:r>
+            <w:r>
+              <w:lastRenderedPageBreak/>
+              <w:t>handled according to the agreed account rules.</w:t>
+            </w:r>
+          </w:p>
+        </w:tc>
+        <w:tc>
+          <w:tcPr>
+            <w:tcW w:w="2952" w:type="dxa"/>
+          </w:tcPr>
+          <w:p>
+            <w:r>
+              <w:lastRenderedPageBreak/>
+              <w:t xml:space="preserve">Attempt duplicate email and check UI error plus database </w:t>
+            </w:r>
+            <w:r>
+              <w:lastRenderedPageBreak/>
+              <w:t>uniqueness.</w:t>
             </w:r>
           </w:p>
         </w:tc>
@@ -4673,31 +5262,31 @@
       <w:tr>
         <w:tc>
           <w:tcPr>
-            <w:tcW w:type="dxa" w:w="2880"/>
-          </w:tcPr>
-          <w:p>
-            <w:r>
-              <w:t>Search by actual part</w:t>
-            </w:r>
-          </w:p>
-        </w:tc>
-        <w:tc>
-          <w:tcPr>
-            <w:tcW w:type="dxa" w:w="2880"/>
-          </w:tcPr>
-          <w:p>
-            <w:r>
-              <w:t>Search for 38061313. The page should return SPL8006854 and show 38061313 as the primary/actual part.</w:t>
-            </w:r>
-          </w:p>
-        </w:tc>
-        <w:tc>
-          <w:tcPr>
-            <w:tcW w:type="dxa" w:w="2880"/>
-          </w:tcPr>
-          <w:p>
-            <w:r>
-              <w:t>Fails if search only works by SPL Master and cannot find actual part numbers.</w:t>
+            <w:tcW w:w="2952" w:type="dxa"/>
+          </w:tcPr>
+          <w:p>
+            <w:r>
+              <w:t>Single module permission</w:t>
+            </w:r>
+          </w:p>
+        </w:tc>
+        <w:tc>
+          <w:tcPr>
+            <w:tcW w:w="2952" w:type="dxa"/>
+          </w:tcPr>
+          <w:p>
+            <w:r>
+              <w:t>Create a user with only Item Master enabled. On login, that user should only see/open Item Master and any required default pages.</w:t>
+            </w:r>
+          </w:p>
+        </w:tc>
+        <w:tc>
+          <w:tcPr>
+            <w:tcW w:w="2952" w:type="dxa"/>
+          </w:tcPr>
+          <w:p>
+            <w:r>
+              <w:t>Log in as created user and try both sidebar navigation and direct URLs for disabled modules.</w:t>
             </w:r>
           </w:p>
         </w:tc>
@@ -4705,31 +5294,31 @@
       <w:tr>
         <w:tc>
           <w:tcPr>
-            <w:tcW w:type="dxa" w:w="2880"/>
-          </w:tcPr>
-          <w:p>
-            <w:r>
-              <w:t>Tenant isolation</w:t>
-            </w:r>
-          </w:p>
-        </w:tc>
-        <w:tc>
-          <w:tcPr>
-            <w:tcW w:type="dxa" w:w="2880"/>
-          </w:tcPr>
-          <w:p>
-            <w:r>
-              <w:t>Search or browse should not show non-CoCre8 items or warehouses created from another customer dataset.</w:t>
-            </w:r>
-          </w:p>
-        </w:tc>
-        <w:tc>
-          <w:tcPr>
-            <w:tcW w:type="dxa" w:w="2880"/>
-          </w:tcPr>
-          <w:p>
-            <w:r>
-              <w:t>Fails if unrelated customer parts appear in the CoCre8 Item Master.</w:t>
+            <w:tcW w:w="2952" w:type="dxa"/>
+          </w:tcPr>
+          <w:p>
+            <w:r>
+              <w:t>Multiple module permissions</w:t>
+            </w:r>
+          </w:p>
+        </w:tc>
+        <w:tc>
+          <w:tcPr>
+            <w:tcW w:w="2952" w:type="dxa"/>
+          </w:tcPr>
+          <w:p>
+            <w:r>
+              <w:t>Create a user with Forecasting Home and Suggested PO enabled. User can access those modules and cannot access disabled modules.</w:t>
+            </w:r>
+          </w:p>
+        </w:tc>
+        <w:tc>
+          <w:tcPr>
+            <w:tcW w:w="2952" w:type="dxa"/>
+          </w:tcPr>
+          <w:p>
+            <w:r>
+              <w:t>Log in as created user and compare visible navigation with database permission rows.</w:t>
             </w:r>
           </w:p>
         </w:tc>
@@ -4737,36 +5326,69 @@
       <w:tr>
         <w:tc>
           <w:tcPr>
-            <w:tcW w:type="dxa" w:w="2880"/>
-          </w:tcPr>
-          <w:p>
-            <w:r>
-              <w:t>Virtual stock handling</w:t>
-            </w:r>
-          </w:p>
-        </w:tc>
-        <w:tc>
-          <w:tcPr>
-            <w:tcW w:type="dxa" w:w="2880"/>
-          </w:tcPr>
-          <w:p>
-            <w:r>
-              <w:t>If SCRPFUJ, FUJFAULT, QURN, or similar virtual/fault warehouses appear, they should be identifiable and should not be silently counted as available fulfilment stock elsewhere.</w:t>
-            </w:r>
-          </w:p>
-        </w:tc>
-        <w:tc>
-          <w:tcPr>
-            <w:tcW w:type="dxa" w:w="2880"/>
-          </w:tcPr>
-          <w:p>
-            <w:r>
-              <w:t>Fails if virtual stock is mixed into fulfilment totals without a clear label or filter.</w:t>
+            <w:tcW w:w="2952" w:type="dxa"/>
+          </w:tcPr>
+          <w:p>
+            <w:r>
+              <w:t>Permission persistence after refresh</w:t>
+            </w:r>
+          </w:p>
+        </w:tc>
+        <w:tc>
+          <w:tcPr>
+            <w:tcW w:w="2952" w:type="dxa"/>
+          </w:tcPr>
+          <w:p>
+            <w:r>
+              <w:t>Saved permissions remain correct after page refresh/logout/login.</w:t>
+            </w:r>
+          </w:p>
+        </w:tc>
+        <w:tc>
+          <w:tcPr>
+            <w:tcW w:w="2952" w:type="dxa"/>
+          </w:tcPr>
+          <w:p>
+            <w:r>
+              <w:t>Refresh admin page, reopen or inspect user details if available, and check database permission state.</w:t>
+            </w:r>
+          </w:p>
+        </w:tc>
+      </w:tr>
+      <w:tr>
+        <w:tc>
+          <w:tcPr>
+            <w:tcW w:w="2952" w:type="dxa"/>
+          </w:tcPr>
+          <w:p>
+            <w:r>
+              <w:t>No permission direct URL block</w:t>
+            </w:r>
+          </w:p>
+        </w:tc>
+        <w:tc>
+          <w:tcPr>
+            <w:tcW w:w="2952" w:type="dxa"/>
+          </w:tcPr>
+          <w:p>
+            <w:r>
+              <w:t>A user without a module permission cannot access that module by typing the URL.</w:t>
+            </w:r>
+          </w:p>
+        </w:tc>
+        <w:tc>
+          <w:tcPr>
+            <w:tcW w:w="2952" w:type="dxa"/>
+          </w:tcPr>
+          <w:p>
+            <w:r>
+              <w:t>Log in as restricted user, navigate directly to disabled route, confirm redirect/403/no access.</w:t>
             </w:r>
           </w:p>
         </w:tc>
       </w:tr>
     </w:tbl>
+    <w:p/>
     <w:p>
       <w:pPr>
         <w:pStyle w:val="Heading3"/>
@@ -4780,7 +5402,7 @@
         <w:pStyle w:val="ListBullet"/>
       </w:pPr>
       <w:r>
-        <w:t>Should the top-level stock total include all warehouses, or only active/replenishable fulfilment warehouses?</w:t>
+        <w:t>What is the expected first-login flow for a created user: password set email, temporary password, or SSO/invite?</w:t>
       </w:r>
     </w:p>
     <w:p>
@@ -4788,7 +5410,7 @@
         <w:pStyle w:val="ListBullet"/>
       </w:pPr>
       <w:r>
-        <w:t>Should virtual/fault/quarantine stock be shown in the tree but excluded from stock available for planning?</w:t>
+        <w:t>Should User Management include edit/delete/deactivate actions for MVP?</w:t>
       </w:r>
     </w:p>
     <w:p>
@@ -4796,7 +5418,7 @@
         <w:pStyle w:val="ListBullet"/>
       </w:pPr>
       <w:r>
-        <w:t>Should the page show inbound and allocated quantities as separate columns so stock differences can be explained?</w:t>
+        <w:t>Should module permissions be tenant-specific if the same email can access more than one customer tenant?</w:t>
       </w:r>
     </w:p>
     <w:p>
@@ -4809,9 +5431,10 @@
     </w:p>
     <w:p>
       <w:r>
-        <w:t>For MVP, the Item Master page is acceptable if it browses the correct CoCre8 part/master/warehouse tree and every stock count reconciles to WarehouseStockOnHand.quantityOnHand. The current screenshot values such as 160 for SPL8006854 should be treated as a calculation or data-binding defect until proven otherwise.</w:t>
-      </w:r>
-    </w:p>
+        <w:t>For MVP, this page is acceptable if an admin can create a user, persist module permissions, and the created user can log in with access restricted to the selected modules. Both UI login tests and database checks should be used to verify the result.</w:t>
+      </w:r>
+    </w:p>
+    <w:p/>
     <w:sectPr>
       <w:pgSz w:w="12240" w:h="15840"/>
       <w:pgMar w:top="1440" w:right="1800" w:bottom="1440" w:left="1800" w:header="720" w:footer="720" w:gutter="0"/>

</xml_diff>

<commit_message>
Add distribution acceptance criteria
</commit_message>
<xml_diff>
--- a/Acceptance Criteria and Unit Tests - updated.docx
+++ b/Acceptance Criteria and Unit Tests - updated.docx
@@ -5432,6 +5432,1484 @@
     <w:p>
       <w:r>
         <w:t>For MVP, this page is acceptable if an admin can create a user, persist module permissions, and the created user can log in with access restricted to the selected modules. Both UI login tests and database checks should be used to verify the result.</w:t>
+      </w:r>
+    </w:p>
+    <w:p>
+      <w:r>
+        <w:br w:type="page"/>
+      </w:r>
+    </w:p>
+    <w:p>
+      <w:pPr>
+        <w:pStyle w:val="Heading2"/>
+      </w:pPr>
+      <w:r>
+        <w:lastRenderedPageBreak/>
+        <w:t>Distribution Section</w:t>
+      </w:r>
+    </w:p>
+    <w:p>
+      <w:pPr>
+        <w:pStyle w:val="Heading3"/>
+      </w:pPr>
+      <w:r>
+        <w:t>Goal</w:t>
+      </w:r>
+    </w:p>
+    <w:p>
+      <w:r>
+        <w:t>The Distribution section should recommend inter-warehouse stock movements so stock is balanced against recent usage, current shortages, forecast need, manual mins, and warehouse exclusion rules. For CoCre8, recommendations must respect SPL Master/alternative part logic and must not treat dedicated customer stock as generally interchangeable stock.</w:t>
+      </w:r>
+    </w:p>
+    <w:p>
+      <w:pPr>
+        <w:pStyle w:val="Heading3"/>
+      </w:pPr>
+      <w:r>
+        <w:t>Sub-pages</w:t>
+      </w:r>
+    </w:p>
+    <w:p>
+      <w:pPr>
+        <w:pStyle w:val="ListBullet"/>
+      </w:pPr>
+      <w:r>
+        <w:t>Distribution Role</w:t>
+      </w:r>
+    </w:p>
+    <w:p>
+      <w:pPr>
+        <w:pStyle w:val="ListBullet"/>
+      </w:pPr>
+      <w:r>
+        <w:t>Distribution Transfer</w:t>
+      </w:r>
+    </w:p>
+    <w:p>
+      <w:pPr>
+        <w:pStyle w:val="ListBullet"/>
+      </w:pPr>
+      <w:r>
+        <w:t>Distribution Exclusions</w:t>
+      </w:r>
+    </w:p>
+    <w:p>
+      <w:pPr>
+        <w:pStyle w:val="ListBullet"/>
+      </w:pPr>
+      <w:r>
+        <w:t>Holidays</w:t>
+      </w:r>
+    </w:p>
+    <w:p>
+      <w:pPr>
+        <w:pStyle w:val="ListBullet"/>
+      </w:pPr>
+      <w:r>
+        <w:t>Shipping Bundle</w:t>
+      </w:r>
+    </w:p>
+    <w:p>
+      <w:pPr>
+        <w:pStyle w:val="Heading3"/>
+      </w:pPr>
+      <w:r>
+        <w:t>Distribution Role</w:t>
+      </w:r>
+    </w:p>
+    <w:p>
+      <w:pPr>
+        <w:pStyle w:val="Heading4"/>
+      </w:pPr>
+      <w:r>
+        <w:t>Acceptance Criteria</w:t>
+      </w:r>
+    </w:p>
+    <w:p>
+      <w:pPr>
+        <w:pStyle w:val="ListBullet"/>
+      </w:pPr>
+      <w:r>
+        <w:t>The page should show users or roles responsible for distribution work, including staff name, email, phone, role, warehouse, and actions.</w:t>
+      </w:r>
+    </w:p>
+    <w:p>
+      <w:pPr>
+        <w:pStyle w:val="ListBullet"/>
+      </w:pPr>
+      <w:r>
+        <w:t>There should be a way to create or assign the distribution user/role needed for this workflow.</w:t>
+      </w:r>
+    </w:p>
+    <w:p>
+      <w:pPr>
+        <w:pStyle w:val="ListBullet"/>
+      </w:pPr>
+      <w:r>
+        <w:t>If distribution roles are managed through User Management, this page should link clearly to User Management or show the assigned users from that module.</w:t>
+      </w:r>
+    </w:p>
+    <w:p>
+      <w:pPr>
+        <w:pStyle w:val="ListBullet"/>
+      </w:pPr>
+      <w:r>
+        <w:t>Created or assigned distribution roles should persist in the database and survive refresh/login.</w:t>
+      </w:r>
+    </w:p>
+    <w:p>
+      <w:pPr>
+        <w:pStyle w:val="ListBullet"/>
+      </w:pPr>
+      <w:r>
+        <w:t>Distribution role permissions should control who can approve, reject, or update distribution transfer recommendations.</w:t>
+      </w:r>
+    </w:p>
+    <w:p>
+      <w:pPr>
+        <w:pStyle w:val="Heading4"/>
+      </w:pPr>
+      <w:r>
+        <w:t>Test Cases</w:t>
+      </w:r>
+    </w:p>
+    <w:tbl>
+      <w:tblPr>
+        <w:tblStyle w:val="TableGrid"/>
+        <w:tblW w:w="0" w:type="auto"/>
+        <w:tblLayout w:type="fixed"/>
+        <w:tblLook w:val="04A0" w:firstRow="1" w:lastRow="0" w:firstColumn="1" w:lastColumn="0" w:noHBand="0" w:noVBand="1"/>
+      </w:tblPr>
+      <w:tblGrid>
+        <w:gridCol w:w="2952"/>
+        <w:gridCol w:w="2952"/>
+        <w:gridCol w:w="2952"/>
+      </w:tblGrid>
+      <w:tr>
+        <w:tc>
+          <w:tcPr>
+            <w:tcW w:w="2952" w:type="dxa"/>
+          </w:tcPr>
+          <w:p>
+            <w:r>
+              <w:t>Scenario</w:t>
+            </w:r>
+          </w:p>
+        </w:tc>
+        <w:tc>
+          <w:tcPr>
+            <w:tcW w:w="2952" w:type="dxa"/>
+          </w:tcPr>
+          <w:p>
+            <w:r>
+              <w:t>Expected Result</w:t>
+            </w:r>
+          </w:p>
+        </w:tc>
+        <w:tc>
+          <w:tcPr>
+            <w:tcW w:w="2952" w:type="dxa"/>
+          </w:tcPr>
+          <w:p>
+            <w:r>
+              <w:t>Pass / Fail Signal</w:t>
+            </w:r>
+          </w:p>
+        </w:tc>
+      </w:tr>
+      <w:tr>
+        <w:tc>
+          <w:tcPr>
+            <w:tcW w:w="2952" w:type="dxa"/>
+          </w:tcPr>
+          <w:p>
+            <w:r>
+              <w:t>Create or assign distribution role</w:t>
+            </w:r>
+          </w:p>
+        </w:tc>
+        <w:tc>
+          <w:tcPr>
+            <w:tcW w:w="2952" w:type="dxa"/>
+          </w:tcPr>
+          <w:p>
+            <w:r>
+              <w:t>An admin can create/assign a distribution role or is clearly routed to User Management to do it.</w:t>
+            </w:r>
+          </w:p>
+        </w:tc>
+        <w:tc>
+          <w:tcPr>
+            <w:tcW w:w="2952" w:type="dxa"/>
+          </w:tcPr>
+          <w:p>
+            <w:r>
+              <w:t>Fails if there is no create/assign route and no explanation.</w:t>
+            </w:r>
+          </w:p>
+        </w:tc>
+      </w:tr>
+      <w:tr>
+        <w:tc>
+          <w:tcPr>
+            <w:tcW w:w="2952" w:type="dxa"/>
+          </w:tcPr>
+          <w:p>
+            <w:r>
+              <w:t>Role persists</w:t>
+            </w:r>
+          </w:p>
+        </w:tc>
+        <w:tc>
+          <w:tcPr>
+            <w:tcW w:w="2952" w:type="dxa"/>
+          </w:tcPr>
+          <w:p>
+            <w:r>
+              <w:t>After creating/assigning the role, refresh the page and check the database. The role remains visible/persisted.</w:t>
+            </w:r>
+          </w:p>
+        </w:tc>
+        <w:tc>
+          <w:tcPr>
+            <w:tcW w:w="2952" w:type="dxa"/>
+          </w:tcPr>
+          <w:p>
+            <w:r>
+              <w:t>Fails if the row disappears or is not saved.</w:t>
+            </w:r>
+          </w:p>
+        </w:tc>
+      </w:tr>
+      <w:tr>
+        <w:tc>
+          <w:tcPr>
+            <w:tcW w:w="2952" w:type="dxa"/>
+          </w:tcPr>
+          <w:p>
+            <w:r>
+              <w:t>Permission effect</w:t>
+            </w:r>
+          </w:p>
+        </w:tc>
+        <w:tc>
+          <w:tcPr>
+            <w:tcW w:w="2952" w:type="dxa"/>
+          </w:tcPr>
+          <w:p>
+            <w:r>
+              <w:t>Log in as a user without distribution permissions and as one with them. Only the permitted user can update distribution transfer status.</w:t>
+            </w:r>
+          </w:p>
+        </w:tc>
+        <w:tc>
+          <w:tcPr>
+            <w:tcW w:w="2952" w:type="dxa"/>
+          </w:tcPr>
+          <w:p>
+            <w:r>
+              <w:t>Fails if all users can approve/update transfers.</w:t>
+            </w:r>
+          </w:p>
+        </w:tc>
+      </w:tr>
+    </w:tbl>
+    <w:p/>
+    <w:p>
+      <w:pPr>
+        <w:pStyle w:val="Heading3"/>
+      </w:pPr>
+      <w:r>
+        <w:t>Distribution Transfer</w:t>
+      </w:r>
+    </w:p>
+    <w:p>
+      <w:pPr>
+        <w:pStyle w:val="Heading4"/>
+      </w:pPr>
+      <w:r>
+        <w:t>Acceptance Criteria</w:t>
+      </w:r>
+    </w:p>
+    <w:p>
+      <w:pPr>
+        <w:pStyle w:val="ListBullet"/>
+      </w:pPr>
+      <w:r>
+        <w:t>The page should show transfer suggestions when one warehouse/location has a shortage and an allowed source warehouse has excess stock for the same SPL Master or a valid alternate part.</w:t>
+      </w:r>
+    </w:p>
+    <w:p>
+      <w:pPr>
+        <w:pStyle w:val="ListBullet"/>
+      </w:pPr>
+      <w:r>
+        <w:t>Recommendations should work at SPL Master level, while showing the actual part number proposed for transfer.</w:t>
+      </w:r>
+    </w:p>
+    <w:p>
+      <w:pPr>
+        <w:pStyle w:val="ListBullet"/>
+      </w:pPr>
+      <w:r>
+        <w:t>The transfer calculation should use WarehouseStockOnHand.quantityOnHand, quantityInbound, quantityAllocated, manual mins, calculated mins, and recent usage/forecast rules.</w:t>
+      </w:r>
+    </w:p>
+    <w:p>
+      <w:pPr>
+        <w:pStyle w:val="ListBullet"/>
+      </w:pPr>
+      <w:r>
+        <w:t>The page should respect WarehouseExclusions.csv and should not recommend transfers between excluded warehouse pairs or incompatible location types.</w:t>
+      </w:r>
+    </w:p>
+    <w:p>
+      <w:pPr>
+        <w:pStyle w:val="ListBullet"/>
+      </w:pPr>
+      <w:r>
+        <w:t>The page should show From Warehouse, To Warehouse, Part Number, SPL Master Code, Suggested Quantity, Approval Status, Created At, Transfer Type, and Actions.</w:t>
+      </w:r>
+    </w:p>
+    <w:p>
+      <w:pPr>
+        <w:pStyle w:val="ListBullet"/>
+      </w:pPr>
+      <w:r>
+        <w:t>Transfer Type should be clear and consistent. For CoCre8 main-stock balancing between FUJITSU and FUJ CT, Cross or Cross To may be appropriate if that is the system term for cross-location movement.</w:t>
+      </w:r>
+    </w:p>
+    <w:p>
+      <w:pPr>
+        <w:pStyle w:val="ListBullet"/>
+      </w:pPr>
+      <w:r>
+        <w:t>If no transfers are recommended, the page should show why: no shortage, no excess source stock, excluded warehouses, no min values, or calculation not configured.</w:t>
+      </w:r>
+    </w:p>
+    <w:p>
+      <w:pPr>
+        <w:pStyle w:val="ListBullet"/>
+      </w:pPr>
+      <w:r>
+        <w:t>Updating approval status should persist and should be audited.</w:t>
+      </w:r>
+    </w:p>
+    <w:p>
+      <w:pPr>
+        <w:pStyle w:val="Heading4"/>
+      </w:pPr>
+      <w:r>
+        <w:t>Test Cases</w:t>
+      </w:r>
+    </w:p>
+    <w:tbl>
+      <w:tblPr>
+        <w:tblStyle w:val="TableGrid"/>
+        <w:tblW w:w="0" w:type="auto"/>
+        <w:tblLayout w:type="fixed"/>
+        <w:tblLook w:val="04A0" w:firstRow="1" w:lastRow="0" w:firstColumn="1" w:lastColumn="0" w:noHBand="0" w:noVBand="1"/>
+      </w:tblPr>
+      <w:tblGrid>
+        <w:gridCol w:w="2952"/>
+        <w:gridCol w:w="2952"/>
+        <w:gridCol w:w="2952"/>
+      </w:tblGrid>
+      <w:tr>
+        <w:tc>
+          <w:tcPr>
+            <w:tcW w:w="2952" w:type="dxa"/>
+          </w:tcPr>
+          <w:p>
+            <w:r>
+              <w:t>Scenario</w:t>
+            </w:r>
+          </w:p>
+        </w:tc>
+        <w:tc>
+          <w:tcPr>
+            <w:tcW w:w="2952" w:type="dxa"/>
+          </w:tcPr>
+          <w:p>
+            <w:r>
+              <w:t>Expected Result</w:t>
+            </w:r>
+          </w:p>
+        </w:tc>
+        <w:tc>
+          <w:tcPr>
+            <w:tcW w:w="2952" w:type="dxa"/>
+          </w:tcPr>
+          <w:p>
+            <w:r>
+              <w:t>Pass / Fail Signal</w:t>
+            </w:r>
+          </w:p>
+        </w:tc>
+      </w:tr>
+      <w:tr>
+        <w:tc>
+          <w:tcPr>
+            <w:tcW w:w="2952" w:type="dxa"/>
+          </w:tcPr>
+          <w:p>
+            <w:r>
+              <w:t>Cape Town shortage with JHB excess</w:t>
+            </w:r>
+          </w:p>
+        </w:tc>
+        <w:tc>
+          <w:tcPr>
+            <w:tcW w:w="2952" w:type="dxa"/>
+          </w:tcPr>
+          <w:p>
+            <w:r>
+              <w:t>Set a manual min for FUJ CT above available stock and a lower min for FUJITSU for a shared part/SPL Master. Example fixture: part 34076231 / SPL8001866 has FUJ CT quantityOnHand 6 and FUJITSU quantityOnHand 8.</w:t>
+            </w:r>
+          </w:p>
+        </w:tc>
+        <w:tc>
+          <w:tcPr>
+            <w:tcW w:w="2952" w:type="dxa"/>
+          </w:tcPr>
+          <w:p>
+            <w:r>
+              <w:t>After regenerating distribution, the page should suggest a FUJITSU to FUJ CT transfer if the pair is allowed.</w:t>
+            </w:r>
+          </w:p>
+        </w:tc>
+      </w:tr>
+      <w:tr>
+        <w:tc>
+          <w:tcPr>
+            <w:tcW w:w="2952" w:type="dxa"/>
+          </w:tcPr>
+          <w:p>
+            <w:r>
+              <w:t>Alternative part transfer</w:t>
+            </w:r>
+          </w:p>
+        </w:tc>
+        <w:tc>
+          <w:tcPr>
+            <w:tcW w:w="2952" w:type="dxa"/>
+          </w:tcPr>
+          <w:p>
+            <w:r>
+              <w:t>Create a shortage for an SPL Master where FUJ CT lacks the primary part but FUJITSU has a valid alternate mapped to the same SPL Master.</w:t>
+            </w:r>
+          </w:p>
+        </w:tc>
+        <w:tc>
+          <w:tcPr>
+            <w:tcW w:w="2952" w:type="dxa"/>
+          </w:tcPr>
+          <w:p>
+            <w:r>
+              <w:t>The suggestion should show the actual alternate part and the shared SPL Master, not treat it as a mismatch.</w:t>
+            </w:r>
+          </w:p>
+        </w:tc>
+      </w:tr>
+      <w:tr>
+        <w:tc>
+          <w:tcPr>
+            <w:tcW w:w="2952" w:type="dxa"/>
+          </w:tcPr>
+          <w:p>
+            <w:r>
+              <w:t>Excluded pair blocked</w:t>
+            </w:r>
+          </w:p>
+        </w:tc>
+        <w:tc>
+          <w:tcPr>
+            <w:tcW w:w="2952" w:type="dxa"/>
+          </w:tcPr>
+          <w:p>
+            <w:r>
+              <w:t>Pick a warehouse pair present in WarehouseExclusions.csv and create a shortage/source-stock situation for it.</w:t>
+            </w:r>
+          </w:p>
+        </w:tc>
+        <w:tc>
+          <w:tcPr>
+            <w:tcW w:w="2952" w:type="dxa"/>
+          </w:tcPr>
+          <w:p>
+            <w:r>
+              <w:t>No transfer should be recommended between that excluded pair.</w:t>
+            </w:r>
+          </w:p>
+        </w:tc>
+      </w:tr>
+      <w:tr>
+        <w:tc>
+          <w:tcPr>
+            <w:tcW w:w="2952" w:type="dxa"/>
+          </w:tcPr>
+          <w:p>
+            <w:r>
+              <w:t>No excess source stock</w:t>
+            </w:r>
+          </w:p>
+        </w:tc>
+        <w:tc>
+          <w:tcPr>
+            <w:tcW w:w="2952" w:type="dxa"/>
+          </w:tcPr>
+          <w:p>
+            <w:r>
+              <w:t>Create a shortage where no allowed warehouse has excess stock.</w:t>
+            </w:r>
+          </w:p>
+        </w:tc>
+        <w:tc>
+          <w:tcPr>
+            <w:tcW w:w="2952" w:type="dxa"/>
+          </w:tcPr>
+          <w:p>
+            <w:r>
+              <w:t>No transfer should be created, and the reason should be visible or diagnosable.</w:t>
+            </w:r>
+          </w:p>
+        </w:tc>
+      </w:tr>
+      <w:tr>
+        <w:tc>
+          <w:tcPr>
+            <w:tcW w:w="2952" w:type="dxa"/>
+          </w:tcPr>
+          <w:p>
+            <w:r>
+              <w:t>Approval status update</w:t>
+            </w:r>
+          </w:p>
+        </w:tc>
+        <w:tc>
+          <w:tcPr>
+            <w:tcW w:w="2952" w:type="dxa"/>
+          </w:tcPr>
+          <w:p>
+            <w:r>
+              <w:t>Select a suggested transfer and update the approval status.</w:t>
+            </w:r>
+          </w:p>
+        </w:tc>
+        <w:tc>
+          <w:tcPr>
+            <w:tcW w:w="2952" w:type="dxa"/>
+          </w:tcPr>
+          <w:p>
+            <w:r>
+              <w:t>Status persists after refresh and is visible in the database/audit trail.</w:t>
+            </w:r>
+          </w:p>
+        </w:tc>
+      </w:tr>
+      <w:tr>
+        <w:tc>
+          <w:tcPr>
+            <w:tcW w:w="2952" w:type="dxa"/>
+          </w:tcPr>
+          <w:p>
+            <w:r>
+              <w:t>Export</w:t>
+            </w:r>
+          </w:p>
+        </w:tc>
+        <w:tc>
+          <w:tcPr>
+            <w:tcW w:w="2952" w:type="dxa"/>
+          </w:tcPr>
+          <w:p>
+            <w:r>
+              <w:t>Export Distribution Transfer rows.</w:t>
+            </w:r>
+          </w:p>
+        </w:tc>
+        <w:tc>
+          <w:tcPr>
+            <w:tcW w:w="2952" w:type="dxa"/>
+          </w:tcPr>
+          <w:p>
+            <w:r>
+              <w:t>Export matches the rows and values shown on screen.</w:t>
+            </w:r>
+          </w:p>
+        </w:tc>
+      </w:tr>
+    </w:tbl>
+    <w:p/>
+    <w:p>
+      <w:pPr>
+        <w:pStyle w:val="Heading3"/>
+      </w:pPr>
+      <w:r>
+        <w:t>Distribution Exclusions</w:t>
+      </w:r>
+    </w:p>
+    <w:p>
+      <w:pPr>
+        <w:pStyle w:val="Heading4"/>
+      </w:pPr>
+      <w:r>
+        <w:t>Current Uploaded File</w:t>
+      </w:r>
+    </w:p>
+    <w:p>
+      <w:pPr>
+        <w:pStyle w:val="ListBullet"/>
+      </w:pPr>
+      <w:r>
+        <w:t>Current uploaded WarehouseExclusions.csv has 1,462 rows.</w:t>
+      </w:r>
+    </w:p>
+    <w:p>
+      <w:pPr>
+        <w:pStyle w:val="ListBullet"/>
+      </w:pPr>
+      <w:r>
+        <w:t>Columns are Secondary TO, Secondary FROM, Cross TO, Cross FROM, and Primary TO.</w:t>
+      </w:r>
+    </w:p>
+    <w:p>
+      <w:pPr>
+        <w:pStyle w:val="ListBullet"/>
+      </w:pPr>
+      <w:r>
+        <w:t>Secondary TO/FROM and Cross TO/FROM are populated in the current upload; Primary TO is blank in the current upload.</w:t>
+      </w:r>
+    </w:p>
+    <w:p>
+      <w:pPr>
+        <w:pStyle w:val="ListBullet"/>
+      </w:pPr>
+      <w:r>
+        <w:t>The Exclusion Sites tab currently showing No items is suspicious if it is meant to mirror the uploaded exclusion-site rows.</w:t>
+      </w:r>
+    </w:p>
+    <w:p>
+      <w:pPr>
+        <w:pStyle w:val="Heading4"/>
+      </w:pPr>
+      <w:r>
+        <w:t>Acceptance Criteria</w:t>
+      </w:r>
+    </w:p>
+    <w:p>
+      <w:pPr>
+        <w:pStyle w:val="ListBullet"/>
+      </w:pPr>
+      <w:r>
+        <w:t>The page should have the two tabs shown in the UI: Exclusion Sites and Location Types.</w:t>
+      </w:r>
+    </w:p>
+    <w:p>
+      <w:pPr>
+        <w:pStyle w:val="ListBullet"/>
+      </w:pPr>
+      <w:r>
+        <w:t>Location Types should mirror the ingested or configured location type rules and should persist changes after Save.</w:t>
+      </w:r>
+    </w:p>
+    <w:p>
+      <w:pPr>
+        <w:pStyle w:val="ListBullet"/>
+      </w:pPr>
+      <w:r>
+        <w:t>Exclusion Sites should show the uploaded warehouse-pair/site exclusion rules if that tab is intended to display WarehouseExclusions.csv.</w:t>
+      </w:r>
+    </w:p>
+    <w:p>
+      <w:pPr>
+        <w:pStyle w:val="ListBullet"/>
+      </w:pPr>
+      <w:r>
+        <w:t>The page should make clear whether entries are exclusions or allowed movements; the wording must not be ambiguous for planners.</w:t>
+      </w:r>
+    </w:p>
+    <w:p>
+      <w:pPr>
+        <w:pStyle w:val="ListBullet"/>
+      </w:pPr>
+      <w:r>
+        <w:t>The distribution transfer engine should use the same exclusion rules shown here.</w:t>
+      </w:r>
+    </w:p>
+    <w:p>
+      <w:pPr>
+        <w:pStyle w:val="ListBullet"/>
+      </w:pPr>
+      <w:r>
+        <w:t>For CoCre8, dedicated customer stock should not be treated as interchangeable with main stock unless explicitly allowed.</w:t>
+      </w:r>
+    </w:p>
+    <w:p>
+      <w:pPr>
+        <w:pStyle w:val="ListBullet"/>
+      </w:pPr>
+      <w:r>
+        <w:t>If Exclusion Sites is not intended to use WarehouseExclusions.csv, the page needs a documented definition from Chris or the vendor.</w:t>
+      </w:r>
+    </w:p>
+    <w:p>
+      <w:pPr>
+        <w:pStyle w:val="Heading4"/>
+      </w:pPr>
+      <w:r>
+        <w:t>Test Cases</w:t>
+      </w:r>
+    </w:p>
+    <w:tbl>
+      <w:tblPr>
+        <w:tblStyle w:val="TableGrid"/>
+        <w:tblW w:w="0" w:type="auto"/>
+        <w:tblLayout w:type="fixed"/>
+        <w:tblLook w:val="04A0" w:firstRow="1" w:lastRow="0" w:firstColumn="1" w:lastColumn="0" w:noHBand="0" w:noVBand="1"/>
+      </w:tblPr>
+      <w:tblGrid>
+        <w:gridCol w:w="2952"/>
+        <w:gridCol w:w="2952"/>
+        <w:gridCol w:w="2952"/>
+      </w:tblGrid>
+      <w:tr>
+        <w:tc>
+          <w:tcPr>
+            <w:tcW w:w="2952" w:type="dxa"/>
+          </w:tcPr>
+          <w:p>
+            <w:r>
+              <w:t>Scenario</w:t>
+            </w:r>
+          </w:p>
+        </w:tc>
+        <w:tc>
+          <w:tcPr>
+            <w:tcW w:w="2952" w:type="dxa"/>
+          </w:tcPr>
+          <w:p>
+            <w:r>
+              <w:t>Expected Result</w:t>
+            </w:r>
+          </w:p>
+        </w:tc>
+        <w:tc>
+          <w:tcPr>
+            <w:tcW w:w="2952" w:type="dxa"/>
+          </w:tcPr>
+          <w:p>
+            <w:r>
+              <w:t>Pass / Fail Signal</w:t>
+            </w:r>
+          </w:p>
+        </w:tc>
+      </w:tr>
+      <w:tr>
+        <w:tc>
+          <w:tcPr>
+            <w:tcW w:w="2952" w:type="dxa"/>
+          </w:tcPr>
+          <w:p>
+            <w:r>
+              <w:t>Location Types mirror config</w:t>
+            </w:r>
+          </w:p>
+        </w:tc>
+        <w:tc>
+          <w:tcPr>
+            <w:tcW w:w="2952" w:type="dxa"/>
+          </w:tcPr>
+          <w:p>
+            <w:r>
+              <w:t>Open Location Types and compare checked boxes to the ingested/configured location type rules. Save, refresh, and re-open.</w:t>
+            </w:r>
+          </w:p>
+        </w:tc>
+        <w:tc>
+          <w:tcPr>
+            <w:tcW w:w="2952" w:type="dxa"/>
+          </w:tcPr>
+          <w:p>
+            <w:r>
+              <w:t>Fails if the UI state changes or does not persist.</w:t>
+            </w:r>
+          </w:p>
+        </w:tc>
+      </w:tr>
+      <w:tr>
+        <w:tc>
+          <w:tcPr>
+            <w:tcW w:w="2952" w:type="dxa"/>
+          </w:tcPr>
+          <w:p>
+            <w:r>
+              <w:t>Exclusion file visibility</w:t>
+            </w:r>
+          </w:p>
+        </w:tc>
+        <w:tc>
+          <w:tcPr>
+            <w:tcW w:w="2952" w:type="dxa"/>
+          </w:tcPr>
+          <w:p>
+            <w:r>
+              <w:t>Open Exclusion Sites after uploading WarehouseExclusions.csv with 1,462 rows.</w:t>
+            </w:r>
+          </w:p>
+        </w:tc>
+        <w:tc>
+          <w:tcPr>
+            <w:tcW w:w="2952" w:type="dxa"/>
+          </w:tcPr>
+          <w:p>
+            <w:r>
+              <w:t>Fails if it shows No items and this tab is supposed to display uploaded site/pair exclusions.</w:t>
+            </w:r>
+          </w:p>
+        </w:tc>
+      </w:tr>
+      <w:tr>
+        <w:tc>
+          <w:tcPr>
+            <w:tcW w:w="2952" w:type="dxa"/>
+          </w:tcPr>
+          <w:p>
+            <w:r>
+              <w:t>Rule applied to transfer</w:t>
+            </w:r>
+          </w:p>
+        </w:tc>
+        <w:tc>
+          <w:tcPr>
+            <w:tcW w:w="2952" w:type="dxa"/>
+          </w:tcPr>
+          <w:p>
+            <w:r>
+              <w:t>Choose a pair in WarehouseExclusions.csv and create a transfer scenario between those warehouses.</w:t>
+            </w:r>
+          </w:p>
+        </w:tc>
+        <w:tc>
+          <w:tcPr>
+            <w:tcW w:w="2952" w:type="dxa"/>
+          </w:tcPr>
+          <w:p>
+            <w:r>
+              <w:t>Fails if Distribution Transfer recommends a movement that the exclusion page/file says should be blocked.</w:t>
+            </w:r>
+          </w:p>
+        </w:tc>
+      </w:tr>
+      <w:tr>
+        <w:tc>
+          <w:tcPr>
+            <w:tcW w:w="2952" w:type="dxa"/>
+          </w:tcPr>
+          <w:p>
+            <w:r>
+              <w:t>Dedicated stock rule</w:t>
+            </w:r>
+          </w:p>
+        </w:tc>
+        <w:tc>
+          <w:tcPr>
+            <w:tcW w:w="2952" w:type="dxa"/>
+          </w:tcPr>
+          <w:p>
+            <w:r>
+              <w:t>Create a case where main stock has shortage but Massmart stock has excess.</w:t>
+            </w:r>
+          </w:p>
+        </w:tc>
+        <w:tc>
+          <w:tcPr>
+            <w:tcW w:w="2952" w:type="dxa"/>
+          </w:tcPr>
+          <w:p>
+            <w:r>
+              <w:t>The tool should not recommend moving Massmart dedicated stock to main stock unless a rule explicitly allows it.</w:t>
+            </w:r>
+          </w:p>
+        </w:tc>
+      </w:tr>
+    </w:tbl>
+    <w:p/>
+    <w:p>
+      <w:pPr>
+        <w:pStyle w:val="Heading3"/>
+      </w:pPr>
+      <w:r>
+        <w:t>Holidays</w:t>
+      </w:r>
+    </w:p>
+    <w:p>
+      <w:pPr>
+        <w:pStyle w:val="Heading4"/>
+      </w:pPr>
+      <w:r>
+        <w:t>Acceptance Criteria</w:t>
+      </w:r>
+    </w:p>
+    <w:p>
+      <w:pPr>
+        <w:pStyle w:val="ListBullet"/>
+      </w:pPr>
+      <w:r>
+        <w:t>The page should allow a user to create a holiday record for a primary part and warehouse, or globally if global holidays are supported.</w:t>
+      </w:r>
+    </w:p>
+    <w:p>
+      <w:pPr>
+        <w:pStyle w:val="ListBullet"/>
+      </w:pPr>
+      <w:r>
+        <w:t>Start date and end date should be required and validated as dates.</w:t>
+      </w:r>
+    </w:p>
+    <w:p>
+      <w:pPr>
+        <w:pStyle w:val="ListBullet"/>
+      </w:pPr>
+      <w:r>
+        <w:t>End date should not be before start date.</w:t>
+      </w:r>
+    </w:p>
+    <w:p>
+      <w:pPr>
+        <w:pStyle w:val="ListBullet"/>
+      </w:pPr>
+      <w:r>
+        <w:t>Created holidays should appear in the holiday table and persist in the database.</w:t>
+      </w:r>
+    </w:p>
+    <w:p>
+      <w:pPr>
+        <w:pStyle w:val="ListBullet"/>
+      </w:pPr>
+      <w:r>
+        <w:t>Holidays should affect distribution scheduling or expected transfer dates if the distribution engine supports date planning.</w:t>
+      </w:r>
+    </w:p>
+    <w:p>
+      <w:pPr>
+        <w:pStyle w:val="ListBullet"/>
+      </w:pPr>
+      <w:r>
+        <w:t>Deleting or editing a holiday should update the table and database.</w:t>
+      </w:r>
+    </w:p>
+    <w:p>
+      <w:pPr>
+        <w:pStyle w:val="Heading4"/>
+      </w:pPr>
+      <w:r>
+        <w:t>Test Cases</w:t>
+      </w:r>
+    </w:p>
+    <w:tbl>
+      <w:tblPr>
+        <w:tblStyle w:val="TableGrid"/>
+        <w:tblW w:w="0" w:type="auto"/>
+        <w:tblLayout w:type="fixed"/>
+        <w:tblLook w:val="04A0" w:firstRow="1" w:lastRow="0" w:firstColumn="1" w:lastColumn="0" w:noHBand="0" w:noVBand="1"/>
+      </w:tblPr>
+      <w:tblGrid>
+        <w:gridCol w:w="2952"/>
+        <w:gridCol w:w="2952"/>
+        <w:gridCol w:w="2952"/>
+      </w:tblGrid>
+      <w:tr>
+        <w:tc>
+          <w:tcPr>
+            <w:tcW w:w="2952" w:type="dxa"/>
+          </w:tcPr>
+          <w:p>
+            <w:r>
+              <w:t>Scenario</w:t>
+            </w:r>
+          </w:p>
+        </w:tc>
+        <w:tc>
+          <w:tcPr>
+            <w:tcW w:w="2952" w:type="dxa"/>
+          </w:tcPr>
+          <w:p>
+            <w:r>
+              <w:t>Expected Result</w:t>
+            </w:r>
+          </w:p>
+        </w:tc>
+        <w:tc>
+          <w:tcPr>
+            <w:tcW w:w="2952" w:type="dxa"/>
+          </w:tcPr>
+          <w:p>
+            <w:r>
+              <w:t>Pass / Fail Signal</w:t>
+            </w:r>
+          </w:p>
+        </w:tc>
+      </w:tr>
+      <w:tr>
+        <w:tc>
+          <w:tcPr>
+            <w:tcW w:w="2952" w:type="dxa"/>
+          </w:tcPr>
+          <w:p>
+            <w:r>
+              <w:t>Create holiday</w:t>
+            </w:r>
+          </w:p>
+        </w:tc>
+        <w:tc>
+          <w:tcPr>
+            <w:tcW w:w="2952" w:type="dxa"/>
+          </w:tcPr>
+          <w:p>
+            <w:r>
+              <w:t>Create a holiday for part 34076231 and warehouse FUJ CT with a valid date range.</w:t>
+            </w:r>
+          </w:p>
+        </w:tc>
+        <w:tc>
+          <w:tcPr>
+            <w:tcW w:w="2952" w:type="dxa"/>
+          </w:tcPr>
+          <w:p>
+            <w:r>
+              <w:t>Holiday appears in the table and database.</w:t>
+            </w:r>
+          </w:p>
+        </w:tc>
+      </w:tr>
+      <w:tr>
+        <w:tc>
+          <w:tcPr>
+            <w:tcW w:w="2952" w:type="dxa"/>
+          </w:tcPr>
+          <w:p>
+            <w:r>
+              <w:t>Invalid date range</w:t>
+            </w:r>
+          </w:p>
+        </w:tc>
+        <w:tc>
+          <w:tcPr>
+            <w:tcW w:w="2952" w:type="dxa"/>
+          </w:tcPr>
+          <w:p>
+            <w:r>
+              <w:t>Try to create a holiday where end date is before start date.</w:t>
+            </w:r>
+          </w:p>
+        </w:tc>
+        <w:tc>
+          <w:tcPr>
+            <w:tcW w:w="2952" w:type="dxa"/>
+          </w:tcPr>
+          <w:p>
+            <w:r>
+              <w:t>Save is blocked and no database record is created.</w:t>
+            </w:r>
+          </w:p>
+        </w:tc>
+      </w:tr>
+      <w:tr>
+        <w:tc>
+          <w:tcPr>
+            <w:tcW w:w="2952" w:type="dxa"/>
+          </w:tcPr>
+          <w:p>
+            <w:r>
+              <w:t>Distribution effect</w:t>
+            </w:r>
+          </w:p>
+        </w:tc>
+        <w:tc>
+          <w:tcPr>
+            <w:tcW w:w="2952" w:type="dxa"/>
+          </w:tcPr>
+          <w:p>
+            <w:r>
+              <w:t>Create a holiday on the expected transfer date for a known transfer scenario, then regenerate distribution.</w:t>
+            </w:r>
+          </w:p>
+        </w:tc>
+        <w:tc>
+          <w:tcPr>
+            <w:tcW w:w="2952" w:type="dxa"/>
+          </w:tcPr>
+          <w:p>
+            <w:r>
+              <w:t>Expected transfer/date scheduling changes or the page clearly states holidays are not used by the engine.</w:t>
+            </w:r>
+          </w:p>
+        </w:tc>
+      </w:tr>
+      <w:tr>
+        <w:tc>
+          <w:tcPr>
+            <w:tcW w:w="2952" w:type="dxa"/>
+          </w:tcPr>
+          <w:p>
+            <w:r>
+              <w:t>Delete holiday</w:t>
+            </w:r>
+          </w:p>
+        </w:tc>
+        <w:tc>
+          <w:tcPr>
+            <w:tcW w:w="2952" w:type="dxa"/>
+          </w:tcPr>
+          <w:p>
+            <w:r>
+              <w:t>Delete the test holiday.</w:t>
+            </w:r>
+          </w:p>
+        </w:tc>
+        <w:tc>
+          <w:tcPr>
+            <w:tcW w:w="2952" w:type="dxa"/>
+          </w:tcPr>
+          <w:p>
+            <w:r>
+              <w:t>Holiday is removed from UI and database.</w:t>
+            </w:r>
+          </w:p>
+        </w:tc>
+      </w:tr>
+    </w:tbl>
+    <w:p/>
+    <w:p>
+      <w:pPr>
+        <w:pStyle w:val="Heading3"/>
+      </w:pPr>
+      <w:r>
+        <w:t>Shipping Bundle</w:t>
+      </w:r>
+    </w:p>
+    <w:p>
+      <w:pPr>
+        <w:pStyle w:val="Heading4"/>
+      </w:pPr>
+      <w:r>
+        <w:t>Acceptance Criteria</w:t>
+      </w:r>
+    </w:p>
+    <w:p>
+      <w:pPr>
+        <w:pStyle w:val="ListBullet"/>
+      </w:pPr>
+      <w:r>
+        <w:t>The page should allow creation of a bundle made from multiple related parts, not only multiple units of a single primary part.</w:t>
+      </w:r>
+    </w:p>
+    <w:p>
+      <w:pPr>
+        <w:pStyle w:val="ListBullet"/>
+      </w:pPr>
+      <w:r>
+        <w:t>A bundle should have a bundle name or primary anchor part plus one or more component lines.</w:t>
+      </w:r>
+    </w:p>
+    <w:p>
+      <w:pPr>
+        <w:pStyle w:val="ListBullet"/>
+      </w:pPr>
+      <w:r>
+        <w:t>Each component line should include part number, description, and required quantity.</w:t>
+      </w:r>
+    </w:p>
+    <w:p>
+      <w:pPr>
+        <w:pStyle w:val="ListBullet"/>
+      </w:pPr>
+      <w:r>
+        <w:t>Examples of expected bundles include hard drive plus rack/mount, PSU plus power cable, or CPU plus thermal grease.</w:t>
+      </w:r>
+    </w:p>
+    <w:p>
+      <w:pPr>
+        <w:pStyle w:val="ListBullet"/>
+      </w:pPr>
+      <w:r>
+        <w:t>The table should show created bundles and allow view/edit/delete actions.</w:t>
+      </w:r>
+    </w:p>
+    <w:p>
+      <w:pPr>
+        <w:pStyle w:val="ListBullet"/>
+      </w:pPr>
+      <w:r>
+        <w:t>Created bundles should persist in the database.</w:t>
+      </w:r>
+    </w:p>
+    <w:p>
+      <w:pPr>
+        <w:pStyle w:val="ListBullet"/>
+      </w:pPr>
+      <w:r>
+        <w:t>Distribution or PO recommendations should account for bundle components if the planning engine uses bundles.</w:t>
+      </w:r>
+    </w:p>
+    <w:p>
+      <w:pPr>
+        <w:pStyle w:val="ListBullet"/>
+      </w:pPr>
+      <w:r>
+        <w:t>The current modal shown in the screenshot appears too shallow because it only captures Primary Part Code and Quantity.</w:t>
+      </w:r>
+    </w:p>
+    <w:p>
+      <w:pPr>
+        <w:pStyle w:val="Heading4"/>
+      </w:pPr>
+      <w:r>
+        <w:t>Test Cases</w:t>
+      </w:r>
+    </w:p>
+    <w:tbl>
+      <w:tblPr>
+        <w:tblStyle w:val="TableGrid"/>
+        <w:tblW w:w="0" w:type="auto"/>
+        <w:tblLayout w:type="fixed"/>
+        <w:tblLook w:val="04A0" w:firstRow="1" w:lastRow="0" w:firstColumn="1" w:lastColumn="0" w:noHBand="0" w:noVBand="1"/>
+      </w:tblPr>
+      <w:tblGrid>
+        <w:gridCol w:w="2952"/>
+        <w:gridCol w:w="2952"/>
+        <w:gridCol w:w="2952"/>
+      </w:tblGrid>
+      <w:tr>
+        <w:tc>
+          <w:tcPr>
+            <w:tcW w:w="2952" w:type="dxa"/>
+          </w:tcPr>
+          <w:p>
+            <w:r>
+              <w:t>Scenario</w:t>
+            </w:r>
+          </w:p>
+        </w:tc>
+        <w:tc>
+          <w:tcPr>
+            <w:tcW w:w="2952" w:type="dxa"/>
+          </w:tcPr>
+          <w:p>
+            <w:r>
+              <w:t>Expected Result</w:t>
+            </w:r>
+          </w:p>
+        </w:tc>
+        <w:tc>
+          <w:tcPr>
+            <w:tcW w:w="2952" w:type="dxa"/>
+          </w:tcPr>
+          <w:p>
+            <w:r>
+              <w:t>Pass / Fail Signal</w:t>
+            </w:r>
+          </w:p>
+        </w:tc>
+      </w:tr>
+      <w:tr>
+        <w:tc>
+          <w:tcPr>
+            <w:tcW w:w="2952" w:type="dxa"/>
+          </w:tcPr>
+          <w:p>
+            <w:r>
+              <w:t>Create single-part quantity bundle</w:t>
+            </w:r>
+          </w:p>
+        </w:tc>
+        <w:tc>
+          <w:tcPr>
+            <w:tcW w:w="2952" w:type="dxa"/>
+          </w:tcPr>
+          <w:p>
+            <w:r>
+              <w:t>Create a bundle for primary part 38061313 with quantity 2.</w:t>
+            </w:r>
+          </w:p>
+        </w:tc>
+        <w:tc>
+          <w:tcPr>
+            <w:tcW w:w="2952" w:type="dxa"/>
+          </w:tcPr>
+          <w:p>
+            <w:r>
+              <w:t>This basic record saves and appears in the table, but it only proves the current narrow implementation.</w:t>
+            </w:r>
+          </w:p>
+        </w:tc>
+      </w:tr>
+      <w:tr>
+        <w:tc>
+          <w:tcPr>
+            <w:tcW w:w="2952" w:type="dxa"/>
+          </w:tcPr>
+          <w:p>
+            <w:r>
+              <w:t>Create multi-part bundle</w:t>
+            </w:r>
+          </w:p>
+        </w:tc>
+        <w:tc>
+          <w:tcPr>
+            <w:tcW w:w="2952" w:type="dxa"/>
+          </w:tcPr>
+          <w:p>
+            <w:r>
+              <w:t>Create a bundle with at least two different part numbers, for example a CPU part and thermal grease.</w:t>
+            </w:r>
+          </w:p>
+        </w:tc>
+        <w:tc>
+          <w:tcPr>
+            <w:tcW w:w="2952" w:type="dxa"/>
+          </w:tcPr>
+          <w:p>
+            <w:r>
+              <w:t>Passes only if the UI supports multiple component lines; fails if it only allows one part code.</w:t>
+            </w:r>
+          </w:p>
+        </w:tc>
+      </w:tr>
+      <w:tr>
+        <w:tc>
+          <w:tcPr>
+            <w:tcW w:w="2952" w:type="dxa"/>
+          </w:tcPr>
+          <w:p>
+            <w:r>
+              <w:t>Edit bundle components</w:t>
+            </w:r>
+          </w:p>
+        </w:tc>
+        <w:tc>
+          <w:tcPr>
+            <w:tcW w:w="2952" w:type="dxa"/>
+          </w:tcPr>
+          <w:p>
+            <w:r>
+              <w:t>Edit an existing bundle and change a component quantity or add/remove a component.</w:t>
+            </w:r>
+          </w:p>
+        </w:tc>
+        <w:tc>
+          <w:tcPr>
+            <w:tcW w:w="2952" w:type="dxa"/>
+          </w:tcPr>
+          <w:p>
+            <w:r>
+              <w:t>Changes persist after refresh and in database.</w:t>
+            </w:r>
+          </w:p>
+        </w:tc>
+      </w:tr>
+      <w:tr>
+        <w:tc>
+          <w:tcPr>
+            <w:tcW w:w="2952" w:type="dxa"/>
+          </w:tcPr>
+          <w:p>
+            <w:r>
+              <w:t>Bundle affects recommendation</w:t>
+            </w:r>
+          </w:p>
+        </w:tc>
+        <w:tc>
+          <w:tcPr>
+            <w:tcW w:w="2952" w:type="dxa"/>
+          </w:tcPr>
+          <w:p>
+            <w:r>
+              <w:t>Create a bundle that should add a linked component to a PO or transfer recommendation.</w:t>
+            </w:r>
+          </w:p>
+        </w:tc>
+        <w:tc>
+          <w:tcPr>
+            <w:tcW w:w="2952" w:type="dxa"/>
+          </w:tcPr>
+          <w:p>
+            <w:r>
+              <w:t>Recommendation includes or flags the linked component, or the system documents that bundles are informational only.</w:t>
+            </w:r>
+          </w:p>
+        </w:tc>
+      </w:tr>
+    </w:tbl>
+    <w:p/>
+    <w:p>
+      <w:pPr>
+        <w:pStyle w:val="Heading3"/>
+      </w:pPr>
+      <w:r>
+        <w:t>Open Questions</w:t>
+      </w:r>
+    </w:p>
+    <w:p>
+      <w:pPr>
+        <w:pStyle w:val="ListBullet"/>
+      </w:pPr>
+      <w:r>
+        <w:t>What exactly does Distribution Role need to control: visibility only, transfer approval, or operational ownership by warehouse?</w:t>
+      </w:r>
+    </w:p>
+    <w:p>
+      <w:pPr>
+        <w:pStyle w:val="ListBullet"/>
+      </w:pPr>
+      <w:r>
+        <w:t>What is the exact meaning of Secondary TO, Secondary FROM, Cross TO, Cross FROM, and Primary TO in the vendor algorithm?</w:t>
+      </w:r>
+    </w:p>
+    <w:p>
+      <w:pPr>
+        <w:pStyle w:val="ListBullet"/>
+      </w:pPr>
+      <w:r>
+        <w:t>Should Exclusion Sites show warehouse-pair exclusions from WarehouseExclusions.csv, or a different object?</w:t>
+      </w:r>
+    </w:p>
+    <w:p>
+      <w:pPr>
+        <w:pStyle w:val="ListBullet"/>
+      </w:pPr>
+      <w:r>
+        <w:t>What transfer type should be used for FUJITSU to FUJ CT main-stock balancing: Cross, Cross To, or another value?</w:t>
+      </w:r>
+    </w:p>
+    <w:p>
+      <w:pPr>
+        <w:pStyle w:val="ListBullet"/>
+      </w:pPr>
+      <w:r>
+        <w:t>Are holidays global, warehouse-specific, part-specific, or all three?</w:t>
+      </w:r>
+    </w:p>
+    <w:p>
+      <w:pPr>
+        <w:pStyle w:val="ListBullet"/>
+      </w:pPr>
+      <w:r>
+        <w:t>Are shipping bundles intended to drive recommendations, or only to inform users that parts are often shipped together?</w:t>
+      </w:r>
+    </w:p>
+    <w:p>
+      <w:pPr>
+        <w:pStyle w:val="Heading3"/>
+      </w:pPr>
+      <w:r>
+        <w:t>MVP Decision</w:t>
+      </w:r>
+    </w:p>
+    <w:p>
+      <w:r>
+        <w:t>For CoCre8 MVP, Distribution Transfer is acceptable if it can suggest valid inter-warehouse moves for main stock using stock, mins, SPL Master alternatives, and exclusion rules. Distribution Exclusions must mirror or clearly explain the uploaded exclusion rules. Shipping Bundle should be considered incomplete if it cannot represent multiple different component parts in one bundle.</w:t>
       </w:r>
     </w:p>
     <w:p/>
@@ -6114,7 +7592,6 @@
     <w:next w:val="Normal"/>
     <w:link w:val="Heading4Char"/>
     <w:uiPriority w:val="9"/>
-    <w:semiHidden/>
     <w:unhideWhenUsed/>
     <w:qFormat/>
     <w:rsid w:val="00FC693F"/>
@@ -6735,7 +8212,6 @@
     <w:basedOn w:val="DefaultParagraphFont"/>
     <w:link w:val="Heading4"/>
     <w:uiPriority w:val="9"/>
-    <w:semiHidden/>
     <w:rsid w:val="00FC693F"/>
     <w:rPr>
       <w:rFonts w:asciiTheme="majorHAnsi" w:eastAsiaTheme="majorEastAsia" w:hAnsiTheme="majorHAnsi" w:cstheme="majorBidi"/>

</xml_diff>

<commit_message>
Mark acceptance criteria status
</commit_message>
<xml_diff>
--- a/Acceptance Criteria and Unit Tests - updated.docx
+++ b/Acceptance Criteria and Unit Tests - updated.docx
@@ -8,6 +8,95 @@
       </w:pPr>
       <w:r>
         <w:t>Planning V2 Acceptance Criteria and Test Cases</w:t>
+      </w:r>
+    </w:p>
+    <w:p>
+      <w:pPr/>
+      <w:r>
+        <w:rPr>
+          <w:b/>
+        </w:rPr>
+        <w:t>Status as of 22 June 2026, based only on supplied screenshots and user observations. Unverified items are not assumed to work.</w:t>
+      </w:r>
+    </w:p>
+    <w:tbl>
+      <w:tblPr>
+        <w:tblStyle w:val="TableGrid"/>
+        <w:tblW w:type="auto" w:w="0"/>
+        <w:tblLook w:firstColumn="1" w:firstRow="1" w:lastColumn="0" w:lastRow="0" w:noHBand="0" w:noVBand="1" w:val="04A0"/>
+      </w:tblPr>
+      <w:tblGrid>
+        <w:gridCol w:w="2160"/>
+        <w:gridCol w:w="2160"/>
+        <w:gridCol w:w="2160"/>
+        <w:gridCol w:w="2160"/>
+      </w:tblGrid>
+      <w:tr>
+        <w:tc>
+          <w:tcPr>
+            <w:tcW w:type="dxa" w:w="2160"/>
+            <w:shd w:fill="C6EFCE"/>
+          </w:tcPr>
+          <w:p>
+            <w:r>
+              <w:rPr>
+                <w:b/>
+                <w:color w:val="006100"/>
+              </w:rPr>
+              <w:t>MET</w:t>
+            </w:r>
+          </w:p>
+        </w:tc>
+        <w:tc>
+          <w:tcPr>
+            <w:tcW w:type="dxa" w:w="2160"/>
+            <w:shd w:fill="FFEB9C"/>
+          </w:tcPr>
+          <w:p>
+            <w:r>
+              <w:rPr>
+                <w:b/>
+                <w:color w:val="9C6500"/>
+              </w:rPr>
+              <w:t>PARTIAL</w:t>
+            </w:r>
+          </w:p>
+        </w:tc>
+        <w:tc>
+          <w:tcPr>
+            <w:tcW w:type="dxa" w:w="2160"/>
+            <w:shd w:fill="F4CCCC"/>
+          </w:tcPr>
+          <w:p>
+            <w:r>
+              <w:rPr>
+                <w:b/>
+                <w:color w:val="9C0006"/>
+              </w:rPr>
+              <w:t>NOT MET</w:t>
+            </w:r>
+          </w:p>
+        </w:tc>
+        <w:tc>
+          <w:tcPr>
+            <w:tcW w:type="dxa" w:w="2160"/>
+            <w:shd w:fill="D9E1F2"/>
+          </w:tcPr>
+          <w:p>
+            <w:r>
+              <w:rPr>
+                <w:b/>
+                <w:color w:val="44546A"/>
+              </w:rPr>
+              <w:t>NOT VERIFIED</w:t>
+            </w:r>
+          </w:p>
+        </w:tc>
+      </w:tr>
+    </w:tbl>
+    <w:p>
+      <w:r>
+        <w:t>Summary: MET 3, PARTIAL 7, NOT MET 12, NOT VERIFIED 19</w:t>
       </w:r>
     </w:p>
     <w:p>
@@ -34,7 +123,15 @@
     <w:p>
       <w:pPr>
         <w:pStyle w:val="ListBullet"/>
+        <w:shd w:fill="F4CCCC"/>
       </w:pPr>
+      <w:r>
+        <w:rPr>
+          <w:b/>
+          <w:color w:val="9C0006"/>
+        </w:rPr>
+        <w:t xml:space="preserve">[NOT MET] </w:t>
+      </w:r>
       <w:r>
         <w:t>Location Based Forecast shows usage and expected quantity by location group, not only by individual warehouse.</w:t>
       </w:r>
@@ -42,7 +139,15 @@
     <w:p>
       <w:pPr>
         <w:pStyle w:val="ListBullet"/>
+        <w:shd w:fill="FFEB9C"/>
       </w:pPr>
+      <w:r>
+        <w:rPr>
+          <w:b/>
+          <w:color w:val="9C6500"/>
+        </w:rPr>
+        <w:t xml:space="preserve">[PARTIAL] </w:t>
+      </w:r>
       <w:r>
         <w:t>Inventory View by Location groups warehouses into the correct stock pools and does not mix dedicated customer stock with main stock.</w:t>
       </w:r>
@@ -50,7 +155,15 @@
     <w:p>
       <w:pPr>
         <w:pStyle w:val="ListBullet"/>
+        <w:shd w:fill="F4CCCC"/>
       </w:pPr>
+      <w:r>
+        <w:rPr>
+          <w:b/>
+          <w:color w:val="9C0006"/>
+        </w:rPr>
+        <w:t xml:space="preserve">[NOT MET] </w:t>
+      </w:r>
       <w:r>
         <w:t>SKU Based Forecast uses uploaded usage/forecast data and reconciles to Forecasting Home for the selected SKU/SPL Master.</w:t>
       </w:r>
@@ -58,7 +171,15 @@
     <w:p>
       <w:pPr>
         <w:pStyle w:val="ListBullet"/>
+        <w:shd w:fill="FFEB9C"/>
       </w:pPr>
+      <w:r>
+        <w:rPr>
+          <w:b/>
+          <w:color w:val="9C6500"/>
+        </w:rPr>
+        <w:t xml:space="preserve">[PARTIAL] </w:t>
+      </w:r>
       <w:r>
         <w:t>Sections not used by CoCre8 are hidden or clearly empty without affecting the rest of the dashboard.</w:t>
       </w:r>
@@ -237,7 +358,15 @@
     <w:p>
       <w:pPr>
         <w:pStyle w:val="ListBullet"/>
+        <w:shd w:fill="FFEB9C"/>
       </w:pPr>
+      <w:r>
+        <w:rPr>
+          <w:b/>
+          <w:color w:val="9C6500"/>
+        </w:rPr>
+        <w:t xml:space="preserve">[PARTIAL] </w:t>
+      </w:r>
       <w:r>
         <w:t>Forecast rows are keyed by SPL Master, location group, customer stock group, and forecast month.</w:t>
       </w:r>
@@ -245,7 +374,15 @@
     <w:p>
       <w:pPr>
         <w:pStyle w:val="ListBullet"/>
+        <w:shd w:fill="D9E1F2"/>
       </w:pPr>
+      <w:r>
+        <w:rPr>
+          <w:b/>
+          <w:color w:val="44546A"/>
+        </w:rPr>
+        <w:t xml:space="preserve">[NOT VERIFIED] </w:t>
+      </w:r>
       <w:r>
         <w:t>Expected daily usage and expected quantity are calculated from all alternatives under the SPL Master.</w:t>
       </w:r>
@@ -253,7 +390,15 @@
     <w:p>
       <w:pPr>
         <w:pStyle w:val="ListBullet"/>
+        <w:shd w:fill="FFEB9C"/>
       </w:pPr>
+      <w:r>
+        <w:rPr>
+          <w:b/>
+          <w:color w:val="9C6500"/>
+        </w:rPr>
+        <w:t xml:space="preserve">[PARTIAL] </w:t>
+      </w:r>
       <w:r>
         <w:t>Primary part may be displayed, but it must not drive calculations by itself.</w:t>
       </w:r>
@@ -261,7 +406,15 @@
     <w:p>
       <w:pPr>
         <w:pStyle w:val="ListBullet"/>
+        <w:shd w:fill="FFEB9C"/>
       </w:pPr>
+      <w:r>
+        <w:rPr>
+          <w:b/>
+          <w:color w:val="9C6500"/>
+        </w:rPr>
+        <w:t xml:space="preserve">[PARTIAL] </w:t>
+      </w:r>
       <w:r>
         <w:t>SPL Min Qty, Manual Min, and Manual Max are displayed separately and use the same values across Forecasting Home and Manual Min-Max.</w:t>
       </w:r>
@@ -269,7 +422,15 @@
     <w:p>
       <w:pPr>
         <w:pStyle w:val="ListBullet"/>
+        <w:shd w:fill="FFEB9C"/>
       </w:pPr>
+      <w:r>
+        <w:rPr>
+          <w:b/>
+          <w:color w:val="9C6500"/>
+        </w:rPr>
+        <w:t xml:space="preserve">[PARTIAL] </w:t>
+      </w:r>
       <w:r>
         <w:t>Manual min/max changes persist and appear in Forecasting Home after refresh/regeneration.</w:t>
       </w:r>
@@ -277,7 +438,15 @@
     <w:p>
       <w:pPr>
         <w:pStyle w:val="ListBullet"/>
+        <w:shd w:fill="FFEB9C"/>
       </w:pPr>
+      <w:r>
+        <w:rPr>
+          <w:b/>
+          <w:color w:val="9C6500"/>
+        </w:rPr>
+        <w:t xml:space="preserve">[PARTIAL] </w:t>
+      </w:r>
       <w:r>
         <w:t>Audit records old value, new value, user, timestamp, SPL Master, and warehouse/location.</w:t>
       </w:r>
@@ -488,7 +657,15 @@
     <w:p>
       <w:pPr>
         <w:pStyle w:val="ListBullet"/>
+        <w:shd w:fill="D9E1F2"/>
       </w:pPr>
+      <w:r>
+        <w:rPr>
+          <w:b/>
+          <w:color w:val="44546A"/>
+        </w:rPr>
+        <w:t xml:space="preserve">[NOT VERIFIED] </w:t>
+      </w:r>
       <w:r>
         <w:t>Rows appear when available stock is below the required level for the selected date.</w:t>
       </w:r>
@@ -496,7 +673,15 @@
     <w:p>
       <w:pPr>
         <w:pStyle w:val="ListBullet"/>
+        <w:shd w:fill="D9E1F2"/>
       </w:pPr>
+      <w:r>
+        <w:rPr>
+          <w:b/>
+          <w:color w:val="44546A"/>
+        </w:rPr>
+        <w:t xml:space="preserve">[NOT VERIFIED] </w:t>
+      </w:r>
       <w:r>
         <w:t>Available stock is stock on hand plus inbound minus allocated.</w:t>
       </w:r>
@@ -504,7 +689,15 @@
     <w:p>
       <w:pPr>
         <w:pStyle w:val="ListBullet"/>
+        <w:shd w:fill="D9E1F2"/>
       </w:pPr>
+      <w:r>
+        <w:rPr>
+          <w:b/>
+          <w:color w:val="44546A"/>
+        </w:rPr>
+        <w:t xml:space="preserve">[NOT VERIFIED] </w:t>
+      </w:r>
       <w:r>
         <w:t>The page uses the same SPL Master and location grouping as Forecasting Home.</w:t>
       </w:r>
@@ -512,7 +705,15 @@
     <w:p>
       <w:pPr>
         <w:pStyle w:val="ListBullet"/>
+        <w:shd w:fill="D9E1F2"/>
       </w:pPr>
+      <w:r>
+        <w:rPr>
+          <w:b/>
+          <w:color w:val="44546A"/>
+        </w:rPr>
+        <w:t xml:space="preserve">[NOT VERIFIED] </w:t>
+      </w:r>
       <w:r>
         <w:t>If no rows are shown, the result is backed by the same risk calculation rather than an empty query failure.</w:t>
       </w:r>
@@ -520,7 +721,15 @@
     <w:p>
       <w:pPr>
         <w:pStyle w:val="ListBullet"/>
+        <w:shd w:fill="D9E1F2"/>
       </w:pPr>
+      <w:r>
+        <w:rPr>
+          <w:b/>
+          <w:color w:val="44546A"/>
+        </w:rPr>
+        <w:t xml:space="preserve">[NOT VERIFIED] </w:t>
+      </w:r>
       <w:r>
         <w:t>Outbound can be blank or zero for MVP because CoCre8 does not have a confirmed outbound-stock source.</w:t>
       </w:r>
@@ -699,7 +908,15 @@
     <w:p>
       <w:pPr>
         <w:pStyle w:val="ListBullet"/>
+        <w:shd w:fill="F4CCCC"/>
       </w:pPr>
+      <w:r>
+        <w:rPr>
+          <w:b/>
+          <w:color w:val="9C0006"/>
+        </w:rPr>
+        <w:t xml:space="preserve">[NOT MET] </w:t>
+      </w:r>
       <w:r>
         <w:t>Answers use Parts, PartsUsage, WarehouseStockOnHand, Warehouses, WarehouseExclusions, PurchaseOrders, and forecast output where relevant.</w:t>
       </w:r>
@@ -707,7 +924,15 @@
     <w:p>
       <w:pPr>
         <w:pStyle w:val="ListBullet"/>
+        <w:shd w:fill="D9E1F2"/>
       </w:pPr>
+      <w:r>
+        <w:rPr>
+          <w:b/>
+          <w:color w:val="44546A"/>
+        </w:rPr>
+        <w:t xml:space="preserve">[NOT VERIFIED] </w:t>
+      </w:r>
       <w:r>
         <w:t>SPL Master questions group valid alternatives and still show actual part numbers as evidence.</w:t>
       </w:r>
@@ -715,7 +940,15 @@
     <w:p>
       <w:pPr>
         <w:pStyle w:val="ListBullet"/>
+        <w:shd w:fill="F4CCCC"/>
       </w:pPr>
+      <w:r>
+        <w:rPr>
+          <w:b/>
+          <w:color w:val="9C0006"/>
+        </w:rPr>
+        <w:t xml:space="preserve">[NOT MET] </w:t>
+      </w:r>
       <w:r>
         <w:t>Category questions, such as hard drives, use part metadata plus descriptions.</w:t>
       </w:r>
@@ -723,7 +956,15 @@
     <w:p>
       <w:pPr>
         <w:pStyle w:val="ListBullet"/>
+        <w:shd w:fill="F4CCCC"/>
       </w:pPr>
+      <w:r>
+        <w:rPr>
+          <w:b/>
+          <w:color w:val="9C0006"/>
+        </w:rPr>
+        <w:t xml:space="preserve">[NOT MET] </w:t>
+      </w:r>
       <w:r>
         <w:t>If a question cannot be answered, the missing field or dataset is named specifically.</w:t>
       </w:r>
@@ -731,7 +972,15 @@
     <w:p>
       <w:pPr>
         <w:pStyle w:val="ListBullet"/>
+        <w:shd w:fill="D9E1F2"/>
       </w:pPr>
+      <w:r>
+        <w:rPr>
+          <w:b/>
+          <w:color w:val="44546A"/>
+        </w:rPr>
+        <w:t xml:space="preserve">[NOT VERIFIED] </w:t>
+      </w:r>
       <w:r>
         <w:t>Recommendations separate facts from assumptions.</w:t>
       </w:r>
@@ -910,7 +1159,15 @@
     <w:p>
       <w:pPr>
         <w:pStyle w:val="ListBullet"/>
+        <w:shd w:fill="F4CCCC"/>
       </w:pPr>
+      <w:r>
+        <w:rPr>
+          <w:b/>
+          <w:color w:val="9C0006"/>
+        </w:rPr>
+        <w:t xml:space="preserve">[NOT MET] </w:t>
+      </w:r>
       <w:r>
         <w:t>Suggested rows appear when a part/SPL Master has a shortage against manual min, calculated min, or forecast demand.</w:t>
       </w:r>
@@ -918,7 +1175,15 @@
     <w:p>
       <w:pPr>
         <w:pStyle w:val="ListBullet"/>
+        <w:shd w:fill="D9E1F2"/>
       </w:pPr>
+      <w:r>
+        <w:rPr>
+          <w:b/>
+          <w:color w:val="44546A"/>
+        </w:rPr>
+        <w:t xml:space="preserve">[NOT VERIFIED] </w:t>
+      </w:r>
       <w:r>
         <w:t>Available stock is stock on hand plus inbound minus allocated.</w:t>
       </w:r>
@@ -926,7 +1191,15 @@
     <w:p>
       <w:pPr>
         <w:pStyle w:val="ListBullet"/>
+        <w:shd w:fill="D9E1F2"/>
       </w:pPr>
+      <w:r>
+        <w:rPr>
+          <w:b/>
+          <w:color w:val="44546A"/>
+        </w:rPr>
+        <w:t xml:space="preserve">[NOT VERIFIED] </w:t>
+      </w:r>
       <w:r>
         <w:t>Suggested Quantity, order date, delivery date, last cost, and total cost are traceable to uploaded fields or documented rules.</w:t>
       </w:r>
@@ -934,7 +1207,15 @@
     <w:p>
       <w:pPr>
         <w:pStyle w:val="ListBullet"/>
+        <w:shd w:fill="D9E1F2"/>
       </w:pPr>
+      <w:r>
+        <w:rPr>
+          <w:b/>
+          <w:color w:val="44546A"/>
+        </w:rPr>
+        <w:t xml:space="preserve">[NOT VERIFIED] </w:t>
+      </w:r>
       <w:r>
         <w:t>Create Purchase Orders can generate a structured CoCre8 PO request/email for MVP.</w:t>
       </w:r>
@@ -942,9 +1223,17 @@
     <w:p>
       <w:pPr>
         <w:pStyle w:val="ListBullet"/>
+        <w:shd w:fill="F4CCCC"/>
       </w:pPr>
       <w:r>
-        <w:t>Generated PO must be tenant-isolated and must not show another client?s records.</w:t>
+        <w:rPr>
+          <w:b/>
+          <w:color w:val="9C0006"/>
+        </w:rPr>
+        <w:t xml:space="preserve">[NOT MET] </w:t>
+      </w:r>
+      <w:r>
+        <w:t>Generated PO must be tenant-isolated and must not show another client's records.</w:t>
       </w:r>
     </w:p>
     <w:p>
@@ -1153,7 +1442,15 @@
     <w:p>
       <w:pPr>
         <w:pStyle w:val="ListBullet"/>
+        <w:shd w:fill="C6EFCE"/>
       </w:pPr>
+      <w:r>
+        <w:rPr>
+          <w:b/>
+          <w:color w:val="006100"/>
+        </w:rPr>
+        <w:t xml:space="preserve">[MET] </w:t>
+      </w:r>
       <w:r>
         <w:t>Top-level rows use SPL Master where available; parts without a master may appear as their own group.</w:t>
       </w:r>
@@ -1161,7 +1458,15 @@
     <w:p>
       <w:pPr>
         <w:pStyle w:val="ListBullet"/>
+        <w:shd w:fill="C6EFCE"/>
       </w:pPr>
+      <w:r>
+        <w:rPr>
+          <w:b/>
+          <w:color w:val="006100"/>
+        </w:rPr>
+        <w:t xml:space="preserve">[MET] </w:t>
+      </w:r>
       <w:r>
         <w:t>Primary part and description come from Parts.csv.</w:t>
       </w:r>
@@ -1169,7 +1474,15 @@
     <w:p>
       <w:pPr>
         <w:pStyle w:val="ListBullet"/>
+        <w:shd w:fill="F4CCCC"/>
       </w:pPr>
+      <w:r>
+        <w:rPr>
+          <w:b/>
+          <w:color w:val="9C0006"/>
+        </w:rPr>
+        <w:t xml:space="preserve">[NOT MET] </w:t>
+      </w:r>
       <w:r>
         <w:t>Parent stock totals equal the sum of visible child warehouse/part rows.</w:t>
       </w:r>
@@ -1177,7 +1490,15 @@
     <w:p>
       <w:pPr>
         <w:pStyle w:val="ListBullet"/>
+        <w:shd w:fill="F4CCCC"/>
       </w:pPr>
+      <w:r>
+        <w:rPr>
+          <w:b/>
+          <w:color w:val="9C0006"/>
+        </w:rPr>
+        <w:t xml:space="preserve">[NOT MET] </w:t>
+      </w:r>
       <w:r>
         <w:t>Stock values use WarehouseStockOnHand.quantityOnHand only, not usage, inbound, allocated, cost, uniqueId, or row counts.</w:t>
       </w:r>
@@ -1185,7 +1506,15 @@
     <w:p>
       <w:pPr>
         <w:pStyle w:val="ListBullet"/>
+        <w:shd w:fill="D9E1F2"/>
       </w:pPr>
+      <w:r>
+        <w:rPr>
+          <w:b/>
+          <w:color w:val="44546A"/>
+        </w:rPr>
+        <w:t xml:space="preserve">[NOT VERIFIED] </w:t>
+      </w:r>
       <w:r>
         <w:t>Search works by SPL Master, primary part, actual part number, and description.</w:t>
       </w:r>
@@ -1364,7 +1693,15 @@
     <w:p>
       <w:pPr>
         <w:pStyle w:val="ListBullet"/>
+        <w:shd w:fill="C6EFCE"/>
       </w:pPr>
+      <w:r>
+        <w:rPr>
+          <w:b/>
+          <w:color w:val="006100"/>
+        </w:rPr>
+        <w:t xml:space="preserve">[MET] </w:t>
+      </w:r>
       <w:r>
         <w:t>Create New opens a modal for full name, email, phone, and module permissions.</w:t>
       </w:r>
@@ -1372,7 +1709,15 @@
     <w:p>
       <w:pPr>
         <w:pStyle w:val="ListBullet"/>
+        <w:shd w:fill="D9E1F2"/>
       </w:pPr>
+      <w:r>
+        <w:rPr>
+          <w:b/>
+          <w:color w:val="44546A"/>
+        </w:rPr>
+        <w:t xml:space="preserve">[NOT VERIFIED] </w:t>
+      </w:r>
       <w:r>
         <w:t>Full name and valid email are required.</w:t>
       </w:r>
@@ -1380,7 +1725,15 @@
     <w:p>
       <w:pPr>
         <w:pStyle w:val="ListBullet"/>
+        <w:shd w:fill="D9E1F2"/>
       </w:pPr>
+      <w:r>
+        <w:rPr>
+          <w:b/>
+          <w:color w:val="44546A"/>
+        </w:rPr>
+        <w:t xml:space="preserve">[NOT VERIFIED] </w:t>
+      </w:r>
       <w:r>
         <w:t>Saving creates the user, persists permissions, and shows the user in the table.</w:t>
       </w:r>
@@ -1388,7 +1741,15 @@
     <w:p>
       <w:pPr>
         <w:pStyle w:val="ListBullet"/>
+        <w:shd w:fill="D9E1F2"/>
       </w:pPr>
+      <w:r>
+        <w:rPr>
+          <w:b/>
+          <w:color w:val="44546A"/>
+        </w:rPr>
+        <w:t xml:space="preserve">[NOT VERIFIED] </w:t>
+      </w:r>
       <w:r>
         <w:t>A created user can log in and only access enabled modules.</w:t>
       </w:r>
@@ -1396,7 +1757,15 @@
     <w:p>
       <w:pPr>
         <w:pStyle w:val="ListBullet"/>
+        <w:shd w:fill="D9E1F2"/>
       </w:pPr>
+      <w:r>
+        <w:rPr>
+          <w:b/>
+          <w:color w:val="44546A"/>
+        </w:rPr>
+        <w:t xml:space="preserve">[NOT VERIFIED] </w:t>
+      </w:r>
       <w:r>
         <w:t>Disabled modules are blocked from both navigation and direct URL access.</w:t>
       </w:r>
@@ -1575,7 +1944,15 @@
     <w:p>
       <w:pPr>
         <w:pStyle w:val="ListBullet"/>
+        <w:shd w:fill="F4CCCC"/>
       </w:pPr>
+      <w:r>
+        <w:rPr>
+          <w:b/>
+          <w:color w:val="9C0006"/>
+        </w:rPr>
+        <w:t xml:space="preserve">[NOT MET] </w:t>
+      </w:r>
       <w:r>
         <w:t>Distribution Role provides or links to the user/role setup needed to approve or manage transfers.</w:t>
       </w:r>
@@ -1583,7 +1960,15 @@
     <w:p>
       <w:pPr>
         <w:pStyle w:val="ListBullet"/>
+        <w:shd w:fill="D9E1F2"/>
       </w:pPr>
+      <w:r>
+        <w:rPr>
+          <w:b/>
+          <w:color w:val="44546A"/>
+        </w:rPr>
+        <w:t xml:space="preserve">[NOT VERIFIED] </w:t>
+      </w:r>
       <w:r>
         <w:t>Distribution Transfer suggests moves when one allowed location has shortage and another has excess for the same SPL Master or valid alternate.</w:t>
       </w:r>
@@ -1591,7 +1976,15 @@
     <w:p>
       <w:pPr>
         <w:pStyle w:val="ListBullet"/>
+        <w:shd w:fill="D9E1F2"/>
       </w:pPr>
+      <w:r>
+        <w:rPr>
+          <w:b/>
+          <w:color w:val="44546A"/>
+        </w:rPr>
+        <w:t xml:space="preserve">[NOT VERIFIED] </w:t>
+      </w:r>
       <w:r>
         <w:t>Transfer recommendations respect WarehouseExclusions.csv and dedicated-stock rules.</w:t>
       </w:r>
@@ -1599,7 +1992,15 @@
     <w:p>
       <w:pPr>
         <w:pStyle w:val="ListBullet"/>
+        <w:shd w:fill="F4CCCC"/>
       </w:pPr>
+      <w:r>
+        <w:rPr>
+          <w:b/>
+          <w:color w:val="9C0006"/>
+        </w:rPr>
+        <w:t xml:space="preserve">[NOT MET] </w:t>
+      </w:r>
       <w:r>
         <w:t>Distribution Exclusions mirrors the ingested exclusion/location-type rules or clearly states the rule source.</w:t>
       </w:r>
@@ -1607,7 +2008,15 @@
     <w:p>
       <w:pPr>
         <w:pStyle w:val="ListBullet"/>
+        <w:shd w:fill="D9E1F2"/>
       </w:pPr>
+      <w:r>
+        <w:rPr>
+          <w:b/>
+          <w:color w:val="44546A"/>
+        </w:rPr>
+        <w:t xml:space="preserve">[NOT VERIFIED] </w:t>
+      </w:r>
       <w:r>
         <w:t>Holidays can be created, persisted, and used by distribution scheduling if the engine supports date planning.</w:t>
       </w:r>
@@ -1615,7 +2024,15 @@
     <w:p>
       <w:pPr>
         <w:pStyle w:val="ListBullet"/>
+        <w:shd w:fill="F4CCCC"/>
       </w:pPr>
+      <w:r>
+        <w:rPr>
+          <w:b/>
+          <w:color w:val="9C0006"/>
+        </w:rPr>
+        <w:t xml:space="preserve">[NOT MET] </w:t>
+      </w:r>
       <w:r>
         <w:t>Shipping Bundle supports multiple related component parts in one bundle; a single part plus quantity is not enough for the intended use case.</w:t>
       </w:r>

</xml_diff>